<commit_message>
Update document generation script to improve formatting and fix errors
Refactor docx generation script, improving code structure, updating color palettes, and correcting bracket closure issues in table generation functions.

Replit-Commit-Author: Agent
Replit-Commit-Session-Id: 85ca0e57-022c-4e07-8505-5330d2441dfb
Replit-Commit-Checkpoint-Type: full_checkpoint
Replit-Commit-Event-Id: fc4676a7-0ae3-453e-92d9-81dbdc2dc548
Replit-Commit-Screenshot-Url: https://storage.googleapis.com/screenshot-production-us-central1/c5ecfbc0-55f8-4296-b6fe-cd54067a2b61/85ca0e57-022c-4e07-8505-5330d2441dfb/B44Qx0O
Replit-Helium-Checkpoint-Created: true
</commit_message>
<xml_diff>
--- a/IBM_Horizon_AI_Transformation_Proposal_Apr2026.docx
+++ b/IBM_Horizon_AI_Transformation_Proposal_Apr2026.docx
@@ -28,10 +28,10 @@
       <w:tblPr>
         <w:tblW w:type="dxa" w:w="9072"/>
         <w:tblBorders>
-          <w:top w:val="none"/>
-          <w:left w:val="none"/>
-          <w:bottom w:val="none"/>
-          <w:right w:val="none"/>
+          <w:top w:val="single" w:color="FFFFFF" w:sz="0"/>
+          <w:left w:val="single" w:color="FFFFFF" w:sz="0"/>
+          <w:bottom w:val="single" w:color="FFFFFF" w:sz="0"/>
+          <w:right w:val="single" w:color="FFFFFF" w:sz="0"/>
           <w:insideH w:val="single" w:color="auto" w:sz="4"/>
           <w:insideV w:val="single" w:color="auto" w:sz="4"/>
         </w:tblBorders>
@@ -45,16 +45,16 @@
           <w:tcPr>
             <w:tcW w:type="dxa" w:w="9072"/>
             <w:tcBorders>
-              <w:top w:val="none"/>
-              <w:left w:val="none"/>
-              <w:bottom w:val="none"/>
-              <w:right w:val="none"/>
+              <w:top w:val="single" w:color="FFFFFF" w:sz="0"/>
+              <w:left w:val="single" w:color="FFFFFF" w:sz="0"/>
+              <w:bottom w:val="single" w:color="FFFFFF" w:sz="0"/>
+              <w:right w:val="single" w:color="FFFFFF" w:sz="0"/>
             </w:tcBorders>
             <w:shd w:fill="0F62FE" w:val="clear"/>
           </w:tcPr>
           <w:p>
             <w:pPr>
-              <w:spacing w:after="40"/>
+              <w:spacing w:after="0"/>
             </w:pPr>
             <w:r>
               <w:rPr>
@@ -114,15 +114,15 @@
     </w:p>
     <w:p>
       <w:pPr>
-        <w:spacing w:after="400"/>
+        <w:spacing w:after="360"/>
         <w:jc w:val="left"/>
       </w:pPr>
       <w:r>
         <w:rPr>
           <w:rFonts w:ascii="Calibri" w:cs="Calibri" w:eastAsia="Calibri" w:hAnsi="Calibri"/>
           <w:color w:val="6F6F6F"/>
-          <w:sz w:val="40"/>
-          <w:szCs w:val="40"/>
+          <w:sz w:val="38"/>
+          <w:szCs w:val="38"/>
         </w:rPr>
         <w:t xml:space="preserve">Into a Predictive, Self-Healing, AI-Driven Enterprise</w:t>
       </w:r>
@@ -130,19 +130,30 @@
     <w:p>
       <w:pPr>
         <w:pBdr>
-          <w:bottom w:val="single" w:color="0F62FE" w:sz="12" w:space="4"/>
+          <w:bottom w:val="single" w:color="0F62FE" w:sz="6" w:space="4"/>
         </w:pBdr>
-        <w:spacing w:after="320"/>
+        <w:spacing w:after="100" w:before="100"/>
       </w:pPr>
+    </w:p>
+    <w:p>
+      <w:pPr>
+        <w:spacing w:after="40"/>
+      </w:pPr>
+      <w:r>
+        <w:rPr>
+          <w:rFonts w:ascii="Calibri" w:cs="Calibri" w:eastAsia="Calibri" w:hAnsi="Calibri"/>
+        </w:rPr>
+        <w:t xml:space="preserve"/>
+      </w:r>
     </w:p>
     <w:tbl>
       <w:tblPr>
         <w:tblW w:type="dxa" w:w="9072"/>
         <w:tblBorders>
-          <w:top w:val="none"/>
-          <w:left w:val="none"/>
-          <w:bottom w:val="none"/>
-          <w:right w:val="none"/>
+          <w:top w:val="single" w:color="FFFFFF" w:sz="0"/>
+          <w:left w:val="single" w:color="FFFFFF" w:sz="0"/>
+          <w:bottom w:val="single" w:color="FFFFFF" w:sz="0"/>
+          <w:right w:val="single" w:color="FFFFFF" w:sz="0"/>
           <w:insideH w:val="single" w:color="auto" w:sz="4"/>
           <w:insideV w:val="single" w:color="auto" w:sz="4"/>
         </w:tblBorders>
@@ -157,13 +168,13 @@
           <w:tcPr>
             <w:tcW w:type="dxa" w:w="4320"/>
             <w:tcBorders>
-              <w:top w:val="none"/>
-              <w:left w:val="none"/>
-              <w:bottom w:val="none"/>
-              <w:right w:val="none"/>
+              <w:top w:val="single" w:color="FFFFFF" w:sz="0"/>
+              <w:left w:val="single" w:color="FFFFFF" w:sz="0"/>
+              <w:bottom w:val="single" w:color="FFFFFF" w:sz="0"/>
+              <w:right w:val="single" w:color="FFFFFF" w:sz="0"/>
             </w:tcBorders>
             <w:tcMar>
-              <w:right w:type="dxa" w:w="200"/>
+              <w:right w:type="dxa" w:w="220"/>
             </w:tcMar>
           </w:tcPr>
           <w:p>
@@ -200,7 +211,7 @@
           </w:p>
           <w:p>
             <w:pPr>
-              <w:spacing w:after="160"/>
+              <w:spacing w:after="200"/>
             </w:pPr>
             <w:r>
               <w:rPr>
@@ -238,8 +249,8 @@
                 <w:b/>
                 <w:bCs/>
                 <w:color w:val="001141"/>
-                <w:sz w:val="26"/>
-                <w:szCs w:val="26"/>
+                <w:sz w:val="24"/>
+                <w:szCs w:val="24"/>
               </w:rPr>
               <w:t xml:space="preserve">Horizon Blue Cross Blue Shield of New Jersey</w:t>
             </w:r>
@@ -263,13 +274,13 @@
           <w:tcPr>
             <w:tcW w:type="dxa" w:w="4320"/>
             <w:tcBorders>
-              <w:top w:val="none"/>
-              <w:left w:val="none"/>
-              <w:bottom w:val="none"/>
-              <w:right w:val="none"/>
+              <w:top w:val="single" w:color="FFFFFF" w:sz="0"/>
+              <w:left w:val="single" w:color="FFFFFF" w:sz="0"/>
+              <w:bottom w:val="single" w:color="FFFFFF" w:sz="0"/>
+              <w:right w:val="single" w:color="FFFFFF" w:sz="0"/>
             </w:tcBorders>
             <w:tcMar>
-              <w:left w:type="dxa" w:w="200"/>
+              <w:left w:type="dxa" w:w="220"/>
             </w:tcMar>
           </w:tcPr>
           <w:p>
@@ -297,9 +308,9 @@
                 <w:rFonts w:ascii="Calibri" w:cs="Calibri" w:eastAsia="Calibri" w:hAnsi="Calibri"/>
                 <w:b/>
                 <w:bCs/>
-                <w:color w:val="da1e28"/>
-                <w:sz w:val="24"/>
-                <w:szCs w:val="24"/>
+                <w:color w:val="DA1E28"/>
+                <w:sz w:val="26"/>
+                <w:szCs w:val="26"/>
               </w:rPr>
               <w:t xml:space="preserve">CONFIDENTIAL</w:t>
             </w:r>
@@ -367,6 +378,17 @@
         </w:tc>
       </w:tr>
     </w:tbl>
+    <w:p>
+      <w:pPr>
+        <w:spacing w:after="40"/>
+      </w:pPr>
+      <w:r>
+        <w:rPr>
+          <w:rFonts w:ascii="Calibri" w:cs="Calibri" w:eastAsia="Calibri" w:hAnsi="Calibri"/>
+        </w:rPr>
+        <w:t xml:space="preserve"/>
+      </w:r>
+    </w:p>
     <w:p>
       <w:pPr>
         <w:spacing w:after="40"/>
@@ -424,9 +446,9 @@
     <w:p>
       <w:pPr>
         <w:pBdr>
-          <w:bottom w:val="single" w:color="0F62FE" w:sz="8" w:space="6"/>
+          <w:bottom w:val="single" w:color="0F62FE" w:sz="4" w:space="4"/>
         </w:pBdr>
-        <w:spacing w:after="80" w:before="300"/>
+        <w:spacing w:after="80" w:before="240"/>
       </w:pPr>
       <w:r>
         <w:rPr>
@@ -460,10 +482,10 @@
       <w:tblPr>
         <w:tblW w:type="dxa" w:w="9072"/>
         <w:tblBorders>
-          <w:top w:val="none"/>
-          <w:left w:val="none"/>
-          <w:bottom w:val="none"/>
-          <w:right w:val="none"/>
+          <w:top w:val="single" w:color="FFFFFF" w:sz="0"/>
+          <w:left w:val="single" w:color="FFFFFF" w:sz="0"/>
+          <w:bottom w:val="single" w:color="FFFFFF" w:sz="0"/>
+          <w:right w:val="single" w:color="FFFFFF" w:sz="0"/>
           <w:insideH w:val="single" w:color="auto" w:sz="4"/>
           <w:insideV w:val="single" w:color="auto" w:sz="4"/>
         </w:tblBorders>
@@ -476,10 +498,10 @@
         <w:tc>
           <w:tcPr>
             <w:tcBorders>
-              <w:top w:val="none"/>
-              <w:left w:val="single" w:color="0F62FE" w:sz="24" w:space="4"/>
-              <w:bottom w:val="none"/>
-              <w:right w:val="none"/>
+              <w:top w:val="single" w:color="FFFFFF" w:sz="0"/>
+              <w:left w:val="single" w:color="0F62FE" w:sz="28"/>
+              <w:bottom w:val="single" w:color="FFFFFF" w:sz="0"/>
+              <w:right w:val="single" w:color="FFFFFF" w:sz="0"/>
             </w:tcBorders>
             <w:shd w:fill="D0E2FF" w:val="clear"/>
             <w:tcMar>
@@ -562,10 +584,10 @@
       <w:tblPr>
         <w:tblW w:type="dxa" w:w="9072"/>
         <w:tblBorders>
-          <w:top w:val="none"/>
-          <w:left w:val="none"/>
-          <w:bottom w:val="none"/>
-          <w:right w:val="none"/>
+          <w:top w:val="single" w:color="FFFFFF" w:sz="0"/>
+          <w:left w:val="single" w:color="FFFFFF" w:sz="0"/>
+          <w:bottom w:val="single" w:color="FFFFFF" w:sz="0"/>
+          <w:right w:val="single" w:color="FFFFFF" w:sz="0"/>
           <w:insideH w:val="single" w:color="auto" w:sz="4"/>
           <w:insideV w:val="single" w:color="auto" w:sz="4"/>
         </w:tblBorders>
@@ -580,18 +602,18 @@
           <w:tcPr>
             <w:tcW w:type="dxa" w:w="4320"/>
             <w:tcBorders>
-              <w:top w:val="none"/>
-              <w:left w:val="none"/>
-              <w:bottom w:val="none"/>
-              <w:right w:val="none"/>
+              <w:top w:val="single" w:color="FFFFFF" w:sz="0"/>
+              <w:left w:val="single" w:color="FFFFFF" w:sz="0"/>
+              <w:bottom w:val="single" w:color="FFFFFF" w:sz="0"/>
+              <w:right w:val="single" w:color="FFFFFF" w:sz="0"/>
             </w:tcBorders>
             <w:tcMar>
-              <w:right w:type="dxa" w:w="200"/>
+              <w:right w:type="dxa" w:w="220"/>
             </w:tcMar>
           </w:tcPr>
           <w:p>
             <w:pPr>
-              <w:spacing w:after="100" w:before="120"/>
+              <w:spacing w:after="100" w:before="80"/>
             </w:pPr>
             <w:r>
               <w:rPr>
@@ -599,8 +621,8 @@
                 <w:b/>
                 <w:bCs/>
                 <w:color w:val="001141"/>
-                <w:sz w:val="24"/>
-                <w:szCs w:val="24"/>
+                <w:sz w:val="26"/>
+                <w:szCs w:val="26"/>
               </w:rPr>
               <w:t xml:space="preserve">The Moment</w:t>
             </w:r>
@@ -675,18 +697,18 @@
           <w:tcPr>
             <w:tcW w:type="dxa" w:w="4320"/>
             <w:tcBorders>
-              <w:top w:val="none"/>
-              <w:left w:val="none"/>
-              <w:bottom w:val="none"/>
-              <w:right w:val="none"/>
+              <w:top w:val="single" w:color="FFFFFF" w:sz="0"/>
+              <w:left w:val="single" w:color="FFFFFF" w:sz="0"/>
+              <w:bottom w:val="single" w:color="FFFFFF" w:sz="0"/>
+              <w:right w:val="single" w:color="FFFFFF" w:sz="0"/>
             </w:tcBorders>
             <w:tcMar>
-              <w:left w:type="dxa" w:w="200"/>
+              <w:left w:type="dxa" w:w="220"/>
             </w:tcMar>
           </w:tcPr>
           <w:p>
             <w:pPr>
-              <w:spacing w:after="100" w:before="120"/>
+              <w:spacing w:after="100" w:before="80"/>
             </w:pPr>
             <w:r>
               <w:rPr>
@@ -694,8 +716,8 @@
                 <w:b/>
                 <w:bCs/>
                 <w:color w:val="001141"/>
-                <w:sz w:val="24"/>
-                <w:szCs w:val="24"/>
+                <w:sz w:val="26"/>
+                <w:szCs w:val="26"/>
               </w:rPr>
               <w:t xml:space="preserve">Five Strategic Commitments</w:t>
             </w:r>
@@ -815,10 +837,10 @@
             <w:tblPr>
               <w:tblW w:type="dxa" w:w="9072"/>
               <w:tblBorders>
-                <w:top w:val="none"/>
-                <w:left w:val="none"/>
-                <w:bottom w:val="none"/>
-                <w:right w:val="none"/>
+                <w:top w:val="single" w:color="FFFFFF" w:sz="0"/>
+                <w:left w:val="single" w:color="FFFFFF" w:sz="0"/>
+                <w:bottom w:val="single" w:color="FFFFFF" w:sz="0"/>
+                <w:right w:val="single" w:color="FFFFFF" w:sz="0"/>
                 <w:insideH w:val="single" w:color="auto" w:sz="4"/>
                 <w:insideV w:val="single" w:color="auto" w:sz="4"/>
               </w:tblBorders>
@@ -831,10 +853,10 @@
               <w:tc>
                 <w:tcPr>
                   <w:tcBorders>
-                    <w:top w:val="single" w:color="0F62FE" w:sz="4" w:space="0"/>
-                    <w:left w:val="single" w:color="0F62FE" w:sz="24" w:space="4"/>
-                    <w:bottom w:val="single" w:color="0F62FE" w:sz="4" w:space="0"/>
-                    <w:right w:val="single" w:color="0F62FE" w:sz="4" w:space="0"/>
+                    <w:top w:val="single" w:color="0F62FE" w:sz="4"/>
+                    <w:left w:val="single" w:color="0F62FE" w:sz="28"/>
+                    <w:bottom w:val="single" w:color="0F62FE" w:sz="4"/>
+                    <w:right w:val="single" w:color="0F62FE" w:sz="4"/>
                   </w:tcBorders>
                   <w:shd w:fill="D0E2FF" w:val="clear"/>
                   <w:tcMar>
@@ -952,10 +974,10 @@
       <w:tblPr>
         <w:tblW w:type="dxa" w:w="9072"/>
         <w:tblBorders>
-          <w:top w:val="none"/>
-          <w:left w:val="none"/>
-          <w:bottom w:val="none"/>
-          <w:right w:val="none"/>
+          <w:top w:val="single" w:color="FFFFFF" w:sz="0"/>
+          <w:left w:val="single" w:color="FFFFFF" w:sz="0"/>
+          <w:bottom w:val="single" w:color="FFFFFF" w:sz="0"/>
+          <w:right w:val="single" w:color="FFFFFF" w:sz="0"/>
           <w:insideH w:val="single" w:color="auto" w:sz="4"/>
           <w:insideV w:val="single" w:color="auto" w:sz="4"/>
         </w:tblBorders>
@@ -972,10 +994,10 @@
           <w:tcPr>
             <w:tcW w:type="dxa" w:w="2268"/>
             <w:tcBorders>
-              <w:top w:val="none"/>
-              <w:left w:val="none"/>
-              <w:bottom w:val="none"/>
-              <w:right w:val="single" w:color="C6C6C6" w:sz="6" w:space="0"/>
+              <w:top w:val="single" w:color="FFFFFF" w:sz="0"/>
+              <w:left w:val="single" w:color="FFFFFF" w:sz="0"/>
+              <w:bottom w:val="single" w:color="FFFFFF" w:sz="0"/>
+              <w:right w:val="single" w:color="C6C6C6" w:sz="6"/>
             </w:tcBorders>
             <w:shd w:fill="F4F4F4" w:val="clear"/>
             <w:tcMar>
@@ -1021,10 +1043,10 @@
           <w:tcPr>
             <w:tcW w:type="dxa" w:w="2268"/>
             <w:tcBorders>
-              <w:top w:val="none"/>
-              <w:left w:val="none"/>
-              <w:bottom w:val="none"/>
-              <w:right w:val="single" w:color="C6C6C6" w:sz="6" w:space="0"/>
+              <w:top w:val="single" w:color="FFFFFF" w:sz="0"/>
+              <w:left w:val="single" w:color="FFFFFF" w:sz="0"/>
+              <w:bottom w:val="single" w:color="FFFFFF" w:sz="0"/>
+              <w:right w:val="single" w:color="C6C6C6" w:sz="6"/>
             </w:tcBorders>
             <w:shd w:fill="F4F4F4" w:val="clear"/>
             <w:tcMar>
@@ -1070,10 +1092,10 @@
           <w:tcPr>
             <w:tcW w:type="dxa" w:w="2268"/>
             <w:tcBorders>
-              <w:top w:val="none"/>
-              <w:left w:val="none"/>
-              <w:bottom w:val="none"/>
-              <w:right w:val="single" w:color="C6C6C6" w:sz="6" w:space="0"/>
+              <w:top w:val="single" w:color="FFFFFF" w:sz="0"/>
+              <w:left w:val="single" w:color="FFFFFF" w:sz="0"/>
+              <w:bottom w:val="single" w:color="FFFFFF" w:sz="0"/>
+              <w:right w:val="single" w:color="C6C6C6" w:sz="6"/>
             </w:tcBorders>
             <w:shd w:fill="F4F4F4" w:val="clear"/>
             <w:tcMar>
@@ -1119,10 +1141,10 @@
           <w:tcPr>
             <w:tcW w:type="dxa" w:w="2268"/>
             <w:tcBorders>
-              <w:top w:val="none"/>
-              <w:left w:val="none"/>
-              <w:bottom w:val="none"/>
-              <w:right w:val="single" w:color="C6C6C6" w:sz="6" w:space="0"/>
+              <w:top w:val="single" w:color="FFFFFF" w:sz="0"/>
+              <w:left w:val="single" w:color="FFFFFF" w:sz="0"/>
+              <w:bottom w:val="single" w:color="FFFFFF" w:sz="0"/>
+              <w:right w:val="single" w:color="C6C6C6" w:sz="6"/>
             </w:tcBorders>
             <w:shd w:fill="F4F4F4" w:val="clear"/>
             <w:tcMar>
@@ -1174,9 +1196,9 @@
     <w:p>
       <w:pPr>
         <w:pBdr>
-          <w:bottom w:val="single" w:color="0F62FE" w:sz="8" w:space="6"/>
+          <w:bottom w:val="single" w:color="0F62FE" w:sz="4" w:space="4"/>
         </w:pBdr>
-        <w:spacing w:after="80" w:before="300"/>
+        <w:spacing w:after="80" w:before="240"/>
       </w:pPr>
       <w:r>
         <w:rPr>
@@ -1210,10 +1232,10 @@
       <w:tblPr>
         <w:tblW w:type="dxa" w:w="9072"/>
         <w:tblBorders>
-          <w:top w:val="none"/>
-          <w:left w:val="none"/>
-          <w:bottom w:val="none"/>
-          <w:right w:val="none"/>
+          <w:top w:val="single" w:color="FFFFFF" w:sz="0"/>
+          <w:left w:val="single" w:color="FFFFFF" w:sz="0"/>
+          <w:bottom w:val="single" w:color="FFFFFF" w:sz="0"/>
+          <w:right w:val="single" w:color="FFFFFF" w:sz="0"/>
           <w:insideH w:val="single" w:color="auto" w:sz="4"/>
           <w:insideV w:val="single" w:color="auto" w:sz="4"/>
         </w:tblBorders>
@@ -1228,18 +1250,18 @@
           <w:tcPr>
             <w:tcW w:type="dxa" w:w="4320"/>
             <w:tcBorders>
-              <w:top w:val="none"/>
-              <w:left w:val="none"/>
-              <w:bottom w:val="none"/>
-              <w:right w:val="none"/>
+              <w:top w:val="single" w:color="FFFFFF" w:sz="0"/>
+              <w:left w:val="single" w:color="FFFFFF" w:sz="0"/>
+              <w:bottom w:val="single" w:color="FFFFFF" w:sz="0"/>
+              <w:right w:val="single" w:color="FFFFFF" w:sz="0"/>
             </w:tcBorders>
             <w:tcMar>
-              <w:right w:type="dxa" w:w="200"/>
+              <w:right w:type="dxa" w:w="220"/>
             </w:tcMar>
           </w:tcPr>
           <w:p>
             <w:pPr>
-              <w:spacing w:after="100" w:before="120"/>
+              <w:spacing w:after="100" w:before="80"/>
             </w:pPr>
             <w:r>
               <w:rPr>
@@ -1247,8 +1269,8 @@
                 <w:b/>
                 <w:bCs/>
                 <w:color w:val="001141"/>
-                <w:sz w:val="24"/>
-                <w:szCs w:val="24"/>
+                <w:sz w:val="26"/>
+                <w:szCs w:val="26"/>
               </w:rPr>
               <w:t xml:space="preserve">What Horizon Needs</w:t>
             </w:r>
@@ -1325,7 +1347,7 @@
                 <w:sz w:val="20"/>
                 <w:szCs w:val="20"/>
               </w:rPr>
-              <w:t xml:space="preserve">Realisation of a product-oriented operating model.</w:t>
+              <w:t xml:space="preserve">Realization of a product-oriented operating model.</w:t>
             </w:r>
           </w:p>
           <w:p>
@@ -1439,18 +1461,18 @@
           <w:tcPr>
             <w:tcW w:type="dxa" w:w="4320"/>
             <w:tcBorders>
-              <w:top w:val="none"/>
-              <w:left w:val="none"/>
-              <w:bottom w:val="none"/>
-              <w:right w:val="none"/>
+              <w:top w:val="single" w:color="FFFFFF" w:sz="0"/>
+              <w:left w:val="single" w:color="FFFFFF" w:sz="0"/>
+              <w:bottom w:val="single" w:color="FFFFFF" w:sz="0"/>
+              <w:right w:val="single" w:color="FFFFFF" w:sz="0"/>
             </w:tcBorders>
             <w:tcMar>
-              <w:left w:type="dxa" w:w="200"/>
+              <w:left w:type="dxa" w:w="220"/>
             </w:tcMar>
           </w:tcPr>
           <w:p>
             <w:pPr>
-              <w:spacing w:after="100" w:before="120"/>
+              <w:spacing w:after="100" w:before="80"/>
             </w:pPr>
             <w:r>
               <w:rPr>
@@ -1458,8 +1480,8 @@
                 <w:b/>
                 <w:bCs/>
                 <w:color w:val="001141"/>
-                <w:sz w:val="24"/>
-                <w:szCs w:val="24"/>
+                <w:sz w:val="26"/>
+                <w:szCs w:val="26"/>
               </w:rPr>
               <w:t xml:space="preserve">Factors That Shaped IBM's Solution</w:t>
             </w:r>
@@ -1479,7 +1501,7 @@
                 <w:rFonts w:ascii="Calibri" w:cs="Calibri" w:eastAsia="Calibri" w:hAnsi="Calibri"/>
                 <w:b/>
                 <w:bCs/>
-                <w:color w:val="21272A"/>
+                <w:color w:val="0F62FE"/>
                 <w:sz w:val="20"/>
                 <w:szCs w:val="20"/>
               </w:rPr>
@@ -1510,7 +1532,7 @@
                 <w:rFonts w:ascii="Calibri" w:cs="Calibri" w:eastAsia="Calibri" w:hAnsi="Calibri"/>
                 <w:b/>
                 <w:bCs/>
-                <w:color w:val="21272A"/>
+                <w:color w:val="0F62FE"/>
                 <w:sz w:val="20"/>
                 <w:szCs w:val="20"/>
               </w:rPr>
@@ -1541,7 +1563,7 @@
                 <w:rFonts w:ascii="Calibri" w:cs="Calibri" w:eastAsia="Calibri" w:hAnsi="Calibri"/>
                 <w:b/>
                 <w:bCs/>
-                <w:color w:val="21272A"/>
+                <w:color w:val="0F62FE"/>
                 <w:sz w:val="20"/>
                 <w:szCs w:val="20"/>
               </w:rPr>
@@ -1572,7 +1594,7 @@
                 <w:rFonts w:ascii="Calibri" w:cs="Calibri" w:eastAsia="Calibri" w:hAnsi="Calibri"/>
                 <w:b/>
                 <w:bCs/>
-                <w:color w:val="21272A"/>
+                <w:color w:val="0F62FE"/>
                 <w:sz w:val="20"/>
                 <w:szCs w:val="20"/>
               </w:rPr>
@@ -1603,10 +1625,10 @@
             <w:tblPr>
               <w:tblW w:type="dxa" w:w="9072"/>
               <w:tblBorders>
-                <w:top w:val="none"/>
-                <w:left w:val="none"/>
-                <w:bottom w:val="none"/>
-                <w:right w:val="none"/>
+                <w:top w:val="single" w:color="FFFFFF" w:sz="0"/>
+                <w:left w:val="single" w:color="FFFFFF" w:sz="0"/>
+                <w:bottom w:val="single" w:color="FFFFFF" w:sz="0"/>
+                <w:right w:val="single" w:color="FFFFFF" w:sz="0"/>
                 <w:insideH w:val="single" w:color="auto" w:sz="4"/>
                 <w:insideV w:val="single" w:color="auto" w:sz="4"/>
               </w:tblBorders>
@@ -1619,10 +1641,10 @@
               <w:tc>
                 <w:tcPr>
                   <w:tcBorders>
-                    <w:top w:val="none"/>
-                    <w:left w:val="single" w:color="009D9A" w:sz="24" w:space="4"/>
-                    <w:bottom w:val="none"/>
-                    <w:right w:val="none"/>
+                    <w:top w:val="single" w:color="FFFFFF" w:sz="0"/>
+                    <w:left w:val="single" w:color="009D9A" w:sz="28"/>
+                    <w:bottom w:val="single" w:color="FFFFFF" w:sz="0"/>
+                    <w:right w:val="single" w:color="FFFFFF" w:sz="0"/>
                   </w:tcBorders>
                   <w:shd w:fill="D9FBFB" w:val="clear"/>
                   <w:tcMar>
@@ -1635,7 +1657,7 @@
                 <w:p>
                   <w:pPr>
                     <w:spacing w:after="80" w:before="80"/>
-                    <w:jc w:val="center"/>
+                    <w:jc w:val="both"/>
                   </w:pPr>
                   <w:r>
                     <w:rPr>
@@ -1709,17 +1731,17 @@
           <w:sz w:val="21"/>
           <w:szCs w:val="21"/>
         </w:rPr>
-        <w:t xml:space="preserve">Current vs. Target: Automation Coverage by Domain</w:t>
+        <w:t xml:space="preserve">Figure 1: Current vs. Target — Automation Coverage by Domain</w:t>
       </w:r>
     </w:p>
     <w:tbl>
       <w:tblPr>
         <w:tblW w:type="dxa" w:w="9072"/>
         <w:tblBorders>
-          <w:top w:val="none"/>
-          <w:left w:val="none"/>
-          <w:bottom w:val="none"/>
-          <w:right w:val="none"/>
+          <w:top w:val="single" w:color="FFFFFF" w:sz="0"/>
+          <w:left w:val="single" w:color="FFFFFF" w:sz="0"/>
+          <w:bottom w:val="single" w:color="FFFFFF" w:sz="0"/>
+          <w:right w:val="single" w:color="FFFFFF" w:sz="0"/>
           <w:insideH w:val="single" w:color="auto" w:sz="4"/>
           <w:insideV w:val="single" w:color="auto" w:sz="4"/>
         </w:tblBorders>
@@ -1734,12 +1756,12 @@
       <w:tr>
         <w:tc>
           <w:tcPr>
-            <w:tcW w:type="dxa" w:w="2400"/>
-            <w:tcBorders>
-              <w:top w:val="none"/>
-              <w:left w:val="none"/>
-              <w:bottom w:val="none"/>
-              <w:right w:val="none"/>
+            <w:tcW w:type="dxa" w:w="2600"/>
+            <w:tcBorders>
+              <w:top w:val="single" w:color="FFFFFF" w:sz="0"/>
+              <w:left w:val="single" w:color="FFFFFF" w:sz="0"/>
+              <w:bottom w:val="single" w:color="FFFFFF" w:sz="0"/>
+              <w:right w:val="single" w:color="FFFFFF" w:sz="0"/>
             </w:tcBorders>
             <w:tcMar>
               <w:right w:type="dxa" w:w="80"/>
@@ -1763,12 +1785,12 @@
         </w:tc>
         <w:tc>
           <w:tcPr>
-            <w:tcW w:type="dxa" w:w="5400"/>
-            <w:tcBorders>
-              <w:top w:val="none"/>
-              <w:left w:val="none"/>
-              <w:bottom w:val="none"/>
-              <w:right w:val="none"/>
+            <w:tcW w:type="dxa" w:w="5200"/>
+            <w:tcBorders>
+              <w:top w:val="single" w:color="FFFFFF" w:sz="0"/>
+              <w:left w:val="single" w:color="FFFFFF" w:sz="0"/>
+              <w:bottom w:val="single" w:color="FFFFFF" w:sz="0"/>
+              <w:right w:val="single" w:color="FFFFFF" w:sz="0"/>
             </w:tcBorders>
             <w:shd w:fill="6F6F6F" w:val="clear"/>
           </w:tcPr>
@@ -1782,10 +1804,10 @@
           <w:tcPr>
             <w:tcW w:type="dxa" w:w="1200"/>
             <w:tcBorders>
-              <w:top w:val="none"/>
-              <w:left w:val="none"/>
-              <w:bottom w:val="none"/>
-              <w:right w:val="none"/>
+              <w:top w:val="single" w:color="FFFFFF" w:sz="0"/>
+              <w:left w:val="single" w:color="FFFFFF" w:sz="0"/>
+              <w:bottom w:val="single" w:color="FFFFFF" w:sz="0"/>
+              <w:right w:val="single" w:color="FFFFFF" w:sz="0"/>
             </w:tcBorders>
             <w:tcMar>
               <w:left w:type="dxa" w:w="80"/>
@@ -1814,12 +1836,12 @@
       <w:tr>
         <w:tc>
           <w:tcPr>
-            <w:tcW w:type="dxa" w:w="2400"/>
-            <w:tcBorders>
-              <w:top w:val="none"/>
-              <w:left w:val="none"/>
-              <w:bottom w:val="none"/>
-              <w:right w:val="none"/>
+            <w:tcW w:type="dxa" w:w="2600"/>
+            <w:tcBorders>
+              <w:top w:val="single" w:color="FFFFFF" w:sz="0"/>
+              <w:left w:val="single" w:color="FFFFFF" w:sz="0"/>
+              <w:bottom w:val="single" w:color="FFFFFF" w:sz="0"/>
+              <w:right w:val="single" w:color="FFFFFF" w:sz="0"/>
             </w:tcBorders>
             <w:tcMar>
               <w:right w:type="dxa" w:w="80"/>
@@ -1843,12 +1865,12 @@
         </w:tc>
         <w:tc>
           <w:tcPr>
-            <w:tcW w:type="dxa" w:w="4560"/>
-            <w:tcBorders>
-              <w:top w:val="none"/>
-              <w:left w:val="none"/>
-              <w:bottom w:val="none"/>
-              <w:right w:val="none"/>
+            <w:tcW w:type="dxa" w:w="4391"/>
+            <w:tcBorders>
+              <w:top w:val="single" w:color="FFFFFF" w:sz="0"/>
+              <w:left w:val="single" w:color="FFFFFF" w:sz="0"/>
+              <w:bottom w:val="single" w:color="FFFFFF" w:sz="0"/>
+              <w:right w:val="single" w:color="FFFFFF" w:sz="0"/>
             </w:tcBorders>
             <w:shd w:fill="6F6F6F" w:val="clear"/>
           </w:tcPr>
@@ -1860,12 +1882,12 @@
         </w:tc>
         <w:tc>
           <w:tcPr>
-            <w:tcW w:type="dxa" w:w="840"/>
-            <w:tcBorders>
-              <w:top w:val="none"/>
-              <w:left w:val="none"/>
-              <w:bottom w:val="none"/>
-              <w:right w:val="none"/>
+            <w:tcW w:type="dxa" w:w="809"/>
+            <w:tcBorders>
+              <w:top w:val="single" w:color="FFFFFF" w:sz="0"/>
+              <w:left w:val="single" w:color="FFFFFF" w:sz="0"/>
+              <w:bottom w:val="single" w:color="FFFFFF" w:sz="0"/>
+              <w:right w:val="single" w:color="FFFFFF" w:sz="0"/>
             </w:tcBorders>
             <w:shd w:fill="E8E8E8" w:val="clear"/>
           </w:tcPr>
@@ -1879,10 +1901,10 @@
           <w:tcPr>
             <w:tcW w:type="dxa" w:w="1200"/>
             <w:tcBorders>
-              <w:top w:val="none"/>
-              <w:left w:val="none"/>
-              <w:bottom w:val="none"/>
-              <w:right w:val="none"/>
+              <w:top w:val="single" w:color="FFFFFF" w:sz="0"/>
+              <w:left w:val="single" w:color="FFFFFF" w:sz="0"/>
+              <w:bottom w:val="single" w:color="FFFFFF" w:sz="0"/>
+              <w:right w:val="single" w:color="FFFFFF" w:sz="0"/>
             </w:tcBorders>
             <w:tcMar>
               <w:left w:type="dxa" w:w="80"/>
@@ -1911,12 +1933,12 @@
       <w:tr>
         <w:tc>
           <w:tcPr>
-            <w:tcW w:type="dxa" w:w="2400"/>
-            <w:tcBorders>
-              <w:top w:val="none"/>
-              <w:left w:val="none"/>
-              <w:bottom w:val="none"/>
-              <w:right w:val="none"/>
+            <w:tcW w:type="dxa" w:w="2600"/>
+            <w:tcBorders>
+              <w:top w:val="single" w:color="FFFFFF" w:sz="0"/>
+              <w:left w:val="single" w:color="FFFFFF" w:sz="0"/>
+              <w:bottom w:val="single" w:color="FFFFFF" w:sz="0"/>
+              <w:right w:val="single" w:color="FFFFFF" w:sz="0"/>
             </w:tcBorders>
             <w:tcMar>
               <w:right w:type="dxa" w:w="80"/>
@@ -1940,12 +1962,12 @@
         </w:tc>
         <w:tc>
           <w:tcPr>
-            <w:tcW w:type="dxa" w:w="2640"/>
-            <w:tcBorders>
-              <w:top w:val="none"/>
-              <w:left w:val="none"/>
-              <w:bottom w:val="none"/>
-              <w:right w:val="none"/>
+            <w:tcW w:type="dxa" w:w="2542"/>
+            <w:tcBorders>
+              <w:top w:val="single" w:color="FFFFFF" w:sz="0"/>
+              <w:left w:val="single" w:color="FFFFFF" w:sz="0"/>
+              <w:bottom w:val="single" w:color="FFFFFF" w:sz="0"/>
+              <w:right w:val="single" w:color="FFFFFF" w:sz="0"/>
             </w:tcBorders>
             <w:shd w:fill="6F6F6F" w:val="clear"/>
           </w:tcPr>
@@ -1957,12 +1979,12 @@
         </w:tc>
         <w:tc>
           <w:tcPr>
-            <w:tcW w:type="dxa" w:w="2760"/>
-            <w:tcBorders>
-              <w:top w:val="none"/>
-              <w:left w:val="none"/>
-              <w:bottom w:val="none"/>
-              <w:right w:val="none"/>
+            <w:tcW w:type="dxa" w:w="2658"/>
+            <w:tcBorders>
+              <w:top w:val="single" w:color="FFFFFF" w:sz="0"/>
+              <w:left w:val="single" w:color="FFFFFF" w:sz="0"/>
+              <w:bottom w:val="single" w:color="FFFFFF" w:sz="0"/>
+              <w:right w:val="single" w:color="FFFFFF" w:sz="0"/>
             </w:tcBorders>
             <w:shd w:fill="E8E8E8" w:val="clear"/>
           </w:tcPr>
@@ -1976,10 +1998,10 @@
           <w:tcPr>
             <w:tcW w:type="dxa" w:w="1200"/>
             <w:tcBorders>
-              <w:top w:val="none"/>
-              <w:left w:val="none"/>
-              <w:bottom w:val="none"/>
-              <w:right w:val="none"/>
+              <w:top w:val="single" w:color="FFFFFF" w:sz="0"/>
+              <w:left w:val="single" w:color="FFFFFF" w:sz="0"/>
+              <w:bottom w:val="single" w:color="FFFFFF" w:sz="0"/>
+              <w:right w:val="single" w:color="FFFFFF" w:sz="0"/>
             </w:tcBorders>
             <w:tcMar>
               <w:left w:type="dxa" w:w="80"/>
@@ -2008,12 +2030,12 @@
       <w:tr>
         <w:tc>
           <w:tcPr>
-            <w:tcW w:type="dxa" w:w="2400"/>
-            <w:tcBorders>
-              <w:top w:val="none"/>
-              <w:left w:val="none"/>
-              <w:bottom w:val="none"/>
-              <w:right w:val="none"/>
+            <w:tcW w:type="dxa" w:w="2600"/>
+            <w:tcBorders>
+              <w:top w:val="single" w:color="FFFFFF" w:sz="0"/>
+              <w:left w:val="single" w:color="FFFFFF" w:sz="0"/>
+              <w:bottom w:val="single" w:color="FFFFFF" w:sz="0"/>
+              <w:right w:val="single" w:color="FFFFFF" w:sz="0"/>
             </w:tcBorders>
             <w:tcMar>
               <w:right w:type="dxa" w:w="80"/>
@@ -2037,12 +2059,12 @@
         </w:tc>
         <w:tc>
           <w:tcPr>
-            <w:tcW w:type="dxa" w:w="2160"/>
-            <w:tcBorders>
-              <w:top w:val="none"/>
-              <w:left w:val="none"/>
-              <w:bottom w:val="none"/>
-              <w:right w:val="none"/>
+            <w:tcW w:type="dxa" w:w="2080"/>
+            <w:tcBorders>
+              <w:top w:val="single" w:color="FFFFFF" w:sz="0"/>
+              <w:left w:val="single" w:color="FFFFFF" w:sz="0"/>
+              <w:bottom w:val="single" w:color="FFFFFF" w:sz="0"/>
+              <w:right w:val="single" w:color="FFFFFF" w:sz="0"/>
             </w:tcBorders>
             <w:shd w:fill="6F6F6F" w:val="clear"/>
           </w:tcPr>
@@ -2054,12 +2076,12 @@
         </w:tc>
         <w:tc>
           <w:tcPr>
-            <w:tcW w:type="dxa" w:w="3240"/>
-            <w:tcBorders>
-              <w:top w:val="none"/>
-              <w:left w:val="none"/>
-              <w:bottom w:val="none"/>
-              <w:right w:val="none"/>
+            <w:tcW w:type="dxa" w:w="3120"/>
+            <w:tcBorders>
+              <w:top w:val="single" w:color="FFFFFF" w:sz="0"/>
+              <w:left w:val="single" w:color="FFFFFF" w:sz="0"/>
+              <w:bottom w:val="single" w:color="FFFFFF" w:sz="0"/>
+              <w:right w:val="single" w:color="FFFFFF" w:sz="0"/>
             </w:tcBorders>
             <w:shd w:fill="E8E8E8" w:val="clear"/>
           </w:tcPr>
@@ -2073,10 +2095,10 @@
           <w:tcPr>
             <w:tcW w:type="dxa" w:w="1200"/>
             <w:tcBorders>
-              <w:top w:val="none"/>
-              <w:left w:val="none"/>
-              <w:bottom w:val="none"/>
-              <w:right w:val="none"/>
+              <w:top w:val="single" w:color="FFFFFF" w:sz="0"/>
+              <w:left w:val="single" w:color="FFFFFF" w:sz="0"/>
+              <w:bottom w:val="single" w:color="FFFFFF" w:sz="0"/>
+              <w:right w:val="single" w:color="FFFFFF" w:sz="0"/>
             </w:tcBorders>
             <w:tcMar>
               <w:left w:type="dxa" w:w="80"/>
@@ -2105,12 +2127,12 @@
       <w:tr>
         <w:tc>
           <w:tcPr>
-            <w:tcW w:type="dxa" w:w="2400"/>
-            <w:tcBorders>
-              <w:top w:val="none"/>
-              <w:left w:val="none"/>
-              <w:bottom w:val="none"/>
-              <w:right w:val="none"/>
+            <w:tcW w:type="dxa" w:w="2600"/>
+            <w:tcBorders>
+              <w:top w:val="single" w:color="FFFFFF" w:sz="0"/>
+              <w:left w:val="single" w:color="FFFFFF" w:sz="0"/>
+              <w:bottom w:val="single" w:color="FFFFFF" w:sz="0"/>
+              <w:right w:val="single" w:color="FFFFFF" w:sz="0"/>
             </w:tcBorders>
             <w:tcMar>
               <w:right w:type="dxa" w:w="80"/>
@@ -2134,12 +2156,12 @@
         </w:tc>
         <w:tc>
           <w:tcPr>
-            <w:tcW w:type="dxa" w:w="1800"/>
-            <w:tcBorders>
-              <w:top w:val="none"/>
-              <w:left w:val="none"/>
-              <w:bottom w:val="none"/>
-              <w:right w:val="none"/>
+            <w:tcW w:type="dxa" w:w="1733"/>
+            <w:tcBorders>
+              <w:top w:val="single" w:color="FFFFFF" w:sz="0"/>
+              <w:left w:val="single" w:color="FFFFFF" w:sz="0"/>
+              <w:bottom w:val="single" w:color="FFFFFF" w:sz="0"/>
+              <w:right w:val="single" w:color="FFFFFF" w:sz="0"/>
             </w:tcBorders>
             <w:shd w:fill="6F6F6F" w:val="clear"/>
           </w:tcPr>
@@ -2151,12 +2173,12 @@
         </w:tc>
         <w:tc>
           <w:tcPr>
-            <w:tcW w:type="dxa" w:w="3600"/>
-            <w:tcBorders>
-              <w:top w:val="none"/>
-              <w:left w:val="none"/>
-              <w:bottom w:val="none"/>
-              <w:right w:val="none"/>
+            <w:tcW w:type="dxa" w:w="3467"/>
+            <w:tcBorders>
+              <w:top w:val="single" w:color="FFFFFF" w:sz="0"/>
+              <w:left w:val="single" w:color="FFFFFF" w:sz="0"/>
+              <w:bottom w:val="single" w:color="FFFFFF" w:sz="0"/>
+              <w:right w:val="single" w:color="FFFFFF" w:sz="0"/>
             </w:tcBorders>
             <w:shd w:fill="E8E8E8" w:val="clear"/>
           </w:tcPr>
@@ -2170,10 +2192,10 @@
           <w:tcPr>
             <w:tcW w:type="dxa" w:w="1200"/>
             <w:tcBorders>
-              <w:top w:val="none"/>
-              <w:left w:val="none"/>
-              <w:bottom w:val="none"/>
-              <w:right w:val="none"/>
+              <w:top w:val="single" w:color="FFFFFF" w:sz="0"/>
+              <w:left w:val="single" w:color="FFFFFF" w:sz="0"/>
+              <w:bottom w:val="single" w:color="FFFFFF" w:sz="0"/>
+              <w:right w:val="single" w:color="FFFFFF" w:sz="0"/>
             </w:tcBorders>
             <w:tcMar>
               <w:left w:type="dxa" w:w="80"/>
@@ -2202,18 +2224,7 @@
     </w:tbl>
     <w:p>
       <w:pPr>
-        <w:spacing w:after="40"/>
-      </w:pPr>
-      <w:r>
-        <w:rPr>
-          <w:rFonts w:ascii="Calibri" w:cs="Calibri" w:eastAsia="Calibri" w:hAnsi="Calibri"/>
-        </w:rPr>
-        <w:t xml:space="preserve"/>
-      </w:r>
-    </w:p>
-    <w:p>
-      <w:pPr>
-        <w:spacing w:after="200"/>
+        <w:spacing w:after="160" w:before="80"/>
         <w:jc w:val="center"/>
       </w:pPr>
       <w:r>
@@ -2225,7 +2236,7 @@
           <w:sz w:val="16"/>
           <w:szCs w:val="16"/>
         </w:rPr>
-        <w:t xml:space="preserve">Figure 1: Estimated baseline automation coverage across AMS domains (current state). IBM's proposal targets 80%+ automation across all domains within 12 months.</w:t>
+        <w:t xml:space="preserve">Estimated baseline automation coverage across AMS domains (current state). IBM's proposal targets 80%+ automation across all domains within 12 months.</w:t>
       </w:r>
     </w:p>
     <w:p>
@@ -2236,9 +2247,9 @@
     <w:p>
       <w:pPr>
         <w:pBdr>
-          <w:bottom w:val="single" w:color="0F62FE" w:sz="8" w:space="6"/>
+          <w:bottom w:val="single" w:color="0F62FE" w:sz="4" w:space="4"/>
         </w:pBdr>
-        <w:spacing w:after="80" w:before="300"/>
+        <w:spacing w:after="80" w:before="240"/>
       </w:pPr>
       <w:r>
         <w:rPr>
@@ -2272,10 +2283,10 @@
       <w:tblPr>
         <w:tblW w:type="dxa" w:w="9072"/>
         <w:tblBorders>
-          <w:top w:val="none"/>
-          <w:left w:val="none"/>
-          <w:bottom w:val="none"/>
-          <w:right w:val="none"/>
+          <w:top w:val="single" w:color="FFFFFF" w:sz="0"/>
+          <w:left w:val="single" w:color="FFFFFF" w:sz="0"/>
+          <w:bottom w:val="single" w:color="FFFFFF" w:sz="0"/>
+          <w:right w:val="single" w:color="FFFFFF" w:sz="0"/>
           <w:insideH w:val="single" w:color="auto" w:sz="4"/>
           <w:insideV w:val="single" w:color="auto" w:sz="4"/>
         </w:tblBorders>
@@ -2290,18 +2301,18 @@
           <w:tcPr>
             <w:tcW w:type="dxa" w:w="4320"/>
             <w:tcBorders>
-              <w:top w:val="none"/>
-              <w:left w:val="none"/>
-              <w:bottom w:val="none"/>
-              <w:right w:val="none"/>
+              <w:top w:val="single" w:color="FFFFFF" w:sz="0"/>
+              <w:left w:val="single" w:color="FFFFFF" w:sz="0"/>
+              <w:bottom w:val="single" w:color="FFFFFF" w:sz="0"/>
+              <w:right w:val="single" w:color="FFFFFF" w:sz="0"/>
             </w:tcBorders>
             <w:tcMar>
-              <w:right w:type="dxa" w:w="200"/>
+              <w:right w:type="dxa" w:w="220"/>
             </w:tcMar>
           </w:tcPr>
           <w:p>
             <w:pPr>
-              <w:spacing w:after="100" w:before="120"/>
+              <w:spacing w:after="100" w:before="80"/>
             </w:pPr>
             <w:r>
               <w:rPr>
@@ -2309,8 +2320,8 @@
                 <w:b/>
                 <w:bCs/>
                 <w:color w:val="001141"/>
-                <w:sz w:val="24"/>
-                <w:szCs w:val="24"/>
+                <w:sz w:val="26"/>
+                <w:szCs w:val="26"/>
               </w:rPr>
               <w:t xml:space="preserve">What Is CareOps360?</w:t>
             </w:r>
@@ -2490,18 +2501,18 @@
           <w:tcPr>
             <w:tcW w:type="dxa" w:w="4320"/>
             <w:tcBorders>
-              <w:top w:val="none"/>
-              <w:left w:val="none"/>
-              <w:bottom w:val="none"/>
-              <w:right w:val="none"/>
+              <w:top w:val="single" w:color="FFFFFF" w:sz="0"/>
+              <w:left w:val="single" w:color="FFFFFF" w:sz="0"/>
+              <w:bottom w:val="single" w:color="FFFFFF" w:sz="0"/>
+              <w:right w:val="single" w:color="FFFFFF" w:sz="0"/>
             </w:tcBorders>
             <w:tcMar>
-              <w:left w:type="dxa" w:w="200"/>
+              <w:left w:type="dxa" w:w="220"/>
             </w:tcMar>
           </w:tcPr>
           <w:p>
             <w:pPr>
-              <w:spacing w:after="100" w:before="120"/>
+              <w:spacing w:after="100" w:before="80"/>
             </w:pPr>
             <w:r>
               <w:rPr>
@@ -2509,8 +2520,8 @@
                 <w:b/>
                 <w:bCs/>
                 <w:color w:val="001141"/>
-                <w:sz w:val="24"/>
-                <w:szCs w:val="24"/>
+                <w:sz w:val="26"/>
+                <w:szCs w:val="26"/>
               </w:rPr>
               <w:t xml:space="preserve">Platform Architecture</w:t>
             </w:r>
@@ -2625,10 +2636,10 @@
             <w:tblPr>
               <w:tblW w:type="dxa" w:w="9072"/>
               <w:tblBorders>
-                <w:top w:val="none"/>
-                <w:left w:val="none"/>
-                <w:bottom w:val="none"/>
-                <w:right w:val="none"/>
+                <w:top w:val="single" w:color="FFFFFF" w:sz="0"/>
+                <w:left w:val="single" w:color="FFFFFF" w:sz="0"/>
+                <w:bottom w:val="single" w:color="FFFFFF" w:sz="0"/>
+                <w:right w:val="single" w:color="FFFFFF" w:sz="0"/>
                 <w:insideH w:val="single" w:color="auto" w:sz="4"/>
                 <w:insideV w:val="single" w:color="auto" w:sz="4"/>
               </w:tblBorders>
@@ -2641,10 +2652,10 @@
               <w:tc>
                 <w:tcPr>
                   <w:tcBorders>
-                    <w:top w:val="single" w:color="001141" w:sz="4" w:space="0"/>
-                    <w:left w:val="single" w:color="001141" w:sz="24" w:space="4"/>
-                    <w:bottom w:val="single" w:color="001141" w:sz="4" w:space="0"/>
-                    <w:right w:val="single" w:color="001141" w:sz="4" w:space="0"/>
+                    <w:top w:val="single" w:color="001141" w:sz="4"/>
+                    <w:left w:val="single" w:color="001141" w:sz="28"/>
+                    <w:bottom w:val="single" w:color="001141" w:sz="4"/>
+                    <w:right w:val="single" w:color="001141" w:sz="4"/>
                   </w:tcBorders>
                   <w:shd w:fill="F4F4F4" w:val="clear"/>
                   <w:tcMar>
@@ -2752,7 +2763,7 @@
       <w:r>
         <w:drawing>
           <wp:inline distT="0" distB="0" distL="0" distR="0">
-            <wp:extent cx="819150" cy="514350"/>
+            <wp:extent cx="6477000" cy="3762375"/>
             <wp:effectExtent t="0" r="0" b="0" l="0"/>
             <wp:docPr id="1" name="" descr="" title=""/>
             <wp:cNvGraphicFramePr>
@@ -2777,7 +2788,7 @@
                   <pic:spPr bwMode="auto">
                     <a:xfrm>
                       <a:off x="0" y="0"/>
-                      <a:ext cx="819150" cy="514350"/>
+                      <a:ext cx="6477000" cy="3762375"/>
                     </a:xfrm>
                     <a:prstGeom prst="rect">
                       <a:avLst/>
@@ -2815,9 +2826,9 @@
     <w:p>
       <w:pPr>
         <w:pBdr>
-          <w:bottom w:val="single" w:color="0F62FE" w:sz="8" w:space="6"/>
+          <w:bottom w:val="single" w:color="0F62FE" w:sz="4" w:space="4"/>
         </w:pBdr>
-        <w:spacing w:after="80" w:before="300"/>
+        <w:spacing w:after="80" w:before="240"/>
       </w:pPr>
       <w:r>
         <w:rPr>
@@ -2828,7 +2839,7 @@
           <w:sz w:val="44"/>
           <w:szCs w:val="44"/>
         </w:rPr>
-        <w:t xml:space="preserve">Digital Front Door &amp; Quote to Cart</w:t>
+        <w:t xml:space="preserve">Digital Front Door &amp; Quote to Cart Initiatives</w:t>
       </w:r>
     </w:p>
     <w:p>
@@ -2851,10 +2862,10 @@
       <w:tblPr>
         <w:tblW w:type="dxa" w:w="9072"/>
         <w:tblBorders>
-          <w:top w:val="none"/>
-          <w:left w:val="none"/>
-          <w:bottom w:val="none"/>
-          <w:right w:val="none"/>
+          <w:top w:val="single" w:color="FFFFFF" w:sz="0"/>
+          <w:left w:val="single" w:color="FFFFFF" w:sz="0"/>
+          <w:bottom w:val="single" w:color="FFFFFF" w:sz="0"/>
+          <w:right w:val="single" w:color="FFFFFF" w:sz="0"/>
           <w:insideH w:val="single" w:color="auto" w:sz="4"/>
           <w:insideV w:val="single" w:color="auto" w:sz="4"/>
         </w:tblBorders>
@@ -2869,18 +2880,18 @@
           <w:tcPr>
             <w:tcW w:type="dxa" w:w="4320"/>
             <w:tcBorders>
-              <w:top w:val="none"/>
-              <w:left w:val="none"/>
-              <w:bottom w:val="none"/>
-              <w:right w:val="none"/>
+              <w:top w:val="single" w:color="FFFFFF" w:sz="0"/>
+              <w:left w:val="single" w:color="FFFFFF" w:sz="0"/>
+              <w:bottom w:val="single" w:color="FFFFFF" w:sz="0"/>
+              <w:right w:val="single" w:color="FFFFFF" w:sz="0"/>
             </w:tcBorders>
             <w:tcMar>
-              <w:right w:type="dxa" w:w="200"/>
+              <w:right w:type="dxa" w:w="220"/>
             </w:tcMar>
           </w:tcPr>
           <w:p>
             <w:pPr>
-              <w:spacing w:after="100" w:before="120"/>
+              <w:spacing w:after="100" w:before="80"/>
             </w:pPr>
             <w:r>
               <w:rPr>
@@ -2888,8 +2899,8 @@
                 <w:b/>
                 <w:bCs/>
                 <w:color w:val="001141"/>
-                <w:sz w:val="24"/>
-                <w:szCs w:val="24"/>
+                <w:sz w:val="26"/>
+                <w:szCs w:val="26"/>
               </w:rPr>
               <w:t xml:space="preserve">The Digital Front Door Vision</w:t>
             </w:r>
@@ -2906,7 +2917,7 @@
                 <w:sz w:val="20"/>
                 <w:szCs w:val="20"/>
               </w:rPr>
-              <w:t xml:space="preserve">The Digital Front Door (DFD) programme is the centrepiece of Horizon's member experience transformation. IBM's role is to design, build, and operate a unified digital engagement layer that replaces fragmented channel experiences with a seamless, AI-enhanced member journey — from plan discovery through to claims and care navigation.</w:t>
+              <w:t xml:space="preserve">The Digital Front Door (DFD) program is the centrepiece of Horizon's member experience transformation. IBM's role is to design, build, and operate a unified digital engagement layer that replaces fragmented channel experiences with a seamless, AI-enhanced member journey — from plan discovery through to claims and care navigation.</w:t>
             </w:r>
           </w:p>
           <w:p>
@@ -2964,18 +2975,18 @@
           <w:tcPr>
             <w:tcW w:type="dxa" w:w="4320"/>
             <w:tcBorders>
-              <w:top w:val="none"/>
-              <w:left w:val="none"/>
-              <w:bottom w:val="none"/>
-              <w:right w:val="none"/>
+              <w:top w:val="single" w:color="FFFFFF" w:sz="0"/>
+              <w:left w:val="single" w:color="FFFFFF" w:sz="0"/>
+              <w:bottom w:val="single" w:color="FFFFFF" w:sz="0"/>
+              <w:right w:val="single" w:color="FFFFFF" w:sz="0"/>
             </w:tcBorders>
             <w:tcMar>
-              <w:left w:type="dxa" w:w="200"/>
+              <w:left w:type="dxa" w:w="220"/>
             </w:tcMar>
           </w:tcPr>
           <w:p>
             <w:pPr>
-              <w:spacing w:after="100" w:before="120"/>
+              <w:spacing w:after="100" w:before="80"/>
             </w:pPr>
             <w:r>
               <w:rPr>
@@ -2983,8 +2994,8 @@
                 <w:b/>
                 <w:bCs/>
                 <w:color w:val="001141"/>
-                <w:sz w:val="24"/>
-                <w:szCs w:val="24"/>
+                <w:sz w:val="26"/>
+                <w:szCs w:val="26"/>
               </w:rPr>
               <w:t xml:space="preserve">DFD Programme Roadmap</w:t>
             </w:r>
@@ -3042,7 +3053,7 @@
               </w:tc>
               <w:tc>
                 <w:tcPr>
-                  <w:tcW w:type="dxa" w:w="3200"/>
+                  <w:tcW w:type="dxa" w:w="3500"/>
                   <w:shd w:fill="001141" w:val="clear"/>
                   <w:tcMar>
                     <w:top w:type="dxa" w:w="60"/>
@@ -3065,7 +3076,7 @@
                       <w:sz w:val="19"/>
                       <w:szCs w:val="19"/>
                     </w:rPr>
-                    <w:t xml:space="preserve">Focus</w:t>
+                    <w:t xml:space="preserve">Focus Area</w:t>
                   </w:r>
                 </w:p>
               </w:tc>
@@ -3131,7 +3142,7 @@
               </w:tc>
               <w:tc>
                 <w:tcPr>
-                  <w:tcW w:type="dxa" w:w="3200"/>
+                  <w:tcW w:type="dxa" w:w="3500"/>
                   <w:shd w:fill="FFFFFF" w:val="clear"/>
                   <w:tcMar>
                     <w:top w:type="dxa" w:w="50"/>
@@ -3179,7 +3190,7 @@
                       <w:sz w:val="19"/>
                       <w:szCs w:val="19"/>
                     </w:rPr>
-                    <w:t xml:space="preserve">✓ Complete</w:t>
+                    <w:t xml:space="preserve">Complete</w:t>
                   </w:r>
                 </w:p>
               </w:tc>
@@ -3188,7 +3199,7 @@
               <w:tc>
                 <w:tcPr>
                   <w:tcW w:type="dxa" w:w="1200"/>
-                  <w:shd w:fill="F0F4FF" w:val="clear"/>
+                  <w:shd w:fill="EEF4FF" w:val="clear"/>
                   <w:tcMar>
                     <w:top w:type="dxa" w:w="50"/>
                     <w:left w:type="dxa" w:w="80"/>
@@ -3216,8 +3227,8 @@
               </w:tc>
               <w:tc>
                 <w:tcPr>
-                  <w:tcW w:type="dxa" w:w="3200"/>
-                  <w:shd w:fill="F0F4FF" w:val="clear"/>
+                  <w:tcW w:type="dxa" w:w="3500"/>
+                  <w:shd w:fill="EEF4FF" w:val="clear"/>
                   <w:tcMar>
                     <w:top w:type="dxa" w:w="50"/>
                     <w:left w:type="dxa" w:w="80"/>
@@ -3244,7 +3255,7 @@
               <w:tc>
                 <w:tcPr>
                   <w:tcW w:type="dxa" w:w="1800"/>
-                  <w:shd w:fill="F0F4FF" w:val="clear"/>
+                  <w:shd w:fill="EEF4FF" w:val="clear"/>
                   <w:tcMar>
                     <w:top w:type="dxa" w:w="50"/>
                     <w:left w:type="dxa" w:w="80"/>
@@ -3301,7 +3312,7 @@
               </w:tc>
               <w:tc>
                 <w:tcPr>
-                  <w:tcW w:type="dxa" w:w="3200"/>
+                  <w:tcW w:type="dxa" w:w="3500"/>
                   <w:shd w:fill="FFFFFF" w:val="clear"/>
                   <w:tcMar>
                     <w:top w:type="dxa" w:w="50"/>
@@ -3322,7 +3333,7 @@
                       <w:sz w:val="19"/>
                       <w:szCs w:val="19"/>
                     </w:rPr>
-                    <w:t xml:space="preserve">Quote to Cart &amp; Payments</w:t>
+                    <w:t xml:space="preserve">Quote to Cart &amp; Payment Rails</w:t>
                   </w:r>
                 </w:p>
               </w:tc>
@@ -3358,7 +3369,7 @@
               <w:tc>
                 <w:tcPr>
                   <w:tcW w:type="dxa" w:w="1200"/>
-                  <w:shd w:fill="F0F4FF" w:val="clear"/>
+                  <w:shd w:fill="EEF4FF" w:val="clear"/>
                   <w:tcMar>
                     <w:top w:type="dxa" w:w="50"/>
                     <w:left w:type="dxa" w:w="80"/>
@@ -3386,8 +3397,8 @@
               </w:tc>
               <w:tc>
                 <w:tcPr>
-                  <w:tcW w:type="dxa" w:w="3200"/>
-                  <w:shd w:fill="F0F4FF" w:val="clear"/>
+                  <w:tcW w:type="dxa" w:w="3500"/>
+                  <w:shd w:fill="EEF4FF" w:val="clear"/>
                   <w:tcMar>
                     <w:top w:type="dxa" w:w="50"/>
                     <w:left w:type="dxa" w:w="80"/>
@@ -3414,7 +3425,7 @@
               <w:tc>
                 <w:tcPr>
                   <w:tcW w:type="dxa" w:w="1800"/>
-                  <w:shd w:fill="F0F4FF" w:val="clear"/>
+                  <w:shd w:fill="EEF4FF" w:val="clear"/>
                   <w:tcMar>
                     <w:top w:type="dxa" w:w="50"/>
                     <w:left w:type="dxa" w:w="80"/>
@@ -3471,7 +3482,7 @@
               </w:tc>
               <w:tc>
                 <w:tcPr>
-                  <w:tcW w:type="dxa" w:w="3200"/>
+                  <w:tcW w:type="dxa" w:w="3500"/>
                   <w:shd w:fill="FFFFFF" w:val="clear"/>
                   <w:tcMar>
                     <w:top w:type="dxa" w:w="50"/>
@@ -3540,10 +3551,10 @@
             <w:tblPr>
               <w:tblW w:type="dxa" w:w="9072"/>
               <w:tblBorders>
-                <w:top w:val="none"/>
-                <w:left w:val="none"/>
-                <w:bottom w:val="none"/>
-                <w:right w:val="none"/>
+                <w:top w:val="single" w:color="FFFFFF" w:sz="0"/>
+                <w:left w:val="single" w:color="FFFFFF" w:sz="0"/>
+                <w:bottom w:val="single" w:color="FFFFFF" w:sz="0"/>
+                <w:right w:val="single" w:color="FFFFFF" w:sz="0"/>
                 <w:insideH w:val="single" w:color="auto" w:sz="4"/>
                 <w:insideV w:val="single" w:color="auto" w:sz="4"/>
               </w:tblBorders>
@@ -3556,10 +3567,10 @@
               <w:tc>
                 <w:tcPr>
                   <w:tcBorders>
-                    <w:top w:val="none"/>
-                    <w:left w:val="single" w:color="198038" w:sz="24" w:space="4"/>
-                    <w:bottom w:val="none"/>
-                    <w:right w:val="none"/>
+                    <w:top w:val="single" w:color="FFFFFF" w:sz="0"/>
+                    <w:left w:val="single" w:color="198038" w:sz="28"/>
+                    <w:bottom w:val="single" w:color="FFFFFF" w:sz="0"/>
+                    <w:right w:val="single" w:color="FFFFFF" w:sz="0"/>
                   </w:tcBorders>
                   <w:shd w:fill="DEFBE6" w:val="clear"/>
                   <w:tcMar>
@@ -3572,7 +3583,7 @@
                 <w:p>
                   <w:pPr>
                     <w:spacing w:after="80" w:before="80"/>
-                    <w:jc w:val="center"/>
+                    <w:jc w:val="both"/>
                   </w:pPr>
                   <w:r>
                     <w:rPr>
@@ -3592,7 +3603,7 @@
                       <w:sz w:val="21"/>
                       <w:szCs w:val="21"/>
                     </w:rPr>
-                    <w:t xml:space="preserve"> reduces the plan purchase cycle from </w:t>
+                    <w:t xml:space="preserve"> compresses the plan purchase cycle from </w:t>
                   </w:r>
                   <w:r>
                     <w:rPr>
@@ -3646,17 +3657,17 @@
           <w:sz w:val="21"/>
           <w:szCs w:val="21"/>
         </w:rPr>
-        <w:t xml:space="preserve">Digital Channel Shift — Target State (% of Member Transactions)</w:t>
+        <w:t xml:space="preserve">Figure 3: Target Digital Self-Service Adoption Rates by Member Transaction Type</w:t>
       </w:r>
     </w:p>
     <w:tbl>
       <w:tblPr>
         <w:tblW w:type="dxa" w:w="9072"/>
         <w:tblBorders>
-          <w:top w:val="none"/>
-          <w:left w:val="none"/>
-          <w:bottom w:val="none"/>
-          <w:right w:val="none"/>
+          <w:top w:val="single" w:color="FFFFFF" w:sz="0"/>
+          <w:left w:val="single" w:color="FFFFFF" w:sz="0"/>
+          <w:bottom w:val="single" w:color="FFFFFF" w:sz="0"/>
+          <w:right w:val="single" w:color="FFFFFF" w:sz="0"/>
           <w:insideH w:val="single" w:color="auto" w:sz="4"/>
           <w:insideV w:val="single" w:color="auto" w:sz="4"/>
         </w:tblBorders>
@@ -3671,12 +3682,12 @@
       <w:tr>
         <w:tc>
           <w:tcPr>
-            <w:tcW w:type="dxa" w:w="2400"/>
-            <w:tcBorders>
-              <w:top w:val="none"/>
-              <w:left w:val="none"/>
-              <w:bottom w:val="none"/>
-              <w:right w:val="none"/>
+            <w:tcW w:type="dxa" w:w="2600"/>
+            <w:tcBorders>
+              <w:top w:val="single" w:color="FFFFFF" w:sz="0"/>
+              <w:left w:val="single" w:color="FFFFFF" w:sz="0"/>
+              <w:bottom w:val="single" w:color="FFFFFF" w:sz="0"/>
+              <w:right w:val="single" w:color="FFFFFF" w:sz="0"/>
             </w:tcBorders>
             <w:tcMar>
               <w:right w:type="dxa" w:w="80"/>
@@ -3700,12 +3711,12 @@
         </w:tc>
         <w:tc>
           <w:tcPr>
-            <w:tcW w:type="dxa" w:w="4832"/>
-            <w:tcBorders>
-              <w:top w:val="none"/>
-              <w:left w:val="none"/>
-              <w:bottom w:val="none"/>
-              <w:right w:val="none"/>
+            <w:tcW w:type="dxa" w:w="4653"/>
+            <w:tcBorders>
+              <w:top w:val="single" w:color="FFFFFF" w:sz="0"/>
+              <w:left w:val="single" w:color="FFFFFF" w:sz="0"/>
+              <w:bottom w:val="single" w:color="FFFFFF" w:sz="0"/>
+              <w:right w:val="single" w:color="FFFFFF" w:sz="0"/>
             </w:tcBorders>
             <w:shd w:fill="0F62FE" w:val="clear"/>
           </w:tcPr>
@@ -3717,12 +3728,12 @@
         </w:tc>
         <w:tc>
           <w:tcPr>
-            <w:tcW w:type="dxa" w:w="568"/>
-            <w:tcBorders>
-              <w:top w:val="none"/>
-              <w:left w:val="none"/>
-              <w:bottom w:val="none"/>
-              <w:right w:val="none"/>
+            <w:tcW w:type="dxa" w:w="547"/>
+            <w:tcBorders>
+              <w:top w:val="single" w:color="FFFFFF" w:sz="0"/>
+              <w:left w:val="single" w:color="FFFFFF" w:sz="0"/>
+              <w:bottom w:val="single" w:color="FFFFFF" w:sz="0"/>
+              <w:right w:val="single" w:color="FFFFFF" w:sz="0"/>
             </w:tcBorders>
             <w:shd w:fill="E8E8E8" w:val="clear"/>
           </w:tcPr>
@@ -3736,10 +3747,10 @@
           <w:tcPr>
             <w:tcW w:type="dxa" w:w="1200"/>
             <w:tcBorders>
-              <w:top w:val="none"/>
-              <w:left w:val="none"/>
-              <w:bottom w:val="none"/>
-              <w:right w:val="none"/>
+              <w:top w:val="single" w:color="FFFFFF" w:sz="0"/>
+              <w:left w:val="single" w:color="FFFFFF" w:sz="0"/>
+              <w:bottom w:val="single" w:color="FFFFFF" w:sz="0"/>
+              <w:right w:val="single" w:color="FFFFFF" w:sz="0"/>
             </w:tcBorders>
             <w:tcMar>
               <w:left w:type="dxa" w:w="80"/>
@@ -3768,12 +3779,12 @@
       <w:tr>
         <w:tc>
           <w:tcPr>
-            <w:tcW w:type="dxa" w:w="2400"/>
-            <w:tcBorders>
-              <w:top w:val="none"/>
-              <w:left w:val="none"/>
-              <w:bottom w:val="none"/>
-              <w:right w:val="none"/>
+            <w:tcW w:type="dxa" w:w="2600"/>
+            <w:tcBorders>
+              <w:top w:val="single" w:color="FFFFFF" w:sz="0"/>
+              <w:left w:val="single" w:color="FFFFFF" w:sz="0"/>
+              <w:bottom w:val="single" w:color="FFFFFF" w:sz="0"/>
+              <w:right w:val="single" w:color="FFFFFF" w:sz="0"/>
             </w:tcBorders>
             <w:tcMar>
               <w:right w:type="dxa" w:w="80"/>
@@ -3797,12 +3808,12 @@
         </w:tc>
         <w:tc>
           <w:tcPr>
-            <w:tcW w:type="dxa" w:w="4434"/>
-            <w:tcBorders>
-              <w:top w:val="none"/>
-              <w:left w:val="none"/>
-              <w:bottom w:val="none"/>
-              <w:right w:val="none"/>
+            <w:tcW w:type="dxa" w:w="4269"/>
+            <w:tcBorders>
+              <w:top w:val="single" w:color="FFFFFF" w:sz="0"/>
+              <w:left w:val="single" w:color="FFFFFF" w:sz="0"/>
+              <w:bottom w:val="single" w:color="FFFFFF" w:sz="0"/>
+              <w:right w:val="single" w:color="FFFFFF" w:sz="0"/>
             </w:tcBorders>
             <w:shd w:fill="009D9A" w:val="clear"/>
           </w:tcPr>
@@ -3814,12 +3825,12 @@
         </w:tc>
         <w:tc>
           <w:tcPr>
-            <w:tcW w:type="dxa" w:w="966"/>
-            <w:tcBorders>
-              <w:top w:val="none"/>
-              <w:left w:val="none"/>
-              <w:bottom w:val="none"/>
-              <w:right w:val="none"/>
+            <w:tcW w:type="dxa" w:w="931"/>
+            <w:tcBorders>
+              <w:top w:val="single" w:color="FFFFFF" w:sz="0"/>
+              <w:left w:val="single" w:color="FFFFFF" w:sz="0"/>
+              <w:bottom w:val="single" w:color="FFFFFF" w:sz="0"/>
+              <w:right w:val="single" w:color="FFFFFF" w:sz="0"/>
             </w:tcBorders>
             <w:shd w:fill="E8E8E8" w:val="clear"/>
           </w:tcPr>
@@ -3833,10 +3844,10 @@
           <w:tcPr>
             <w:tcW w:type="dxa" w:w="1200"/>
             <w:tcBorders>
-              <w:top w:val="none"/>
-              <w:left w:val="none"/>
-              <w:bottom w:val="none"/>
-              <w:right w:val="none"/>
+              <w:top w:val="single" w:color="FFFFFF" w:sz="0"/>
+              <w:left w:val="single" w:color="FFFFFF" w:sz="0"/>
+              <w:bottom w:val="single" w:color="FFFFFF" w:sz="0"/>
+              <w:right w:val="single" w:color="FFFFFF" w:sz="0"/>
             </w:tcBorders>
             <w:tcMar>
               <w:left w:type="dxa" w:w="80"/>
@@ -3865,12 +3876,12 @@
       <w:tr>
         <w:tc>
           <w:tcPr>
-            <w:tcW w:type="dxa" w:w="2400"/>
-            <w:tcBorders>
-              <w:top w:val="none"/>
-              <w:left w:val="none"/>
-              <w:bottom w:val="none"/>
-              <w:right w:val="none"/>
+            <w:tcW w:type="dxa" w:w="2600"/>
+            <w:tcBorders>
+              <w:top w:val="single" w:color="FFFFFF" w:sz="0"/>
+              <w:left w:val="single" w:color="FFFFFF" w:sz="0"/>
+              <w:bottom w:val="single" w:color="FFFFFF" w:sz="0"/>
+              <w:right w:val="single" w:color="FFFFFF" w:sz="0"/>
             </w:tcBorders>
             <w:tcMar>
               <w:right w:type="dxa" w:w="80"/>
@@ -3894,12 +3905,12 @@
         </w:tc>
         <w:tc>
           <w:tcPr>
-            <w:tcW w:type="dxa" w:w="5400"/>
-            <w:tcBorders>
-              <w:top w:val="none"/>
-              <w:left w:val="none"/>
-              <w:bottom w:val="none"/>
-              <w:right w:val="none"/>
+            <w:tcW w:type="dxa" w:w="5200"/>
+            <w:tcBorders>
+              <w:top w:val="single" w:color="FFFFFF" w:sz="0"/>
+              <w:left w:val="single" w:color="FFFFFF" w:sz="0"/>
+              <w:bottom w:val="single" w:color="FFFFFF" w:sz="0"/>
+              <w:right w:val="single" w:color="FFFFFF" w:sz="0"/>
             </w:tcBorders>
             <w:shd w:fill="198038" w:val="clear"/>
           </w:tcPr>
@@ -3913,10 +3924,10 @@
           <w:tcPr>
             <w:tcW w:type="dxa" w:w="1200"/>
             <w:tcBorders>
-              <w:top w:val="none"/>
-              <w:left w:val="none"/>
-              <w:bottom w:val="none"/>
-              <w:right w:val="none"/>
+              <w:top w:val="single" w:color="FFFFFF" w:sz="0"/>
+              <w:left w:val="single" w:color="FFFFFF" w:sz="0"/>
+              <w:bottom w:val="single" w:color="FFFFFF" w:sz="0"/>
+              <w:right w:val="single" w:color="FFFFFF" w:sz="0"/>
             </w:tcBorders>
             <w:tcMar>
               <w:left w:type="dxa" w:w="80"/>
@@ -3945,12 +3956,12 @@
       <w:tr>
         <w:tc>
           <w:tcPr>
-            <w:tcW w:type="dxa" w:w="2400"/>
-            <w:tcBorders>
-              <w:top w:val="none"/>
-              <w:left w:val="none"/>
-              <w:bottom w:val="none"/>
-              <w:right w:val="none"/>
+            <w:tcW w:type="dxa" w:w="2600"/>
+            <w:tcBorders>
+              <w:top w:val="single" w:color="FFFFFF" w:sz="0"/>
+              <w:left w:val="single" w:color="FFFFFF" w:sz="0"/>
+              <w:bottom w:val="single" w:color="FFFFFF" w:sz="0"/>
+              <w:right w:val="single" w:color="FFFFFF" w:sz="0"/>
             </w:tcBorders>
             <w:tcMar>
               <w:right w:type="dxa" w:w="80"/>
@@ -3974,12 +3985,12 @@
         </w:tc>
         <w:tc>
           <w:tcPr>
-            <w:tcW w:type="dxa" w:w="5116"/>
-            <w:tcBorders>
-              <w:top w:val="none"/>
-              <w:left w:val="none"/>
-              <w:bottom w:val="none"/>
-              <w:right w:val="none"/>
+            <w:tcW w:type="dxa" w:w="4926"/>
+            <w:tcBorders>
+              <w:top w:val="single" w:color="FFFFFF" w:sz="0"/>
+              <w:left w:val="single" w:color="FFFFFF" w:sz="0"/>
+              <w:bottom w:val="single" w:color="FFFFFF" w:sz="0"/>
+              <w:right w:val="single" w:color="FFFFFF" w:sz="0"/>
             </w:tcBorders>
             <w:shd w:fill="0F62FE" w:val="clear"/>
           </w:tcPr>
@@ -3991,12 +4002,12 @@
         </w:tc>
         <w:tc>
           <w:tcPr>
-            <w:tcW w:type="dxa" w:w="284"/>
-            <w:tcBorders>
-              <w:top w:val="none"/>
-              <w:left w:val="none"/>
-              <w:bottom w:val="none"/>
-              <w:right w:val="none"/>
+            <w:tcW w:type="dxa" w:w="274"/>
+            <w:tcBorders>
+              <w:top w:val="single" w:color="FFFFFF" w:sz="0"/>
+              <w:left w:val="single" w:color="FFFFFF" w:sz="0"/>
+              <w:bottom w:val="single" w:color="FFFFFF" w:sz="0"/>
+              <w:right w:val="single" w:color="FFFFFF" w:sz="0"/>
             </w:tcBorders>
             <w:shd w:fill="E8E8E8" w:val="clear"/>
           </w:tcPr>
@@ -4010,10 +4021,10 @@
           <w:tcPr>
             <w:tcW w:type="dxa" w:w="1200"/>
             <w:tcBorders>
-              <w:top w:val="none"/>
-              <w:left w:val="none"/>
-              <w:bottom w:val="none"/>
-              <w:right w:val="none"/>
+              <w:top w:val="single" w:color="FFFFFF" w:sz="0"/>
+              <w:left w:val="single" w:color="FFFFFF" w:sz="0"/>
+              <w:bottom w:val="single" w:color="FFFFFF" w:sz="0"/>
+              <w:right w:val="single" w:color="FFFFFF" w:sz="0"/>
             </w:tcBorders>
             <w:tcMar>
               <w:left w:type="dxa" w:w="80"/>
@@ -4042,12 +4053,12 @@
       <w:tr>
         <w:tc>
           <w:tcPr>
-            <w:tcW w:type="dxa" w:w="2400"/>
-            <w:tcBorders>
-              <w:top w:val="none"/>
-              <w:left w:val="none"/>
-              <w:bottom w:val="none"/>
-              <w:right w:val="none"/>
+            <w:tcW w:type="dxa" w:w="2600"/>
+            <w:tcBorders>
+              <w:top w:val="single" w:color="FFFFFF" w:sz="0"/>
+              <w:left w:val="single" w:color="FFFFFF" w:sz="0"/>
+              <w:bottom w:val="single" w:color="FFFFFF" w:sz="0"/>
+              <w:right w:val="single" w:color="FFFFFF" w:sz="0"/>
             </w:tcBorders>
             <w:tcMar>
               <w:right w:type="dxa" w:w="80"/>
@@ -4071,12 +4082,12 @@
         </w:tc>
         <w:tc>
           <w:tcPr>
-            <w:tcW w:type="dxa" w:w="4661"/>
-            <w:tcBorders>
-              <w:top w:val="none"/>
-              <w:left w:val="none"/>
-              <w:bottom w:val="none"/>
-              <w:right w:val="none"/>
+            <w:tcW w:type="dxa" w:w="4488"/>
+            <w:tcBorders>
+              <w:top w:val="single" w:color="FFFFFF" w:sz="0"/>
+              <w:left w:val="single" w:color="FFFFFF" w:sz="0"/>
+              <w:bottom w:val="single" w:color="FFFFFF" w:sz="0"/>
+              <w:right w:val="single" w:color="FFFFFF" w:sz="0"/>
             </w:tcBorders>
             <w:shd w:fill="009D9A" w:val="clear"/>
           </w:tcPr>
@@ -4088,12 +4099,12 @@
         </w:tc>
         <w:tc>
           <w:tcPr>
-            <w:tcW w:type="dxa" w:w="739"/>
-            <w:tcBorders>
-              <w:top w:val="none"/>
-              <w:left w:val="none"/>
-              <w:bottom w:val="none"/>
-              <w:right w:val="none"/>
+            <w:tcW w:type="dxa" w:w="712"/>
+            <w:tcBorders>
+              <w:top w:val="single" w:color="FFFFFF" w:sz="0"/>
+              <w:left w:val="single" w:color="FFFFFF" w:sz="0"/>
+              <w:bottom w:val="single" w:color="FFFFFF" w:sz="0"/>
+              <w:right w:val="single" w:color="FFFFFF" w:sz="0"/>
             </w:tcBorders>
             <w:shd w:fill="E8E8E8" w:val="clear"/>
           </w:tcPr>
@@ -4107,10 +4118,10 @@
           <w:tcPr>
             <w:tcW w:type="dxa" w:w="1200"/>
             <w:tcBorders>
-              <w:top w:val="none"/>
-              <w:left w:val="none"/>
-              <w:bottom w:val="none"/>
-              <w:right w:val="none"/>
+              <w:top w:val="single" w:color="FFFFFF" w:sz="0"/>
+              <w:left w:val="single" w:color="FFFFFF" w:sz="0"/>
+              <w:bottom w:val="single" w:color="FFFFFF" w:sz="0"/>
+              <w:right w:val="single" w:color="FFFFFF" w:sz="0"/>
             </w:tcBorders>
             <w:tcMar>
               <w:left w:type="dxa" w:w="80"/>
@@ -4139,12 +4150,12 @@
       <w:tr>
         <w:tc>
           <w:tcPr>
-            <w:tcW w:type="dxa" w:w="2400"/>
-            <w:tcBorders>
-              <w:top w:val="none"/>
-              <w:left w:val="none"/>
-              <w:bottom w:val="none"/>
-              <w:right w:val="none"/>
+            <w:tcW w:type="dxa" w:w="2600"/>
+            <w:tcBorders>
+              <w:top w:val="single" w:color="FFFFFF" w:sz="0"/>
+              <w:left w:val="single" w:color="FFFFFF" w:sz="0"/>
+              <w:bottom w:val="single" w:color="FFFFFF" w:sz="0"/>
+              <w:right w:val="single" w:color="FFFFFF" w:sz="0"/>
             </w:tcBorders>
             <w:tcMar>
               <w:right w:type="dxa" w:w="80"/>
@@ -4168,12 +4179,12 @@
         </w:tc>
         <w:tc>
           <w:tcPr>
-            <w:tcW w:type="dxa" w:w="4263"/>
-            <w:tcBorders>
-              <w:top w:val="none"/>
-              <w:left w:val="none"/>
-              <w:bottom w:val="none"/>
-              <w:right w:val="none"/>
+            <w:tcW w:type="dxa" w:w="4105"/>
+            <w:tcBorders>
+              <w:top w:val="single" w:color="FFFFFF" w:sz="0"/>
+              <w:left w:val="single" w:color="FFFFFF" w:sz="0"/>
+              <w:bottom w:val="single" w:color="FFFFFF" w:sz="0"/>
+              <w:right w:val="single" w:color="FFFFFF" w:sz="0"/>
             </w:tcBorders>
             <w:shd w:fill="001141" w:val="clear"/>
           </w:tcPr>
@@ -4185,12 +4196,12 @@
         </w:tc>
         <w:tc>
           <w:tcPr>
-            <w:tcW w:type="dxa" w:w="1137"/>
-            <w:tcBorders>
-              <w:top w:val="none"/>
-              <w:left w:val="none"/>
-              <w:bottom w:val="none"/>
-              <w:right w:val="none"/>
+            <w:tcW w:type="dxa" w:w="1095"/>
+            <w:tcBorders>
+              <w:top w:val="single" w:color="FFFFFF" w:sz="0"/>
+              <w:left w:val="single" w:color="FFFFFF" w:sz="0"/>
+              <w:bottom w:val="single" w:color="FFFFFF" w:sz="0"/>
+              <w:right w:val="single" w:color="FFFFFF" w:sz="0"/>
             </w:tcBorders>
             <w:shd w:fill="E8E8E8" w:val="clear"/>
           </w:tcPr>
@@ -4204,10 +4215,10 @@
           <w:tcPr>
             <w:tcW w:type="dxa" w:w="1200"/>
             <w:tcBorders>
-              <w:top w:val="none"/>
-              <w:left w:val="none"/>
-              <w:bottom w:val="none"/>
-              <w:right w:val="none"/>
+              <w:top w:val="single" w:color="FFFFFF" w:sz="0"/>
+              <w:left w:val="single" w:color="FFFFFF" w:sz="0"/>
+              <w:bottom w:val="single" w:color="FFFFFF" w:sz="0"/>
+              <w:right w:val="single" w:color="FFFFFF" w:sz="0"/>
             </w:tcBorders>
             <w:tcMar>
               <w:left w:type="dxa" w:w="80"/>
@@ -4236,18 +4247,7 @@
     </w:tbl>
     <w:p>
       <w:pPr>
-        <w:spacing w:after="40"/>
-      </w:pPr>
-      <w:r>
-        <w:rPr>
-          <w:rFonts w:ascii="Calibri" w:cs="Calibri" w:eastAsia="Calibri" w:hAnsi="Calibri"/>
-        </w:rPr>
-        <w:t xml:space="preserve"/>
-      </w:r>
-    </w:p>
-    <w:p>
-      <w:pPr>
-        <w:spacing w:after="200"/>
+        <w:spacing w:after="160" w:before="80"/>
         <w:jc w:val="center"/>
       </w:pPr>
       <w:r>
@@ -4259,7 +4259,7 @@
           <w:sz w:val="16"/>
           <w:szCs w:val="16"/>
         </w:rPr>
-        <w:t xml:space="preserve">Figure 3: Target digital self-service adoption rates across key member transaction types following DFD programme completion.</w:t>
+        <w:t xml:space="preserve">Target digital self-service adoption rates across key member transaction types following DFD programme completion.</w:t>
       </w:r>
     </w:p>
     <w:p>
@@ -4270,9 +4270,9 @@
     <w:p>
       <w:pPr>
         <w:pBdr>
-          <w:bottom w:val="single" w:color="0F62FE" w:sz="8" w:space="6"/>
+          <w:bottom w:val="single" w:color="0F62FE" w:sz="4" w:space="4"/>
         </w:pBdr>
-        <w:spacing w:after="80" w:before="300"/>
+        <w:spacing w:after="80" w:before="240"/>
       </w:pPr>
       <w:r>
         <w:rPr>
@@ -4306,10 +4306,10 @@
       <w:tblPr>
         <w:tblW w:type="dxa" w:w="9072"/>
         <w:tblBorders>
-          <w:top w:val="none"/>
-          <w:left w:val="none"/>
-          <w:bottom w:val="none"/>
-          <w:right w:val="none"/>
+          <w:top w:val="single" w:color="FFFFFF" w:sz="0"/>
+          <w:left w:val="single" w:color="FFFFFF" w:sz="0"/>
+          <w:bottom w:val="single" w:color="FFFFFF" w:sz="0"/>
+          <w:right w:val="single" w:color="FFFFFF" w:sz="0"/>
           <w:insideH w:val="single" w:color="auto" w:sz="4"/>
           <w:insideV w:val="single" w:color="auto" w:sz="4"/>
         </w:tblBorders>
@@ -4322,10 +4322,10 @@
         <w:tc>
           <w:tcPr>
             <w:tcBorders>
-              <w:top w:val="none"/>
-              <w:left w:val="single" w:color="0F62FE" w:sz="24" w:space="4"/>
-              <w:bottom w:val="none"/>
-              <w:right w:val="none"/>
+              <w:top w:val="single" w:color="FFFFFF" w:sz="0"/>
+              <w:left w:val="single" w:color="0F62FE" w:sz="28"/>
+              <w:bottom w:val="single" w:color="FFFFFF" w:sz="0"/>
+              <w:right w:val="single" w:color="FFFFFF" w:sz="0"/>
             </w:tcBorders>
             <w:shd w:fill="D0E2FF" w:val="clear"/>
             <w:tcMar>
@@ -4338,7 +4338,7 @@
           <w:p>
             <w:pPr>
               <w:spacing w:after="80" w:before="80"/>
-              <w:jc w:val="center"/>
+              <w:jc w:val="both"/>
             </w:pPr>
             <w:r>
               <w:rPr>
@@ -4399,10 +4399,10 @@
       <w:tblPr>
         <w:tblW w:type="dxa" w:w="9072"/>
         <w:tblBorders>
-          <w:top w:val="none"/>
-          <w:left w:val="none"/>
-          <w:bottom w:val="none"/>
-          <w:right w:val="none"/>
+          <w:top w:val="single" w:color="FFFFFF" w:sz="0"/>
+          <w:left w:val="single" w:color="FFFFFF" w:sz="0"/>
+          <w:bottom w:val="single" w:color="FFFFFF" w:sz="0"/>
+          <w:right w:val="single" w:color="FFFFFF" w:sz="0"/>
           <w:insideH w:val="single" w:color="auto" w:sz="4"/>
           <w:insideV w:val="single" w:color="auto" w:sz="4"/>
         </w:tblBorders>
@@ -4417,18 +4417,18 @@
           <w:tcPr>
             <w:tcW w:type="dxa" w:w="4320"/>
             <w:tcBorders>
-              <w:top w:val="none"/>
-              <w:left w:val="none"/>
-              <w:bottom w:val="none"/>
-              <w:right w:val="none"/>
+              <w:top w:val="single" w:color="FFFFFF" w:sz="0"/>
+              <w:left w:val="single" w:color="FFFFFF" w:sz="0"/>
+              <w:bottom w:val="single" w:color="FFFFFF" w:sz="0"/>
+              <w:right w:val="single" w:color="FFFFFF" w:sz="0"/>
             </w:tcBorders>
             <w:tcMar>
-              <w:right w:type="dxa" w:w="200"/>
+              <w:right w:type="dxa" w:w="220"/>
             </w:tcMar>
           </w:tcPr>
           <w:p>
             <w:pPr>
-              <w:spacing w:after="100" w:before="120"/>
+              <w:spacing w:after="100" w:before="80"/>
             </w:pPr>
             <w:r>
               <w:rPr>
@@ -4436,8 +4436,8 @@
                 <w:b/>
                 <w:bCs/>
                 <w:color w:val="001141"/>
-                <w:sz w:val="24"/>
-                <w:szCs w:val="24"/>
+                <w:sz w:val="26"/>
+                <w:szCs w:val="26"/>
               </w:rPr>
               <w:t xml:space="preserve">The Agentic AI Architecture</w:t>
             </w:r>
@@ -4492,7 +4492,7 @@
                 <w:rFonts w:ascii="Calibri" w:cs="Calibri" w:eastAsia="Calibri" w:hAnsi="Calibri"/>
                 <w:b/>
                 <w:bCs/>
-                <w:color w:val="21272A"/>
+                <w:color w:val="0F62FE"/>
                 <w:sz w:val="20"/>
                 <w:szCs w:val="20"/>
               </w:rPr>
@@ -4523,7 +4523,7 @@
                 <w:rFonts w:ascii="Calibri" w:cs="Calibri" w:eastAsia="Calibri" w:hAnsi="Calibri"/>
                 <w:b/>
                 <w:bCs/>
-                <w:color w:val="21272A"/>
+                <w:color w:val="0F62FE"/>
                 <w:sz w:val="20"/>
                 <w:szCs w:val="20"/>
               </w:rPr>
@@ -4554,7 +4554,7 @@
                 <w:rFonts w:ascii="Calibri" w:cs="Calibri" w:eastAsia="Calibri" w:hAnsi="Calibri"/>
                 <w:b/>
                 <w:bCs/>
-                <w:color w:val="21272A"/>
+                <w:color w:val="0F62FE"/>
                 <w:sz w:val="20"/>
                 <w:szCs w:val="20"/>
               </w:rPr>
@@ -4585,7 +4585,7 @@
                 <w:rFonts w:ascii="Calibri" w:cs="Calibri" w:eastAsia="Calibri" w:hAnsi="Calibri"/>
                 <w:b/>
                 <w:bCs/>
-                <w:color w:val="21272A"/>
+                <w:color w:val="0F62FE"/>
                 <w:sz w:val="20"/>
                 <w:szCs w:val="20"/>
               </w:rPr>
@@ -4616,7 +4616,7 @@
                 <w:rFonts w:ascii="Calibri" w:cs="Calibri" w:eastAsia="Calibri" w:hAnsi="Calibri"/>
                 <w:b/>
                 <w:bCs/>
-                <w:color w:val="21272A"/>
+                <w:color w:val="0F62FE"/>
                 <w:sz w:val="20"/>
                 <w:szCs w:val="20"/>
               </w:rPr>
@@ -4647,7 +4647,7 @@
                 <w:rFonts w:ascii="Calibri" w:cs="Calibri" w:eastAsia="Calibri" w:hAnsi="Calibri"/>
                 <w:b/>
                 <w:bCs/>
-                <w:color w:val="21272A"/>
+                <w:color w:val="0F62FE"/>
                 <w:sz w:val="20"/>
                 <w:szCs w:val="20"/>
               </w:rPr>
@@ -4668,18 +4668,18 @@
           <w:tcPr>
             <w:tcW w:type="dxa" w:w="4320"/>
             <w:tcBorders>
-              <w:top w:val="none"/>
-              <w:left w:val="none"/>
-              <w:bottom w:val="none"/>
-              <w:right w:val="none"/>
+              <w:top w:val="single" w:color="FFFFFF" w:sz="0"/>
+              <w:left w:val="single" w:color="FFFFFF" w:sz="0"/>
+              <w:bottom w:val="single" w:color="FFFFFF" w:sz="0"/>
+              <w:right w:val="single" w:color="FFFFFF" w:sz="0"/>
             </w:tcBorders>
             <w:tcMar>
-              <w:left w:type="dxa" w:w="200"/>
+              <w:left w:type="dxa" w:w="220"/>
             </w:tcMar>
           </w:tcPr>
           <w:p>
             <w:pPr>
-              <w:spacing w:after="100" w:before="120"/>
+              <w:spacing w:after="100" w:before="80"/>
             </w:pPr>
             <w:r>
               <w:rPr>
@@ -4687,10 +4687,10 @@
                 <w:b/>
                 <w:bCs/>
                 <w:color w:val="001141"/>
-                <w:sz w:val="24"/>
-                <w:szCs w:val="24"/>
-              </w:rPr>
-              <w:t xml:space="preserve">Value Realisation</w:t>
+                <w:sz w:val="26"/>
+                <w:szCs w:val="26"/>
+              </w:rPr>
+              <w:t xml:space="preserve">Value Realization</w:t>
             </w:r>
           </w:p>
           <w:tbl>
@@ -4769,7 +4769,7 @@
                       <w:sz w:val="19"/>
                       <w:szCs w:val="19"/>
                     </w:rPr>
-                    <w:t xml:space="preserve">Before</w:t>
+                    <w:t xml:space="preserve">Baseline</w:t>
                   </w:r>
                 </w:p>
               </w:tc>
@@ -4798,7 +4798,7 @@
                       <w:sz w:val="19"/>
                       <w:szCs w:val="19"/>
                     </w:rPr>
-                    <w:t xml:space="preserve">With IBM AIOps</w:t>
+                    <w:t xml:space="preserve">With AIOps</w:t>
                   </w:r>
                 </w:p>
               </w:tc>
@@ -4892,7 +4892,7 @@
               <w:tc>
                 <w:tcPr>
                   <w:tcW w:type="dxa" w:w="2800"/>
-                  <w:shd w:fill="F0F4FF" w:val="clear"/>
+                  <w:shd w:fill="EEF4FF" w:val="clear"/>
                   <w:tcMar>
                     <w:top w:type="dxa" w:w="50"/>
                     <w:left w:type="dxa" w:w="80"/>
@@ -4921,7 +4921,7 @@
               <w:tc>
                 <w:tcPr>
                   <w:tcW w:type="dxa" w:w="1800"/>
-                  <w:shd w:fill="F0F4FF" w:val="clear"/>
+                  <w:shd w:fill="EEF4FF" w:val="clear"/>
                   <w:tcMar>
                     <w:top w:type="dxa" w:w="50"/>
                     <w:left w:type="dxa" w:w="80"/>
@@ -4948,7 +4948,7 @@
               <w:tc>
                 <w:tcPr>
                   <w:tcW w:type="dxa" w:w="2400"/>
-                  <w:shd w:fill="F0F4FF" w:val="clear"/>
+                  <w:shd w:fill="EEF4FF" w:val="clear"/>
                   <w:tcMar>
                     <w:top w:type="dxa" w:w="50"/>
                     <w:left w:type="dxa" w:w="80"/>
@@ -5062,7 +5062,7 @@
               <w:tc>
                 <w:tcPr>
                   <w:tcW w:type="dxa" w:w="2800"/>
-                  <w:shd w:fill="F0F4FF" w:val="clear"/>
+                  <w:shd w:fill="EEF4FF" w:val="clear"/>
                   <w:tcMar>
                     <w:top w:type="dxa" w:w="50"/>
                     <w:left w:type="dxa" w:w="80"/>
@@ -5091,7 +5091,7 @@
               <w:tc>
                 <w:tcPr>
                   <w:tcW w:type="dxa" w:w="1800"/>
-                  <w:shd w:fill="F0F4FF" w:val="clear"/>
+                  <w:shd w:fill="EEF4FF" w:val="clear"/>
                   <w:tcMar>
                     <w:top w:type="dxa" w:w="50"/>
                     <w:left w:type="dxa" w:w="80"/>
@@ -5118,7 +5118,7 @@
               <w:tc>
                 <w:tcPr>
                   <w:tcW w:type="dxa" w:w="2400"/>
-                  <w:shd w:fill="F0F4FF" w:val="clear"/>
+                  <w:shd w:fill="EEF4FF" w:val="clear"/>
                   <w:tcMar>
                     <w:top w:type="dxa" w:w="50"/>
                     <w:left w:type="dxa" w:w="80"/>
@@ -5232,7 +5232,7 @@
               <w:tc>
                 <w:tcPr>
                   <w:tcW w:type="dxa" w:w="2800"/>
-                  <w:shd w:fill="F0F4FF" w:val="clear"/>
+                  <w:shd w:fill="EEF4FF" w:val="clear"/>
                   <w:tcMar>
                     <w:top w:type="dxa" w:w="50"/>
                     <w:left w:type="dxa" w:w="80"/>
@@ -5254,14 +5254,14 @@
                       <w:sz w:val="19"/>
                       <w:szCs w:val="19"/>
                     </w:rPr>
-                    <w:t xml:space="preserve">Ops Team Manual Triage</w:t>
+                    <w:t xml:space="preserve">Ops Manual Triage Hours</w:t>
                   </w:r>
                 </w:p>
               </w:tc>
               <w:tc>
                 <w:tcPr>
                   <w:tcW w:type="dxa" w:w="1800"/>
-                  <w:shd w:fill="F0F4FF" w:val="clear"/>
+                  <w:shd w:fill="EEF4FF" w:val="clear"/>
                   <w:tcMar>
                     <w:top w:type="dxa" w:w="50"/>
                     <w:left w:type="dxa" w:w="80"/>
@@ -5288,7 +5288,7 @@
               <w:tc>
                 <w:tcPr>
                   <w:tcW w:type="dxa" w:w="2400"/>
-                  <w:shd w:fill="F0F4FF" w:val="clear"/>
+                  <w:shd w:fill="EEF4FF" w:val="clear"/>
                   <w:tcMar>
                     <w:top w:type="dxa" w:w="50"/>
                     <w:left w:type="dxa" w:w="80"/>
@@ -5328,7 +5328,7 @@
           <w:p>
             <w:pPr>
               <w:pBdr>
-                <w:left w:val="single" w:color="0F62FE" w:sz="20" w:space="8"/>
+                <w:left w:val="single" w:color="001141" w:sz="20" w:space="8"/>
               </w:pBdr>
               <w:spacing w:after="80" w:before="180"/>
               <w:ind w:left="120"/>
@@ -5338,7 +5338,7 @@
                 <w:rFonts w:ascii="Calibri" w:cs="Calibri" w:eastAsia="Calibri" w:hAnsi="Calibri"/>
                 <w:b/>
                 <w:bCs/>
-                <w:color w:val="0F62FE"/>
+                <w:color w:val="001141"/>
                 <w:sz w:val="22"/>
                 <w:szCs w:val="22"/>
               </w:rPr>
@@ -5402,7 +5402,7 @@
                 <w:sz w:val="20"/>
                 <w:szCs w:val="20"/>
               </w:rPr>
-              <w:t xml:space="preserve">Vector Store: AWS OpenSearch + Postgres</w:t>
+              <w:t xml:space="preserve">Vector Store: AWS OpenSearch + PostgreSQL</w:t>
             </w:r>
           </w:p>
           <w:p>
@@ -5445,6 +5445,134 @@
               <w:t xml:space="preserve">IBM ContextForge for institutional knowledge management</w:t>
             </w:r>
           </w:p>
+          <w:p>
+            <w:pPr>
+              <w:spacing w:after="40"/>
+            </w:pPr>
+            <w:r>
+              <w:rPr>
+                <w:rFonts w:ascii="Calibri" w:cs="Calibri" w:eastAsia="Calibri" w:hAnsi="Calibri"/>
+              </w:rPr>
+              <w:t xml:space="preserve"/>
+            </w:r>
+          </w:p>
+          <w:tbl>
+            <w:tblPr>
+              <w:tblW w:type="dxa" w:w="9072"/>
+              <w:tblBorders>
+                <w:top w:val="single" w:color="FFFFFF" w:sz="0"/>
+                <w:left w:val="single" w:color="FFFFFF" w:sz="0"/>
+                <w:bottom w:val="single" w:color="FFFFFF" w:sz="0"/>
+                <w:right w:val="single" w:color="FFFFFF" w:sz="0"/>
+                <w:insideH w:val="single" w:color="auto" w:sz="4"/>
+                <w:insideV w:val="single" w:color="auto" w:sz="4"/>
+              </w:tblBorders>
+              <w:tblLayout w:type="fixed"/>
+            </w:tblPr>
+            <w:tblGrid>
+              <w:gridCol w:w="100"/>
+              <w:gridCol w:w="100"/>
+            </w:tblGrid>
+            <w:tr>
+              <w:tc>
+                <w:tcPr>
+                  <w:tcW w:type="dxa" w:w="4536"/>
+                  <w:tcBorders>
+                    <w:top w:val="single" w:color="FFFFFF" w:sz="0"/>
+                    <w:left w:val="single" w:color="FFFFFF" w:sz="0"/>
+                    <w:bottom w:val="single" w:color="FFFFFF" w:sz="0"/>
+                    <w:right w:val="single" w:color="FFFFFF" w:sz="8"/>
+                  </w:tcBorders>
+                  <w:shd w:fill="DEFBE6" w:val="clear"/>
+                  <w:tcMar>
+                    <w:top w:type="dxa" w:w="120"/>
+                    <w:left w:type="dxa" w:w="80"/>
+                    <w:bottom w:type="dxa" w:w="120"/>
+                    <w:right w:type="dxa" w:w="80"/>
+                  </w:tcMar>
+                </w:tcPr>
+                <w:p>
+                  <w:pPr>
+                    <w:jc w:val="center"/>
+                  </w:pPr>
+                  <w:r>
+                    <w:rPr>
+                      <w:rFonts w:ascii="Calibri" w:cs="Calibri" w:eastAsia="Calibri" w:hAnsi="Calibri"/>
+                      <w:b/>
+                      <w:bCs/>
+                      <w:color w:val="198038"/>
+                      <w:sz w:val="22"/>
+                      <w:szCs w:val="22"/>
+                    </w:rPr>
+                    <w:t xml:space="preserve">✓  ARB Approval Secured</w:t>
+                  </w:r>
+                </w:p>
+                <w:p>
+                  <w:pPr>
+                    <w:jc w:val="center"/>
+                  </w:pPr>
+                  <w:r>
+                    <w:rPr>
+                      <w:rFonts w:ascii="Calibri" w:cs="Calibri" w:eastAsia="Calibri" w:hAnsi="Calibri"/>
+                      <w:color w:val="6F6F6F"/>
+                      <w:sz w:val="18"/>
+                      <w:szCs w:val="18"/>
+                    </w:rPr>
+                    <w:t xml:space="preserve">Architecture Review Board</w:t>
+                  </w:r>
+                </w:p>
+              </w:tc>
+              <w:tc>
+                <w:tcPr>
+                  <w:tcW w:type="dxa" w:w="4536"/>
+                  <w:tcBorders>
+                    <w:top w:val="single" w:color="FFFFFF" w:sz="0"/>
+                    <w:left w:val="single" w:color="FFFFFF" w:sz="0"/>
+                    <w:bottom w:val="single" w:color="FFFFFF" w:sz="0"/>
+                    <w:right w:val="single" w:color="FFFFFF" w:sz="8"/>
+                  </w:tcBorders>
+                  <w:shd w:fill="DEFBE6" w:val="clear"/>
+                  <w:tcMar>
+                    <w:top w:type="dxa" w:w="120"/>
+                    <w:left w:type="dxa" w:w="80"/>
+                    <w:bottom w:type="dxa" w:w="120"/>
+                    <w:right w:type="dxa" w:w="80"/>
+                  </w:tcMar>
+                </w:tcPr>
+                <w:p>
+                  <w:pPr>
+                    <w:jc w:val="center"/>
+                  </w:pPr>
+                  <w:r>
+                    <w:rPr>
+                      <w:rFonts w:ascii="Calibri" w:cs="Calibri" w:eastAsia="Calibri" w:hAnsi="Calibri"/>
+                      <w:b/>
+                      <w:bCs/>
+                      <w:color w:val="198038"/>
+                      <w:sz w:val="22"/>
+                      <w:szCs w:val="22"/>
+                    </w:rPr>
+                    <w:t xml:space="preserve">✓  GenAI Board Approved</w:t>
+                  </w:r>
+                </w:p>
+                <w:p>
+                  <w:pPr>
+                    <w:jc w:val="center"/>
+                  </w:pPr>
+                  <w:r>
+                    <w:rPr>
+                      <w:rFonts w:ascii="Calibri" w:cs="Calibri" w:eastAsia="Calibri" w:hAnsi="Calibri"/>
+                      <w:color w:val="6F6F6F"/>
+                      <w:sz w:val="18"/>
+                      <w:szCs w:val="18"/>
+                    </w:rPr>
+                    <w:t xml:space="preserve">Horizon GenAI Governance</w:t>
+                  </w:r>
+                </w:p>
+              </w:tc>
+            </w:tr>
+          </w:tbl>
+          <w:p/>
         </w:tc>
       </w:tr>
     </w:tbl>
@@ -5472,17 +5600,17 @@
           <w:sz w:val="21"/>
           <w:szCs w:val="21"/>
         </w:rPr>
-        <w:t xml:space="preserve">Incident Resolution Time Reduction by Category (Target vs. Baseline)</w:t>
+        <w:t xml:space="preserve">Figure 4: Incident Resolution Time Reduction by Severity Category (IBM AIOps vs. Baseline)</w:t>
       </w:r>
     </w:p>
     <w:tbl>
       <w:tblPr>
         <w:tblW w:type="dxa" w:w="9072"/>
         <w:tblBorders>
-          <w:top w:val="none"/>
-          <w:left w:val="none"/>
-          <w:bottom w:val="none"/>
-          <w:right w:val="none"/>
+          <w:top w:val="single" w:color="FFFFFF" w:sz="0"/>
+          <w:left w:val="single" w:color="FFFFFF" w:sz="0"/>
+          <w:bottom w:val="single" w:color="FFFFFF" w:sz="0"/>
+          <w:right w:val="single" w:color="FFFFFF" w:sz="0"/>
           <w:insideH w:val="single" w:color="auto" w:sz="4"/>
           <w:insideV w:val="single" w:color="auto" w:sz="4"/>
         </w:tblBorders>
@@ -5497,12 +5625,12 @@
       <w:tr>
         <w:tc>
           <w:tcPr>
-            <w:tcW w:type="dxa" w:w="2400"/>
-            <w:tcBorders>
-              <w:top w:val="none"/>
-              <w:left w:val="none"/>
-              <w:bottom w:val="none"/>
-              <w:right w:val="none"/>
+            <w:tcW w:type="dxa" w:w="2600"/>
+            <w:tcBorders>
+              <w:top w:val="single" w:color="FFFFFF" w:sz="0"/>
+              <w:left w:val="single" w:color="FFFFFF" w:sz="0"/>
+              <w:bottom w:val="single" w:color="FFFFFF" w:sz="0"/>
+              <w:right w:val="single" w:color="FFFFFF" w:sz="0"/>
             </w:tcBorders>
             <w:tcMar>
               <w:right w:type="dxa" w:w="80"/>
@@ -5520,20 +5648,20 @@
                 <w:sz w:val="18"/>
                 <w:szCs w:val="18"/>
               </w:rPr>
-              <w:t xml:space="preserve">P1 Critical</w:t>
-            </w:r>
-          </w:p>
-        </w:tc>
-        <w:tc>
-          <w:tcPr>
-            <w:tcW w:type="dxa" w:w="3848"/>
-            <w:tcBorders>
-              <w:top w:val="none"/>
-              <w:left w:val="none"/>
-              <w:bottom w:val="none"/>
-              <w:right w:val="none"/>
-            </w:tcBorders>
-            <w:shd w:fill="da1e28" w:val="clear"/>
+              <w:t xml:space="preserve">P1 — Critical</w:t>
+            </w:r>
+          </w:p>
+        </w:tc>
+        <w:tc>
+          <w:tcPr>
+            <w:tcW w:type="dxa" w:w="3705"/>
+            <w:tcBorders>
+              <w:top w:val="single" w:color="FFFFFF" w:sz="0"/>
+              <w:left w:val="single" w:color="FFFFFF" w:sz="0"/>
+              <w:bottom w:val="single" w:color="FFFFFF" w:sz="0"/>
+              <w:right w:val="single" w:color="FFFFFF" w:sz="0"/>
+            </w:tcBorders>
+            <w:shd w:fill="DA1E28" w:val="clear"/>
           </w:tcPr>
           <w:p>
             <w:pPr>
@@ -5543,12 +5671,12 @@
         </w:tc>
         <w:tc>
           <w:tcPr>
-            <w:tcW w:type="dxa" w:w="1552"/>
-            <w:tcBorders>
-              <w:top w:val="none"/>
-              <w:left w:val="none"/>
-              <w:bottom w:val="none"/>
-              <w:right w:val="none"/>
+            <w:tcW w:type="dxa" w:w="1495"/>
+            <w:tcBorders>
+              <w:top w:val="single" w:color="FFFFFF" w:sz="0"/>
+              <w:left w:val="single" w:color="FFFFFF" w:sz="0"/>
+              <w:bottom w:val="single" w:color="FFFFFF" w:sz="0"/>
+              <w:right w:val="single" w:color="FFFFFF" w:sz="0"/>
             </w:tcBorders>
             <w:shd w:fill="E8E8E8" w:val="clear"/>
           </w:tcPr>
@@ -5562,10 +5690,10 @@
           <w:tcPr>
             <w:tcW w:type="dxa" w:w="1200"/>
             <w:tcBorders>
-              <w:top w:val="none"/>
-              <w:left w:val="none"/>
-              <w:bottom w:val="none"/>
-              <w:right w:val="none"/>
+              <w:top w:val="single" w:color="FFFFFF" w:sz="0"/>
+              <w:left w:val="single" w:color="FFFFFF" w:sz="0"/>
+              <w:bottom w:val="single" w:color="FFFFFF" w:sz="0"/>
+              <w:right w:val="single" w:color="FFFFFF" w:sz="0"/>
             </w:tcBorders>
             <w:tcMar>
               <w:left w:type="dxa" w:w="80"/>
@@ -5582,7 +5710,7 @@
                 <w:rFonts w:ascii="Calibri" w:cs="Calibri" w:eastAsia="Calibri" w:hAnsi="Calibri"/>
                 <w:b/>
                 <w:bCs/>
-                <w:color w:val="da1e28"/>
+                <w:color w:val="DA1E28"/>
                 <w:sz w:val="18"/>
                 <w:szCs w:val="18"/>
               </w:rPr>
@@ -5594,12 +5722,12 @@
       <w:tr>
         <w:tc>
           <w:tcPr>
-            <w:tcW w:type="dxa" w:w="2400"/>
-            <w:tcBorders>
-              <w:top w:val="none"/>
-              <w:left w:val="none"/>
-              <w:bottom w:val="none"/>
-              <w:right w:val="none"/>
+            <w:tcW w:type="dxa" w:w="2600"/>
+            <w:tcBorders>
+              <w:top w:val="single" w:color="FFFFFF" w:sz="0"/>
+              <w:left w:val="single" w:color="FFFFFF" w:sz="0"/>
+              <w:bottom w:val="single" w:color="FFFFFF" w:sz="0"/>
+              <w:right w:val="single" w:color="FFFFFF" w:sz="0"/>
             </w:tcBorders>
             <w:tcMar>
               <w:right w:type="dxa" w:w="80"/>
@@ -5617,18 +5745,18 @@
                 <w:sz w:val="18"/>
                 <w:szCs w:val="18"/>
               </w:rPr>
-              <w:t xml:space="preserve">P2 High</w:t>
-            </w:r>
-          </w:p>
-        </w:tc>
-        <w:tc>
-          <w:tcPr>
-            <w:tcW w:type="dxa" w:w="3240"/>
-            <w:tcBorders>
-              <w:top w:val="none"/>
-              <w:left w:val="none"/>
-              <w:bottom w:val="none"/>
-              <w:right w:val="none"/>
+              <w:t xml:space="preserve">P2 — High</w:t>
+            </w:r>
+          </w:p>
+        </w:tc>
+        <w:tc>
+          <w:tcPr>
+            <w:tcW w:type="dxa" w:w="3120"/>
+            <w:tcBorders>
+              <w:top w:val="single" w:color="FFFFFF" w:sz="0"/>
+              <w:left w:val="single" w:color="FFFFFF" w:sz="0"/>
+              <w:bottom w:val="single" w:color="FFFFFF" w:sz="0"/>
+              <w:right w:val="single" w:color="FFFFFF" w:sz="0"/>
             </w:tcBorders>
             <w:shd w:fill="FF832B" w:val="clear"/>
           </w:tcPr>
@@ -5640,12 +5768,12 @@
         </w:tc>
         <w:tc>
           <w:tcPr>
-            <w:tcW w:type="dxa" w:w="2160"/>
-            <w:tcBorders>
-              <w:top w:val="none"/>
-              <w:left w:val="none"/>
-              <w:bottom w:val="none"/>
-              <w:right w:val="none"/>
+            <w:tcW w:type="dxa" w:w="2080"/>
+            <w:tcBorders>
+              <w:top w:val="single" w:color="FFFFFF" w:sz="0"/>
+              <w:left w:val="single" w:color="FFFFFF" w:sz="0"/>
+              <w:bottom w:val="single" w:color="FFFFFF" w:sz="0"/>
+              <w:right w:val="single" w:color="FFFFFF" w:sz="0"/>
             </w:tcBorders>
             <w:shd w:fill="E8E8E8" w:val="clear"/>
           </w:tcPr>
@@ -5659,10 +5787,10 @@
           <w:tcPr>
             <w:tcW w:type="dxa" w:w="1200"/>
             <w:tcBorders>
-              <w:top w:val="none"/>
-              <w:left w:val="none"/>
-              <w:bottom w:val="none"/>
-              <w:right w:val="none"/>
+              <w:top w:val="single" w:color="FFFFFF" w:sz="0"/>
+              <w:left w:val="single" w:color="FFFFFF" w:sz="0"/>
+              <w:bottom w:val="single" w:color="FFFFFF" w:sz="0"/>
+              <w:right w:val="single" w:color="FFFFFF" w:sz="0"/>
             </w:tcBorders>
             <w:tcMar>
               <w:left w:type="dxa" w:w="80"/>
@@ -5691,12 +5819,12 @@
       <w:tr>
         <w:tc>
           <w:tcPr>
-            <w:tcW w:type="dxa" w:w="2400"/>
-            <w:tcBorders>
-              <w:top w:val="none"/>
-              <w:left w:val="none"/>
-              <w:bottom w:val="none"/>
-              <w:right w:val="none"/>
+            <w:tcW w:type="dxa" w:w="2600"/>
+            <w:tcBorders>
+              <w:top w:val="single" w:color="FFFFFF" w:sz="0"/>
+              <w:left w:val="single" w:color="FFFFFF" w:sz="0"/>
+              <w:bottom w:val="single" w:color="FFFFFF" w:sz="0"/>
+              <w:right w:val="single" w:color="FFFFFF" w:sz="0"/>
             </w:tcBorders>
             <w:tcMar>
               <w:right w:type="dxa" w:w="80"/>
@@ -5714,18 +5842,18 @@
                 <w:sz w:val="18"/>
                 <w:szCs w:val="18"/>
               </w:rPr>
-              <w:t xml:space="preserve">P3 Medium</w:t>
-            </w:r>
-          </w:p>
-        </w:tc>
-        <w:tc>
-          <w:tcPr>
-            <w:tcW w:type="dxa" w:w="4388"/>
-            <w:tcBorders>
-              <w:top w:val="none"/>
-              <w:left w:val="none"/>
-              <w:bottom w:val="none"/>
-              <w:right w:val="none"/>
+              <w:t xml:space="preserve">P3 — Medium</w:t>
+            </w:r>
+          </w:p>
+        </w:tc>
+        <w:tc>
+          <w:tcPr>
+            <w:tcW w:type="dxa" w:w="4225"/>
+            <w:tcBorders>
+              <w:top w:val="single" w:color="FFFFFF" w:sz="0"/>
+              <w:left w:val="single" w:color="FFFFFF" w:sz="0"/>
+              <w:bottom w:val="single" w:color="FFFFFF" w:sz="0"/>
+              <w:right w:val="single" w:color="FFFFFF" w:sz="0"/>
             </w:tcBorders>
             <w:shd w:fill="0F62FE" w:val="clear"/>
           </w:tcPr>
@@ -5737,12 +5865,12 @@
         </w:tc>
         <w:tc>
           <w:tcPr>
-            <w:tcW w:type="dxa" w:w="1012"/>
-            <w:tcBorders>
-              <w:top w:val="none"/>
-              <w:left w:val="none"/>
-              <w:bottom w:val="none"/>
-              <w:right w:val="none"/>
+            <w:tcW w:type="dxa" w:w="975"/>
+            <w:tcBorders>
+              <w:top w:val="single" w:color="FFFFFF" w:sz="0"/>
+              <w:left w:val="single" w:color="FFFFFF" w:sz="0"/>
+              <w:bottom w:val="single" w:color="FFFFFF" w:sz="0"/>
+              <w:right w:val="single" w:color="FFFFFF" w:sz="0"/>
             </w:tcBorders>
             <w:shd w:fill="E8E8E8" w:val="clear"/>
           </w:tcPr>
@@ -5756,10 +5884,10 @@
           <w:tcPr>
             <w:tcW w:type="dxa" w:w="1200"/>
             <w:tcBorders>
-              <w:top w:val="none"/>
-              <w:left w:val="none"/>
-              <w:bottom w:val="none"/>
-              <w:right w:val="none"/>
+              <w:top w:val="single" w:color="FFFFFF" w:sz="0"/>
+              <w:left w:val="single" w:color="FFFFFF" w:sz="0"/>
+              <w:bottom w:val="single" w:color="FFFFFF" w:sz="0"/>
+              <w:right w:val="single" w:color="FFFFFF" w:sz="0"/>
             </w:tcBorders>
             <w:tcMar>
               <w:left w:type="dxa" w:w="80"/>
@@ -5788,12 +5916,12 @@
       <w:tr>
         <w:tc>
           <w:tcPr>
-            <w:tcW w:type="dxa" w:w="2400"/>
-            <w:tcBorders>
-              <w:top w:val="none"/>
-              <w:left w:val="none"/>
-              <w:bottom w:val="none"/>
-              <w:right w:val="none"/>
+            <w:tcW w:type="dxa" w:w="2600"/>
+            <w:tcBorders>
+              <w:top w:val="single" w:color="FFFFFF" w:sz="0"/>
+              <w:left w:val="single" w:color="FFFFFF" w:sz="0"/>
+              <w:bottom w:val="single" w:color="FFFFFF" w:sz="0"/>
+              <w:right w:val="single" w:color="FFFFFF" w:sz="0"/>
             </w:tcBorders>
             <w:tcMar>
               <w:right w:type="dxa" w:w="80"/>
@@ -5811,18 +5939,18 @@
                 <w:sz w:val="18"/>
                 <w:szCs w:val="18"/>
               </w:rPr>
-              <w:t xml:space="preserve">P4 Low</w:t>
-            </w:r>
-          </w:p>
-        </w:tc>
-        <w:tc>
-          <w:tcPr>
-            <w:tcW w:type="dxa" w:w="5400"/>
-            <w:tcBorders>
-              <w:top w:val="none"/>
-              <w:left w:val="none"/>
-              <w:bottom w:val="none"/>
-              <w:right w:val="none"/>
+              <w:t xml:space="preserve">P4 — Low</w:t>
+            </w:r>
+          </w:p>
+        </w:tc>
+        <w:tc>
+          <w:tcPr>
+            <w:tcW w:type="dxa" w:w="5200"/>
+            <w:tcBorders>
+              <w:top w:val="single" w:color="FFFFFF" w:sz="0"/>
+              <w:left w:val="single" w:color="FFFFFF" w:sz="0"/>
+              <w:bottom w:val="single" w:color="FFFFFF" w:sz="0"/>
+              <w:right w:val="single" w:color="FFFFFF" w:sz="0"/>
             </w:tcBorders>
             <w:shd w:fill="009D9A" w:val="clear"/>
           </w:tcPr>
@@ -5836,10 +5964,10 @@
           <w:tcPr>
             <w:tcW w:type="dxa" w:w="1200"/>
             <w:tcBorders>
-              <w:top w:val="none"/>
-              <w:left w:val="none"/>
-              <w:bottom w:val="none"/>
-              <w:right w:val="none"/>
+              <w:top w:val="single" w:color="FFFFFF" w:sz="0"/>
+              <w:left w:val="single" w:color="FFFFFF" w:sz="0"/>
+              <w:bottom w:val="single" w:color="FFFFFF" w:sz="0"/>
+              <w:right w:val="single" w:color="FFFFFF" w:sz="0"/>
             </w:tcBorders>
             <w:tcMar>
               <w:left w:type="dxa" w:w="80"/>
@@ -5868,12 +5996,12 @@
       <w:tr>
         <w:tc>
           <w:tcPr>
-            <w:tcW w:type="dxa" w:w="2400"/>
-            <w:tcBorders>
-              <w:top w:val="none"/>
-              <w:left w:val="none"/>
-              <w:bottom w:val="none"/>
-              <w:right w:val="none"/>
+            <w:tcW w:type="dxa" w:w="2600"/>
+            <w:tcBorders>
+              <w:top w:val="single" w:color="FFFFFF" w:sz="0"/>
+              <w:left w:val="single" w:color="FFFFFF" w:sz="0"/>
+              <w:bottom w:val="single" w:color="FFFFFF" w:sz="0"/>
+              <w:right w:val="single" w:color="FFFFFF" w:sz="0"/>
             </w:tcBorders>
             <w:tcMar>
               <w:right w:type="dxa" w:w="80"/>
@@ -5897,12 +6025,12 @@
         </w:tc>
         <w:tc>
           <w:tcPr>
-            <w:tcW w:type="dxa" w:w="2700"/>
-            <w:tcBorders>
-              <w:top w:val="none"/>
-              <w:left w:val="none"/>
-              <w:bottom w:val="none"/>
-              <w:right w:val="none"/>
+            <w:tcW w:type="dxa" w:w="2600"/>
+            <w:tcBorders>
+              <w:top w:val="single" w:color="FFFFFF" w:sz="0"/>
+              <w:left w:val="single" w:color="FFFFFF" w:sz="0"/>
+              <w:bottom w:val="single" w:color="FFFFFF" w:sz="0"/>
+              <w:right w:val="single" w:color="FFFFFF" w:sz="0"/>
             </w:tcBorders>
             <w:shd w:fill="001141" w:val="clear"/>
           </w:tcPr>
@@ -5914,12 +6042,12 @@
         </w:tc>
         <w:tc>
           <w:tcPr>
-            <w:tcW w:type="dxa" w:w="2700"/>
-            <w:tcBorders>
-              <w:top w:val="none"/>
-              <w:left w:val="none"/>
-              <w:bottom w:val="none"/>
-              <w:right w:val="none"/>
+            <w:tcW w:type="dxa" w:w="2600"/>
+            <w:tcBorders>
+              <w:top w:val="single" w:color="FFFFFF" w:sz="0"/>
+              <w:left w:val="single" w:color="FFFFFF" w:sz="0"/>
+              <w:bottom w:val="single" w:color="FFFFFF" w:sz="0"/>
+              <w:right w:val="single" w:color="FFFFFF" w:sz="0"/>
             </w:tcBorders>
             <w:shd w:fill="E8E8E8" w:val="clear"/>
           </w:tcPr>
@@ -5933,10 +6061,10 @@
           <w:tcPr>
             <w:tcW w:type="dxa" w:w="1200"/>
             <w:tcBorders>
-              <w:top w:val="none"/>
-              <w:left w:val="none"/>
-              <w:bottom w:val="none"/>
-              <w:right w:val="none"/>
+              <w:top w:val="single" w:color="FFFFFF" w:sz="0"/>
+              <w:left w:val="single" w:color="FFFFFF" w:sz="0"/>
+              <w:bottom w:val="single" w:color="FFFFFF" w:sz="0"/>
+              <w:right w:val="single" w:color="FFFFFF" w:sz="0"/>
             </w:tcBorders>
             <w:tcMar>
               <w:left w:type="dxa" w:w="80"/>
@@ -5965,18 +6093,7 @@
     </w:tbl>
     <w:p>
       <w:pPr>
-        <w:spacing w:after="40"/>
-      </w:pPr>
-      <w:r>
-        <w:rPr>
-          <w:rFonts w:ascii="Calibri" w:cs="Calibri" w:eastAsia="Calibri" w:hAnsi="Calibri"/>
-        </w:rPr>
-        <w:t xml:space="preserve"/>
-      </w:r>
-    </w:p>
-    <w:p>
-      <w:pPr>
-        <w:spacing w:after="200"/>
+        <w:spacing w:after="160" w:before="80"/>
         <w:jc w:val="center"/>
       </w:pPr>
       <w:r>
@@ -5988,7 +6105,7 @@
           <w:sz w:val="16"/>
           <w:szCs w:val="16"/>
         </w:rPr>
-        <w:t xml:space="preserve">Figure 4: Projected incident resolution time improvements by severity category following Agentic AI deployment. Percentages represent reduction vs. baseline MTTR.</w:t>
+        <w:t xml:space="preserve">Projected incident resolution time improvements by severity following Agentic AI deployment. Percentages represent reduction vs. baseline MTTR.</w:t>
       </w:r>
     </w:p>
     <w:p>
@@ -5999,9 +6116,9 @@
     <w:p>
       <w:pPr>
         <w:pBdr>
-          <w:bottom w:val="single" w:color="0F62FE" w:sz="8" w:space="6"/>
+          <w:bottom w:val="single" w:color="0F62FE" w:sz="4" w:space="4"/>
         </w:pBdr>
-        <w:spacing w:after="80" w:before="300"/>
+        <w:spacing w:after="80" w:before="240"/>
       </w:pPr>
       <w:r>
         <w:rPr>
@@ -6012,7 +6129,7 @@
           <w:sz w:val="44"/>
           <w:szCs w:val="44"/>
         </w:rPr>
-        <w:t xml:space="preserve">Platform Modernisation</w:t>
+        <w:t xml:space="preserve">Platform Modernization</w:t>
       </w:r>
     </w:p>
     <w:p>
@@ -6028,17 +6145,17 @@
           <w:sz w:val="22"/>
           <w:szCs w:val="22"/>
         </w:rPr>
-        <w:t xml:space="preserve">ICOE Modernisation, Mainframe Migration &amp; Application Rationalisation</w:t>
+        <w:t xml:space="preserve">ICOE Modernization, Mainframe Migration &amp; Application Rationalization</w:t>
       </w:r>
     </w:p>
     <w:tbl>
       <w:tblPr>
         <w:tblW w:type="dxa" w:w="9072"/>
         <w:tblBorders>
-          <w:top w:val="none"/>
-          <w:left w:val="none"/>
-          <w:bottom w:val="none"/>
-          <w:right w:val="none"/>
+          <w:top w:val="single" w:color="FFFFFF" w:sz="0"/>
+          <w:left w:val="single" w:color="FFFFFF" w:sz="0"/>
+          <w:bottom w:val="single" w:color="FFFFFF" w:sz="0"/>
+          <w:right w:val="single" w:color="FFFFFF" w:sz="0"/>
           <w:insideH w:val="single" w:color="auto" w:sz="4"/>
           <w:insideV w:val="single" w:color="auto" w:sz="4"/>
         </w:tblBorders>
@@ -6053,18 +6170,18 @@
           <w:tcPr>
             <w:tcW w:type="dxa" w:w="4320"/>
             <w:tcBorders>
-              <w:top w:val="none"/>
-              <w:left w:val="none"/>
-              <w:bottom w:val="none"/>
-              <w:right w:val="none"/>
+              <w:top w:val="single" w:color="FFFFFF" w:sz="0"/>
+              <w:left w:val="single" w:color="FFFFFF" w:sz="0"/>
+              <w:bottom w:val="single" w:color="FFFFFF" w:sz="0"/>
+              <w:right w:val="single" w:color="FFFFFF" w:sz="0"/>
             </w:tcBorders>
             <w:tcMar>
-              <w:right w:type="dxa" w:w="200"/>
+              <w:right w:type="dxa" w:w="220"/>
             </w:tcMar>
           </w:tcPr>
           <w:p>
             <w:pPr>
-              <w:spacing w:after="100" w:before="120"/>
+              <w:spacing w:after="100" w:before="80"/>
             </w:pPr>
             <w:r>
               <w:rPr>
@@ -6072,10 +6189,10 @@
                 <w:b/>
                 <w:bCs/>
                 <w:color w:val="001141"/>
-                <w:sz w:val="24"/>
-                <w:szCs w:val="24"/>
-              </w:rPr>
-              <w:t xml:space="preserve">ICOE Modernisation</w:t>
+                <w:sz w:val="26"/>
+                <w:szCs w:val="26"/>
+              </w:rPr>
+              <w:t xml:space="preserve">ICOE Modernization</w:t>
             </w:r>
           </w:p>
           <w:p>
@@ -6090,7 +6207,7 @@
                 <w:sz w:val="20"/>
                 <w:szCs w:val="20"/>
               </w:rPr>
-              <w:t xml:space="preserve">IBM's Integration Centre of Excellence (ICOE) Modernisation programme restructures IBM's delivery organisation to align with Horizon's evolving platform landscape — introducing DevSecOps pipelines, product-centric engineering squads, and shared services for API management, identity, and data integration.</w:t>
+              <w:t xml:space="preserve">IBM's Integration Centre of Excellence (ICOE) Modernization program restructures IBM's delivery organization to align with Horizon's evolving platform landscape — introducing DevSecOps pipelines, product-centric engineering squads, and shared services for API management, identity, and data integration.</w:t>
             </w:r>
           </w:p>
           <w:p>
@@ -6190,7 +6307,7 @@
                 <w:sz w:val="20"/>
                 <w:szCs w:val="20"/>
               </w:rPr>
-              <w:t xml:space="preserve">Document Generation Modernisation (HLGS upgrade roadmap).</w:t>
+              <w:t xml:space="preserve">Document Generation Modernization (HLGS upgrade roadmap).</w:t>
             </w:r>
           </w:p>
           <w:p>
@@ -6256,7 +6373,7 @@
                 <w:sz w:val="20"/>
                 <w:szCs w:val="20"/>
               </w:rPr>
-              <w:t xml:space="preserve">IBM will conduct a structured assessment of Horizon's ~500 application portfolio using the BUILD ONCE, BENEFIT (BOB) framework — identifying candidates for decommission, consolidation, cloud migration, or AI-augmented modernisation.</w:t>
+              <w:t xml:space="preserve">IBM will conduct a structured assessment of Horizon's ~500 application portfolio using the BUILD ONCE, BENEFIT (BOB) framework — identifying candidates for decommission, consolidation, cloud migration, or AI-augmented modernization.</w:t>
             </w:r>
           </w:p>
         </w:tc>
@@ -6264,18 +6381,18 @@
           <w:tcPr>
             <w:tcW w:type="dxa" w:w="4320"/>
             <w:tcBorders>
-              <w:top w:val="none"/>
-              <w:left w:val="none"/>
-              <w:bottom w:val="none"/>
-              <w:right w:val="none"/>
+              <w:top w:val="single" w:color="FFFFFF" w:sz="0"/>
+              <w:left w:val="single" w:color="FFFFFF" w:sz="0"/>
+              <w:bottom w:val="single" w:color="FFFFFF" w:sz="0"/>
+              <w:right w:val="single" w:color="FFFFFF" w:sz="0"/>
             </w:tcBorders>
             <w:tcMar>
-              <w:left w:type="dxa" w:w="200"/>
+              <w:left w:type="dxa" w:w="220"/>
             </w:tcMar>
           </w:tcPr>
           <w:p>
             <w:pPr>
-              <w:spacing w:after="100" w:before="120"/>
+              <w:spacing w:after="100" w:before="80"/>
             </w:pPr>
             <w:r>
               <w:rPr>
@@ -6283,10 +6400,10 @@
                 <w:b/>
                 <w:bCs/>
                 <w:color w:val="001141"/>
-                <w:sz w:val="24"/>
-                <w:szCs w:val="24"/>
-              </w:rPr>
-              <w:t xml:space="preserve">Mainframe Modernisation Roadmap</w:t>
+                <w:sz w:val="26"/>
+                <w:szCs w:val="26"/>
+              </w:rPr>
+              <w:t xml:space="preserve">Mainframe Modernization Roadmap</w:t>
             </w:r>
           </w:p>
           <w:p>
@@ -6386,7 +6503,7 @@
               </w:tc>
               <w:tc>
                 <w:tcPr>
-                  <w:tcW w:type="dxa" w:w="2300"/>
+                  <w:tcW w:type="dxa" w:w="2200"/>
                   <w:shd w:fill="001141" w:val="clear"/>
                   <w:tcMar>
                     <w:top w:type="dxa" w:w="60"/>
@@ -6473,7 +6590,7 @@
               </w:tc>
               <w:tc>
                 <w:tcPr>
-                  <w:tcW w:type="dxa" w:w="2300"/>
+                  <w:tcW w:type="dxa" w:w="2200"/>
                   <w:shd w:fill="FFFFFF" w:val="clear"/>
                   <w:tcMar>
                     <w:top w:type="dxa" w:w="50"/>
@@ -6503,7 +6620,7 @@
               <w:tc>
                 <w:tcPr>
                   <w:tcW w:type="dxa" w:w="2200"/>
-                  <w:shd w:fill="F0F4FF" w:val="clear"/>
+                  <w:shd w:fill="EEF4FF" w:val="clear"/>
                   <w:tcMar>
                     <w:top w:type="dxa" w:w="50"/>
                     <w:left w:type="dxa" w:w="80"/>
@@ -6532,7 +6649,7 @@
               <w:tc>
                 <w:tcPr>
                   <w:tcW w:type="dxa" w:w="2600"/>
-                  <w:shd w:fill="F0F4FF" w:val="clear"/>
+                  <w:shd w:fill="EEF4FF" w:val="clear"/>
                   <w:tcMar>
                     <w:top w:type="dxa" w:w="50"/>
                     <w:left w:type="dxa" w:w="80"/>
@@ -6558,8 +6675,8 @@
               </w:tc>
               <w:tc>
                 <w:tcPr>
-                  <w:tcW w:type="dxa" w:w="2300"/>
-                  <w:shd w:fill="F0F4FF" w:val="clear"/>
+                  <w:tcW w:type="dxa" w:w="2200"/>
+                  <w:shd w:fill="EEF4FF" w:val="clear"/>
                   <w:tcMar>
                     <w:top w:type="dxa" w:w="50"/>
                     <w:left w:type="dxa" w:w="80"/>
@@ -6643,7 +6760,7 @@
               </w:tc>
               <w:tc>
                 <w:tcPr>
-                  <w:tcW w:type="dxa" w:w="2300"/>
+                  <w:tcW w:type="dxa" w:w="2200"/>
                   <w:shd w:fill="FFFFFF" w:val="clear"/>
                   <w:tcMar>
                     <w:top w:type="dxa" w:w="50"/>
@@ -6673,7 +6790,7 @@
               <w:tc>
                 <w:tcPr>
                   <w:tcW w:type="dxa" w:w="2200"/>
-                  <w:shd w:fill="F0F4FF" w:val="clear"/>
+                  <w:shd w:fill="EEF4FF" w:val="clear"/>
                   <w:tcMar>
                     <w:top w:type="dxa" w:w="50"/>
                     <w:left w:type="dxa" w:w="80"/>
@@ -6702,7 +6819,7 @@
               <w:tc>
                 <w:tcPr>
                   <w:tcW w:type="dxa" w:w="2600"/>
-                  <w:shd w:fill="F0F4FF" w:val="clear"/>
+                  <w:shd w:fill="EEF4FF" w:val="clear"/>
                   <w:tcMar>
                     <w:top w:type="dxa" w:w="50"/>
                     <w:left w:type="dxa" w:w="80"/>
@@ -6728,8 +6845,8 @@
               </w:tc>
               <w:tc>
                 <w:tcPr>
-                  <w:tcW w:type="dxa" w:w="2300"/>
-                  <w:shd w:fill="F0F4FF" w:val="clear"/>
+                  <w:tcW w:type="dxa" w:w="2200"/>
+                  <w:shd w:fill="EEF4FF" w:val="clear"/>
                   <w:tcMar>
                     <w:top w:type="dxa" w:w="50"/>
                     <w:left w:type="dxa" w:w="80"/>
@@ -6813,7 +6930,7 @@
               </w:tc>
               <w:tc>
                 <w:tcPr>
-                  <w:tcW w:type="dxa" w:w="2300"/>
+                  <w:tcW w:type="dxa" w:w="2200"/>
                   <w:shd w:fill="FFFFFF" w:val="clear"/>
                   <w:tcMar>
                     <w:top w:type="dxa" w:w="50"/>
@@ -6855,10 +6972,10 @@
             <w:tblPr>
               <w:tblW w:type="dxa" w:w="9072"/>
               <w:tblBorders>
-                <w:top w:val="none"/>
-                <w:left w:val="none"/>
-                <w:bottom w:val="none"/>
-                <w:right w:val="none"/>
+                <w:top w:val="single" w:color="FFFFFF" w:sz="0"/>
+                <w:left w:val="single" w:color="FFFFFF" w:sz="0"/>
+                <w:bottom w:val="single" w:color="FFFFFF" w:sz="0"/>
+                <w:right w:val="single" w:color="FFFFFF" w:sz="0"/>
                 <w:insideH w:val="single" w:color="auto" w:sz="4"/>
                 <w:insideV w:val="single" w:color="auto" w:sz="4"/>
               </w:tblBorders>
@@ -6871,10 +6988,10 @@
               <w:tc>
                 <w:tcPr>
                   <w:tcBorders>
-                    <w:top w:val="single" w:color="001141" w:sz="4" w:space="0"/>
-                    <w:left w:val="single" w:color="001141" w:sz="24" w:space="4"/>
-                    <w:bottom w:val="single" w:color="001141" w:sz="4" w:space="0"/>
-                    <w:right w:val="single" w:color="001141" w:sz="4" w:space="0"/>
+                    <w:top w:val="single" w:color="001141" w:sz="4"/>
+                    <w:left w:val="single" w:color="001141" w:sz="28"/>
+                    <w:bottom w:val="single" w:color="001141" w:sz="4"/>
+                    <w:right w:val="single" w:color="001141" w:sz="4"/>
                   </w:tcBorders>
                   <w:shd w:fill="F4F4F4" w:val="clear"/>
                   <w:tcMar>
@@ -6978,10 +7095,10 @@
       <w:tblPr>
         <w:tblW w:type="dxa" w:w="9072"/>
         <w:tblBorders>
-          <w:top w:val="none"/>
-          <w:left w:val="none"/>
-          <w:bottom w:val="none"/>
-          <w:right w:val="none"/>
+          <w:top w:val="single" w:color="FFFFFF" w:sz="0"/>
+          <w:left w:val="single" w:color="FFFFFF" w:sz="0"/>
+          <w:bottom w:val="single" w:color="FFFFFF" w:sz="0"/>
+          <w:right w:val="single" w:color="FFFFFF" w:sz="0"/>
           <w:insideH w:val="single" w:color="auto" w:sz="4"/>
           <w:insideV w:val="single" w:color="auto" w:sz="4"/>
         </w:tblBorders>
@@ -6998,10 +7115,10 @@
           <w:tcPr>
             <w:tcW w:type="dxa" w:w="2268"/>
             <w:tcBorders>
-              <w:top w:val="none"/>
-              <w:left w:val="none"/>
-              <w:bottom w:val="none"/>
-              <w:right w:val="single" w:color="C6C6C6" w:sz="6" w:space="0"/>
+              <w:top w:val="single" w:color="FFFFFF" w:sz="0"/>
+              <w:left w:val="single" w:color="FFFFFF" w:sz="0"/>
+              <w:bottom w:val="single" w:color="FFFFFF" w:sz="0"/>
+              <w:right w:val="single" w:color="C6C6C6" w:sz="6"/>
             </w:tcBorders>
             <w:shd w:fill="F4F4F4" w:val="clear"/>
             <w:tcMar>
@@ -7047,10 +7164,10 @@
           <w:tcPr>
             <w:tcW w:type="dxa" w:w="2268"/>
             <w:tcBorders>
-              <w:top w:val="none"/>
-              <w:left w:val="none"/>
-              <w:bottom w:val="none"/>
-              <w:right w:val="single" w:color="C6C6C6" w:sz="6" w:space="0"/>
+              <w:top w:val="single" w:color="FFFFFF" w:sz="0"/>
+              <w:left w:val="single" w:color="FFFFFF" w:sz="0"/>
+              <w:bottom w:val="single" w:color="FFFFFF" w:sz="0"/>
+              <w:right w:val="single" w:color="C6C6C6" w:sz="6"/>
             </w:tcBorders>
             <w:shd w:fill="F4F4F4" w:val="clear"/>
             <w:tcMar>
@@ -7096,10 +7213,10 @@
           <w:tcPr>
             <w:tcW w:type="dxa" w:w="2268"/>
             <w:tcBorders>
-              <w:top w:val="none"/>
-              <w:left w:val="none"/>
-              <w:bottom w:val="none"/>
-              <w:right w:val="single" w:color="C6C6C6" w:sz="6" w:space="0"/>
+              <w:top w:val="single" w:color="FFFFFF" w:sz="0"/>
+              <w:left w:val="single" w:color="FFFFFF" w:sz="0"/>
+              <w:bottom w:val="single" w:color="FFFFFF" w:sz="0"/>
+              <w:right w:val="single" w:color="C6C6C6" w:sz="6"/>
             </w:tcBorders>
             <w:shd w:fill="F4F4F4" w:val="clear"/>
             <w:tcMar>
@@ -7145,10 +7262,10 @@
           <w:tcPr>
             <w:tcW w:type="dxa" w:w="2268"/>
             <w:tcBorders>
-              <w:top w:val="none"/>
-              <w:left w:val="none"/>
-              <w:bottom w:val="none"/>
-              <w:right w:val="single" w:color="C6C6C6" w:sz="6" w:space="0"/>
+              <w:top w:val="single" w:color="FFFFFF" w:sz="0"/>
+              <w:left w:val="single" w:color="FFFFFF" w:sz="0"/>
+              <w:bottom w:val="single" w:color="FFFFFF" w:sz="0"/>
+              <w:right w:val="single" w:color="C6C6C6" w:sz="6"/>
             </w:tcBorders>
             <w:shd w:fill="F4F4F4" w:val="clear"/>
             <w:tcMar>
@@ -7171,7 +7288,7 @@
                 <w:sz w:val="48"/>
                 <w:szCs w:val="48"/>
               </w:rPr>
-              <w:t xml:space="preserve">0</w:t>
+              <w:t xml:space="preserve">Zero</w:t>
             </w:r>
           </w:p>
           <w:p>
@@ -7200,9 +7317,9 @@
     <w:p>
       <w:pPr>
         <w:pBdr>
-          <w:bottom w:val="single" w:color="0F62FE" w:sz="8" w:space="6"/>
+          <w:bottom w:val="single" w:color="0F62FE" w:sz="4" w:space="4"/>
         </w:pBdr>
-        <w:spacing w:after="80" w:before="300"/>
+        <w:spacing w:after="80" w:before="240"/>
       </w:pPr>
       <w:r>
         <w:rPr>
@@ -7236,10 +7353,10 @@
       <w:tblPr>
         <w:tblW w:type="dxa" w:w="9072"/>
         <w:tblBorders>
-          <w:top w:val="none"/>
-          <w:left w:val="none"/>
-          <w:bottom w:val="none"/>
-          <w:right w:val="none"/>
+          <w:top w:val="single" w:color="FFFFFF" w:sz="0"/>
+          <w:left w:val="single" w:color="FFFFFF" w:sz="0"/>
+          <w:bottom w:val="single" w:color="FFFFFF" w:sz="0"/>
+          <w:right w:val="single" w:color="FFFFFF" w:sz="0"/>
           <w:insideH w:val="single" w:color="auto" w:sz="4"/>
           <w:insideV w:val="single" w:color="auto" w:sz="4"/>
         </w:tblBorders>
@@ -7254,18 +7371,18 @@
           <w:tcPr>
             <w:tcW w:type="dxa" w:w="4320"/>
             <w:tcBorders>
-              <w:top w:val="none"/>
-              <w:left w:val="none"/>
-              <w:bottom w:val="none"/>
-              <w:right w:val="none"/>
+              <w:top w:val="single" w:color="FFFFFF" w:sz="0"/>
+              <w:left w:val="single" w:color="FFFFFF" w:sz="0"/>
+              <w:bottom w:val="single" w:color="FFFFFF" w:sz="0"/>
+              <w:right w:val="single" w:color="FFFFFF" w:sz="0"/>
             </w:tcBorders>
             <w:tcMar>
-              <w:right w:type="dxa" w:w="200"/>
+              <w:right w:type="dxa" w:w="220"/>
             </w:tcMar>
           </w:tcPr>
           <w:p>
             <w:pPr>
-              <w:spacing w:after="100" w:before="120"/>
+              <w:spacing w:after="100" w:before="80"/>
             </w:pPr>
             <w:r>
               <w:rPr>
@@ -7273,8 +7390,8 @@
                 <w:b/>
                 <w:bCs/>
                 <w:color w:val="001141"/>
-                <w:sz w:val="24"/>
-                <w:szCs w:val="24"/>
+                <w:sz w:val="26"/>
+                <w:szCs w:val="26"/>
               </w:rPr>
               <w:t xml:space="preserve">Self-Improving Quality Framework</w:t>
             </w:r>
@@ -7454,18 +7571,18 @@
           <w:tcPr>
             <w:tcW w:type="dxa" w:w="4320"/>
             <w:tcBorders>
-              <w:top w:val="none"/>
-              <w:left w:val="none"/>
-              <w:bottom w:val="none"/>
-              <w:right w:val="none"/>
+              <w:top w:val="single" w:color="FFFFFF" w:sz="0"/>
+              <w:left w:val="single" w:color="FFFFFF" w:sz="0"/>
+              <w:bottom w:val="single" w:color="FFFFFF" w:sz="0"/>
+              <w:right w:val="single" w:color="FFFFFF" w:sz="0"/>
             </w:tcBorders>
             <w:tcMar>
-              <w:left w:type="dxa" w:w="200"/>
+              <w:left w:type="dxa" w:w="220"/>
             </w:tcMar>
           </w:tcPr>
           <w:p>
             <w:pPr>
-              <w:spacing w:after="100" w:before="120"/>
+              <w:spacing w:after="100" w:before="80"/>
             </w:pPr>
             <w:r>
               <w:rPr>
@@ -7473,8 +7590,8 @@
                 <w:b/>
                 <w:bCs/>
                 <w:color w:val="001141"/>
-                <w:sz w:val="24"/>
-                <w:szCs w:val="24"/>
+                <w:sz w:val="26"/>
+                <w:szCs w:val="26"/>
               </w:rPr>
               <w:t xml:space="preserve">AI-Augmented Development Model</w:t>
             </w:r>
@@ -7669,10 +7786,10 @@
             <w:tblPr>
               <w:tblW w:type="dxa" w:w="9072"/>
               <w:tblBorders>
-                <w:top w:val="none"/>
-                <w:left w:val="none"/>
-                <w:bottom w:val="none"/>
-                <w:right w:val="none"/>
+                <w:top w:val="single" w:color="FFFFFF" w:sz="0"/>
+                <w:left w:val="single" w:color="FFFFFF" w:sz="0"/>
+                <w:bottom w:val="single" w:color="FFFFFF" w:sz="0"/>
+                <w:right w:val="single" w:color="FFFFFF" w:sz="0"/>
                 <w:insideH w:val="single" w:color="auto" w:sz="4"/>
                 <w:insideV w:val="single" w:color="auto" w:sz="4"/>
               </w:tblBorders>
@@ -7685,10 +7802,10 @@
               <w:tc>
                 <w:tcPr>
                   <w:tcBorders>
-                    <w:top w:val="none"/>
-                    <w:left w:val="single" w:color="198038" w:sz="24" w:space="4"/>
-                    <w:bottom w:val="none"/>
-                    <w:right w:val="none"/>
+                    <w:top w:val="single" w:color="FFFFFF" w:sz="0"/>
+                    <w:left w:val="single" w:color="198038" w:sz="28"/>
+                    <w:bottom w:val="single" w:color="FFFFFF" w:sz="0"/>
+                    <w:right w:val="single" w:color="FFFFFF" w:sz="0"/>
                   </w:tcBorders>
                   <w:shd w:fill="DEFBE6" w:val="clear"/>
                   <w:tcMar>
@@ -7701,7 +7818,7 @@
                 <w:p>
                   <w:pPr>
                     <w:spacing w:after="80" w:before="80"/>
-                    <w:jc w:val="center"/>
+                    <w:jc w:val="both"/>
                   </w:pPr>
                   <w:r>
                     <w:rPr>
@@ -7755,17 +7872,17 @@
           <w:sz w:val="21"/>
           <w:szCs w:val="21"/>
         </w:rPr>
-        <w:t xml:space="preserve">Quality KPI Improvement Targets (12-Month Programme)</w:t>
+        <w:t xml:space="preserve">Figure 5: Quality KPI Improvement Targets — 12-Month Programme</w:t>
       </w:r>
     </w:p>
     <w:tbl>
       <w:tblPr>
         <w:tblW w:type="dxa" w:w="9072"/>
         <w:tblBorders>
-          <w:top w:val="none"/>
-          <w:left w:val="none"/>
-          <w:bottom w:val="none"/>
-          <w:right w:val="none"/>
+          <w:top w:val="single" w:color="FFFFFF" w:sz="0"/>
+          <w:left w:val="single" w:color="FFFFFF" w:sz="0"/>
+          <w:bottom w:val="single" w:color="FFFFFF" w:sz="0"/>
+          <w:right w:val="single" w:color="FFFFFF" w:sz="0"/>
           <w:insideH w:val="single" w:color="auto" w:sz="4"/>
           <w:insideV w:val="single" w:color="auto" w:sz="4"/>
         </w:tblBorders>
@@ -7780,12 +7897,12 @@
       <w:tr>
         <w:tc>
           <w:tcPr>
-            <w:tcW w:type="dxa" w:w="2400"/>
-            <w:tcBorders>
-              <w:top w:val="none"/>
-              <w:left w:val="none"/>
-              <w:bottom w:val="none"/>
-              <w:right w:val="none"/>
+            <w:tcW w:type="dxa" w:w="2600"/>
+            <w:tcBorders>
+              <w:top w:val="single" w:color="FFFFFF" w:sz="0"/>
+              <w:left w:val="single" w:color="FFFFFF" w:sz="0"/>
+              <w:bottom w:val="single" w:color="FFFFFF" w:sz="0"/>
+              <w:right w:val="single" w:color="FFFFFF" w:sz="0"/>
             </w:tcBorders>
             <w:tcMar>
               <w:right w:type="dxa" w:w="80"/>
@@ -7809,12 +7926,12 @@
         </w:tc>
         <w:tc>
           <w:tcPr>
-            <w:tcW w:type="dxa" w:w="5400"/>
-            <w:tcBorders>
-              <w:top w:val="none"/>
-              <w:left w:val="none"/>
-              <w:bottom w:val="none"/>
-              <w:right w:val="none"/>
+            <w:tcW w:type="dxa" w:w="5200"/>
+            <w:tcBorders>
+              <w:top w:val="single" w:color="FFFFFF" w:sz="0"/>
+              <w:left w:val="single" w:color="FFFFFF" w:sz="0"/>
+              <w:bottom w:val="single" w:color="FFFFFF" w:sz="0"/>
+              <w:right w:val="single" w:color="FFFFFF" w:sz="0"/>
             </w:tcBorders>
             <w:shd w:fill="198038" w:val="clear"/>
           </w:tcPr>
@@ -7828,10 +7945,10 @@
           <w:tcPr>
             <w:tcW w:type="dxa" w:w="1200"/>
             <w:tcBorders>
-              <w:top w:val="none"/>
-              <w:left w:val="none"/>
-              <w:bottom w:val="none"/>
-              <w:right w:val="none"/>
+              <w:top w:val="single" w:color="FFFFFF" w:sz="0"/>
+              <w:left w:val="single" w:color="FFFFFF" w:sz="0"/>
+              <w:bottom w:val="single" w:color="FFFFFF" w:sz="0"/>
+              <w:right w:val="single" w:color="FFFFFF" w:sz="0"/>
             </w:tcBorders>
             <w:tcMar>
               <w:left w:type="dxa" w:w="80"/>
@@ -7860,12 +7977,12 @@
       <w:tr>
         <w:tc>
           <w:tcPr>
-            <w:tcW w:type="dxa" w:w="2400"/>
-            <w:tcBorders>
-              <w:top w:val="none"/>
-              <w:left w:val="none"/>
-              <w:bottom w:val="none"/>
-              <w:right w:val="none"/>
+            <w:tcW w:type="dxa" w:w="2600"/>
+            <w:tcBorders>
+              <w:top w:val="single" w:color="FFFFFF" w:sz="0"/>
+              <w:left w:val="single" w:color="FFFFFF" w:sz="0"/>
+              <w:bottom w:val="single" w:color="FFFFFF" w:sz="0"/>
+              <w:right w:val="single" w:color="FFFFFF" w:sz="0"/>
             </w:tcBorders>
             <w:tcMar>
               <w:right w:type="dxa" w:w="80"/>
@@ -7889,12 +8006,12 @@
         </w:tc>
         <w:tc>
           <w:tcPr>
-            <w:tcW w:type="dxa" w:w="4388"/>
-            <w:tcBorders>
-              <w:top w:val="none"/>
-              <w:left w:val="none"/>
-              <w:bottom w:val="none"/>
-              <w:right w:val="none"/>
+            <w:tcW w:type="dxa" w:w="4225"/>
+            <w:tcBorders>
+              <w:top w:val="single" w:color="FFFFFF" w:sz="0"/>
+              <w:left w:val="single" w:color="FFFFFF" w:sz="0"/>
+              <w:bottom w:val="single" w:color="FFFFFF" w:sz="0"/>
+              <w:right w:val="single" w:color="FFFFFF" w:sz="0"/>
             </w:tcBorders>
             <w:shd w:fill="0F62FE" w:val="clear"/>
           </w:tcPr>
@@ -7906,12 +8023,12 @@
         </w:tc>
         <w:tc>
           <w:tcPr>
-            <w:tcW w:type="dxa" w:w="1012"/>
-            <w:tcBorders>
-              <w:top w:val="none"/>
-              <w:left w:val="none"/>
-              <w:bottom w:val="none"/>
-              <w:right w:val="none"/>
+            <w:tcW w:type="dxa" w:w="975"/>
+            <w:tcBorders>
+              <w:top w:val="single" w:color="FFFFFF" w:sz="0"/>
+              <w:left w:val="single" w:color="FFFFFF" w:sz="0"/>
+              <w:bottom w:val="single" w:color="FFFFFF" w:sz="0"/>
+              <w:right w:val="single" w:color="FFFFFF" w:sz="0"/>
             </w:tcBorders>
             <w:shd w:fill="E8E8E8" w:val="clear"/>
           </w:tcPr>
@@ -7925,10 +8042,10 @@
           <w:tcPr>
             <w:tcW w:type="dxa" w:w="1200"/>
             <w:tcBorders>
-              <w:top w:val="none"/>
-              <w:left w:val="none"/>
-              <w:bottom w:val="none"/>
-              <w:right w:val="none"/>
+              <w:top w:val="single" w:color="FFFFFF" w:sz="0"/>
+              <w:left w:val="single" w:color="FFFFFF" w:sz="0"/>
+              <w:bottom w:val="single" w:color="FFFFFF" w:sz="0"/>
+              <w:right w:val="single" w:color="FFFFFF" w:sz="0"/>
             </w:tcBorders>
             <w:tcMar>
               <w:left w:type="dxa" w:w="80"/>
@@ -7957,12 +8074,12 @@
       <w:tr>
         <w:tc>
           <w:tcPr>
-            <w:tcW w:type="dxa" w:w="2400"/>
-            <w:tcBorders>
-              <w:top w:val="none"/>
-              <w:left w:val="none"/>
-              <w:bottom w:val="none"/>
-              <w:right w:val="none"/>
+            <w:tcW w:type="dxa" w:w="2600"/>
+            <w:tcBorders>
+              <w:top w:val="single" w:color="FFFFFF" w:sz="0"/>
+              <w:left w:val="single" w:color="FFFFFF" w:sz="0"/>
+              <w:bottom w:val="single" w:color="FFFFFF" w:sz="0"/>
+              <w:right w:val="single" w:color="FFFFFF" w:sz="0"/>
             </w:tcBorders>
             <w:tcMar>
               <w:right w:type="dxa" w:w="80"/>
@@ -7986,12 +8103,12 @@
         </w:tc>
         <w:tc>
           <w:tcPr>
-            <w:tcW w:type="dxa" w:w="4725"/>
-            <w:tcBorders>
-              <w:top w:val="none"/>
-              <w:left w:val="none"/>
-              <w:bottom w:val="none"/>
-              <w:right w:val="none"/>
+            <w:tcW w:type="dxa" w:w="4550"/>
+            <w:tcBorders>
+              <w:top w:val="single" w:color="FFFFFF" w:sz="0"/>
+              <w:left w:val="single" w:color="FFFFFF" w:sz="0"/>
+              <w:bottom w:val="single" w:color="FFFFFF" w:sz="0"/>
+              <w:right w:val="single" w:color="FFFFFF" w:sz="0"/>
             </w:tcBorders>
             <w:shd w:fill="009D9A" w:val="clear"/>
           </w:tcPr>
@@ -8003,12 +8120,12 @@
         </w:tc>
         <w:tc>
           <w:tcPr>
-            <w:tcW w:type="dxa" w:w="675"/>
-            <w:tcBorders>
-              <w:top w:val="none"/>
-              <w:left w:val="none"/>
-              <w:bottom w:val="none"/>
-              <w:right w:val="none"/>
+            <w:tcW w:type="dxa" w:w="650"/>
+            <w:tcBorders>
+              <w:top w:val="single" w:color="FFFFFF" w:sz="0"/>
+              <w:left w:val="single" w:color="FFFFFF" w:sz="0"/>
+              <w:bottom w:val="single" w:color="FFFFFF" w:sz="0"/>
+              <w:right w:val="single" w:color="FFFFFF" w:sz="0"/>
             </w:tcBorders>
             <w:shd w:fill="E8E8E8" w:val="clear"/>
           </w:tcPr>
@@ -8022,10 +8139,10 @@
           <w:tcPr>
             <w:tcW w:type="dxa" w:w="1200"/>
             <w:tcBorders>
-              <w:top w:val="none"/>
-              <w:left w:val="none"/>
-              <w:bottom w:val="none"/>
-              <w:right w:val="none"/>
+              <w:top w:val="single" w:color="FFFFFF" w:sz="0"/>
+              <w:left w:val="single" w:color="FFFFFF" w:sz="0"/>
+              <w:bottom w:val="single" w:color="FFFFFF" w:sz="0"/>
+              <w:right w:val="single" w:color="FFFFFF" w:sz="0"/>
             </w:tcBorders>
             <w:tcMar>
               <w:left w:type="dxa" w:w="80"/>
@@ -8054,12 +8171,12 @@
       <w:tr>
         <w:tc>
           <w:tcPr>
-            <w:tcW w:type="dxa" w:w="2400"/>
-            <w:tcBorders>
-              <w:top w:val="none"/>
-              <w:left w:val="none"/>
-              <w:bottom w:val="none"/>
-              <w:right w:val="none"/>
+            <w:tcW w:type="dxa" w:w="2600"/>
+            <w:tcBorders>
+              <w:top w:val="single" w:color="FFFFFF" w:sz="0"/>
+              <w:left w:val="single" w:color="FFFFFF" w:sz="0"/>
+              <w:bottom w:val="single" w:color="FFFFFF" w:sz="0"/>
+              <w:right w:val="single" w:color="FFFFFF" w:sz="0"/>
             </w:tcBorders>
             <w:tcMar>
               <w:right w:type="dxa" w:w="80"/>
@@ -8083,12 +8200,12 @@
         </w:tc>
         <w:tc>
           <w:tcPr>
-            <w:tcW w:type="dxa" w:w="3713"/>
-            <w:tcBorders>
-              <w:top w:val="none"/>
-              <w:left w:val="none"/>
-              <w:bottom w:val="none"/>
-              <w:right w:val="none"/>
+            <w:tcW w:type="dxa" w:w="3575"/>
+            <w:tcBorders>
+              <w:top w:val="single" w:color="FFFFFF" w:sz="0"/>
+              <w:left w:val="single" w:color="FFFFFF" w:sz="0"/>
+              <w:bottom w:val="single" w:color="FFFFFF" w:sz="0"/>
+              <w:right w:val="single" w:color="FFFFFF" w:sz="0"/>
             </w:tcBorders>
             <w:shd w:fill="001141" w:val="clear"/>
           </w:tcPr>
@@ -8100,12 +8217,12 @@
         </w:tc>
         <w:tc>
           <w:tcPr>
-            <w:tcW w:type="dxa" w:w="1687"/>
-            <w:tcBorders>
-              <w:top w:val="none"/>
-              <w:left w:val="none"/>
-              <w:bottom w:val="none"/>
-              <w:right w:val="none"/>
+            <w:tcW w:type="dxa" w:w="1625"/>
+            <w:tcBorders>
+              <w:top w:val="single" w:color="FFFFFF" w:sz="0"/>
+              <w:left w:val="single" w:color="FFFFFF" w:sz="0"/>
+              <w:bottom w:val="single" w:color="FFFFFF" w:sz="0"/>
+              <w:right w:val="single" w:color="FFFFFF" w:sz="0"/>
             </w:tcBorders>
             <w:shd w:fill="E8E8E8" w:val="clear"/>
           </w:tcPr>
@@ -8119,10 +8236,10 @@
           <w:tcPr>
             <w:tcW w:type="dxa" w:w="1200"/>
             <w:tcBorders>
-              <w:top w:val="none"/>
-              <w:left w:val="none"/>
-              <w:bottom w:val="none"/>
-              <w:right w:val="none"/>
+              <w:top w:val="single" w:color="FFFFFF" w:sz="0"/>
+              <w:left w:val="single" w:color="FFFFFF" w:sz="0"/>
+              <w:bottom w:val="single" w:color="FFFFFF" w:sz="0"/>
+              <w:right w:val="single" w:color="FFFFFF" w:sz="0"/>
             </w:tcBorders>
             <w:tcMar>
               <w:left w:type="dxa" w:w="80"/>
@@ -8151,12 +8268,12 @@
       <w:tr>
         <w:tc>
           <w:tcPr>
-            <w:tcW w:type="dxa" w:w="2400"/>
-            <w:tcBorders>
-              <w:top w:val="none"/>
-              <w:left w:val="none"/>
-              <w:bottom w:val="none"/>
-              <w:right w:val="none"/>
+            <w:tcW w:type="dxa" w:w="2600"/>
+            <w:tcBorders>
+              <w:top w:val="single" w:color="FFFFFF" w:sz="0"/>
+              <w:left w:val="single" w:color="FFFFFF" w:sz="0"/>
+              <w:bottom w:val="single" w:color="FFFFFF" w:sz="0"/>
+              <w:right w:val="single" w:color="FFFFFF" w:sz="0"/>
             </w:tcBorders>
             <w:tcMar>
               <w:right w:type="dxa" w:w="80"/>
@@ -8180,12 +8297,12 @@
         </w:tc>
         <w:tc>
           <w:tcPr>
-            <w:tcW w:type="dxa" w:w="2700"/>
-            <w:tcBorders>
-              <w:top w:val="none"/>
-              <w:left w:val="none"/>
-              <w:bottom w:val="none"/>
-              <w:right w:val="none"/>
+            <w:tcW w:type="dxa" w:w="2600"/>
+            <w:tcBorders>
+              <w:top w:val="single" w:color="FFFFFF" w:sz="0"/>
+              <w:left w:val="single" w:color="FFFFFF" w:sz="0"/>
+              <w:bottom w:val="single" w:color="FFFFFF" w:sz="0"/>
+              <w:right w:val="single" w:color="FFFFFF" w:sz="0"/>
             </w:tcBorders>
             <w:shd w:fill="FF832B" w:val="clear"/>
           </w:tcPr>
@@ -8197,12 +8314,12 @@
         </w:tc>
         <w:tc>
           <w:tcPr>
-            <w:tcW w:type="dxa" w:w="2700"/>
-            <w:tcBorders>
-              <w:top w:val="none"/>
-              <w:left w:val="none"/>
-              <w:bottom w:val="none"/>
-              <w:right w:val="none"/>
+            <w:tcW w:type="dxa" w:w="2600"/>
+            <w:tcBorders>
+              <w:top w:val="single" w:color="FFFFFF" w:sz="0"/>
+              <w:left w:val="single" w:color="FFFFFF" w:sz="0"/>
+              <w:bottom w:val="single" w:color="FFFFFF" w:sz="0"/>
+              <w:right w:val="single" w:color="FFFFFF" w:sz="0"/>
             </w:tcBorders>
             <w:shd w:fill="E8E8E8" w:val="clear"/>
           </w:tcPr>
@@ -8216,10 +8333,10 @@
           <w:tcPr>
             <w:tcW w:type="dxa" w:w="1200"/>
             <w:tcBorders>
-              <w:top w:val="none"/>
-              <w:left w:val="none"/>
-              <w:bottom w:val="none"/>
-              <w:right w:val="none"/>
+              <w:top w:val="single" w:color="FFFFFF" w:sz="0"/>
+              <w:left w:val="single" w:color="FFFFFF" w:sz="0"/>
+              <w:bottom w:val="single" w:color="FFFFFF" w:sz="0"/>
+              <w:right w:val="single" w:color="FFFFFF" w:sz="0"/>
             </w:tcBorders>
             <w:tcMar>
               <w:left w:type="dxa" w:w="80"/>
@@ -8248,18 +8365,7 @@
     </w:tbl>
     <w:p>
       <w:pPr>
-        <w:spacing w:after="40"/>
-      </w:pPr>
-      <w:r>
-        <w:rPr>
-          <w:rFonts w:ascii="Calibri" w:cs="Calibri" w:eastAsia="Calibri" w:hAnsi="Calibri"/>
-        </w:rPr>
-        <w:t xml:space="preserve"/>
-      </w:r>
-    </w:p>
-    <w:p>
-      <w:pPr>
-        <w:spacing w:after="200"/>
+        <w:spacing w:after="160" w:before="80"/>
         <w:jc w:val="center"/>
       </w:pPr>
       <w:r>
@@ -8271,7 +8377,7 @@
           <w:sz w:val="16"/>
           <w:szCs w:val="16"/>
         </w:rPr>
-        <w:t xml:space="preserve">Figure 5: IBM's quality engineering targets for Horizon's AMS portfolio at 12-month programme maturity.</w:t>
+        <w:t xml:space="preserve">IBM's quality engineering targets for Horizon's AMS portfolio at 12-month programme maturity.</w:t>
       </w:r>
     </w:p>
     <w:p>
@@ -8282,9 +8388,9 @@
     <w:p>
       <w:pPr>
         <w:pBdr>
-          <w:bottom w:val="single" w:color="0F62FE" w:sz="8" w:space="6"/>
+          <w:bottom w:val="single" w:color="0F62FE" w:sz="4" w:space="4"/>
         </w:pBdr>
-        <w:spacing w:after="80" w:before="300"/>
+        <w:spacing w:after="80" w:before="240"/>
       </w:pPr>
       <w:r>
         <w:rPr>
@@ -8311,7 +8417,7 @@
           <w:sz w:val="22"/>
           <w:szCs w:val="22"/>
         </w:rPr>
-        <w:t xml:space="preserve">A Structured, Compounding Journey from Stabilisation to Autonomous Operations</w:t>
+        <w:t xml:space="preserve">A Structured, Compounding Journey from Stabilization to Autonomous Operations</w:t>
       </w:r>
     </w:p>
     <w:p>
@@ -8344,10 +8450,10 @@
       <w:tblPr>
         <w:tblW w:type="dxa" w:w="9072"/>
         <w:tblBorders>
-          <w:top w:val="none"/>
-          <w:left w:val="none"/>
-          <w:bottom w:val="none"/>
-          <w:right w:val="none"/>
+          <w:top w:val="single" w:color="FFFFFF" w:sz="0"/>
+          <w:left w:val="single" w:color="FFFFFF" w:sz="0"/>
+          <w:bottom w:val="single" w:color="FFFFFF" w:sz="0"/>
+          <w:right w:val="single" w:color="FFFFFF" w:sz="0"/>
           <w:insideH w:val="single" w:color="auto" w:sz="4"/>
           <w:insideV w:val="single" w:color="auto" w:sz="4"/>
         </w:tblBorders>
@@ -8364,10 +8470,10 @@
           <w:tcPr>
             <w:tcW w:type="dxa" w:w="2268"/>
             <w:tcBorders>
-              <w:top w:val="none"/>
-              <w:left w:val="none"/>
-              <w:bottom w:val="none"/>
-              <w:right w:val="single" w:color="FFFFFF" w:sz="8" w:space="0"/>
+              <w:top w:val="single" w:color="FFFFFF" w:sz="0"/>
+              <w:left w:val="single" w:color="FFFFFF" w:sz="0"/>
+              <w:bottom w:val="single" w:color="FFFFFF" w:sz="0"/>
+              <w:right w:val="single" w:color="FFFFFF" w:sz="8"/>
             </w:tcBorders>
             <w:shd w:fill="0F62FE" w:val="clear"/>
             <w:tcMar>
@@ -8412,10 +8518,10 @@
           <w:tcPr>
             <w:tcW w:type="dxa" w:w="2268"/>
             <w:tcBorders>
-              <w:top w:val="none"/>
-              <w:left w:val="none"/>
-              <w:bottom w:val="none"/>
-              <w:right w:val="single" w:color="FFFFFF" w:sz="8" w:space="0"/>
+              <w:top w:val="single" w:color="FFFFFF" w:sz="0"/>
+              <w:left w:val="single" w:color="FFFFFF" w:sz="0"/>
+              <w:bottom w:val="single" w:color="FFFFFF" w:sz="0"/>
+              <w:right w:val="single" w:color="FFFFFF" w:sz="8"/>
             </w:tcBorders>
             <w:shd w:fill="0050E6" w:val="clear"/>
             <w:tcMar>
@@ -8460,10 +8566,10 @@
           <w:tcPr>
             <w:tcW w:type="dxa" w:w="2268"/>
             <w:tcBorders>
-              <w:top w:val="none"/>
-              <w:left w:val="none"/>
-              <w:bottom w:val="none"/>
-              <w:right w:val="single" w:color="FFFFFF" w:sz="8" w:space="0"/>
+              <w:top w:val="single" w:color="FFFFFF" w:sz="0"/>
+              <w:left w:val="single" w:color="FFFFFF" w:sz="0"/>
+              <w:bottom w:val="single" w:color="FFFFFF" w:sz="0"/>
+              <w:right w:val="single" w:color="FFFFFF" w:sz="8"/>
             </w:tcBorders>
             <w:shd w:fill="003CBF" w:val="clear"/>
             <w:tcMar>
@@ -8508,10 +8614,10 @@
           <w:tcPr>
             <w:tcW w:type="dxa" w:w="2268"/>
             <w:tcBorders>
-              <w:top w:val="none"/>
-              <w:left w:val="none"/>
-              <w:bottom w:val="none"/>
-              <w:right w:val="single" w:color="FFFFFF" w:sz="8" w:space="0"/>
+              <w:top w:val="single" w:color="FFFFFF" w:sz="0"/>
+              <w:left w:val="single" w:color="FFFFFF" w:sz="0"/>
+              <w:bottom w:val="single" w:color="FFFFFF" w:sz="0"/>
+              <w:right w:val="single" w:color="FFFFFF" w:sz="8"/>
             </w:tcBorders>
             <w:shd w:fill="00288A" w:val="clear"/>
             <w:tcMar>
@@ -8558,17 +8664,17 @@
           <w:tcPr>
             <w:tcW w:type="dxa" w:w="2268"/>
             <w:tcBorders>
-              <w:top w:val="none"/>
-              <w:left w:val="none"/>
-              <w:bottom w:val="none"/>
-              <w:right w:val="single" w:color="C6C6C6" w:sz="4" w:space="0"/>
+              <w:top w:val="single" w:color="FFFFFF" w:sz="0"/>
+              <w:left w:val="single" w:color="FFFFFF" w:sz="0"/>
+              <w:bottom w:val="single" w:color="FFFFFF" w:sz="0"/>
+              <w:right w:val="single" w:color="C6C6C6" w:sz="4"/>
             </w:tcBorders>
             <w:shd w:fill="F4F4F4" w:val="clear"/>
             <w:tcMar>
               <w:top w:type="dxa" w:w="120"/>
-              <w:left w:type="dxa" w:w="120"/>
+              <w:left w:type="dxa" w:w="100"/>
               <w:bottom w:type="dxa" w:w="120"/>
-              <w:right w:type="dxa" w:w="120"/>
+              <w:right w:type="dxa" w:w="100"/>
             </w:tcMar>
           </w:tcPr>
           <w:p>
@@ -8579,8 +8685,8 @@
               <w:rPr>
                 <w:rFonts w:ascii="Calibri" w:cs="Calibri" w:eastAsia="Calibri" w:hAnsi="Calibri"/>
                 <w:color w:val="21272A"/>
-                <w:sz w:val="19"/>
-                <w:szCs w:val="19"/>
+                <w:sz w:val="18"/>
+                <w:szCs w:val="18"/>
               </w:rPr>
               <w:t xml:space="preserve">› Command Center assessment &amp; blueprint</w:t>
             </w:r>
@@ -8593,8 +8699,8 @@
               <w:rPr>
                 <w:rFonts w:ascii="Calibri" w:cs="Calibri" w:eastAsia="Calibri" w:hAnsi="Calibri"/>
                 <w:color w:val="21272A"/>
-                <w:sz w:val="19"/>
-                <w:szCs w:val="19"/>
+                <w:sz w:val="18"/>
+                <w:szCs w:val="18"/>
               </w:rPr>
               <w:t xml:space="preserve">› ICOE architecture definition</w:t>
             </w:r>
@@ -8607,8 +8713,8 @@
               <w:rPr>
                 <w:rFonts w:ascii="Calibri" w:cs="Calibri" w:eastAsia="Calibri" w:hAnsi="Calibri"/>
                 <w:color w:val="21272A"/>
-                <w:sz w:val="19"/>
-                <w:szCs w:val="19"/>
+                <w:sz w:val="18"/>
+                <w:szCs w:val="18"/>
               </w:rPr>
               <w:t xml:space="preserve">› Quote to Cart KPI alignment roadmap</w:t>
             </w:r>
@@ -8621,8 +8727,8 @@
               <w:rPr>
                 <w:rFonts w:ascii="Calibri" w:cs="Calibri" w:eastAsia="Calibri" w:hAnsi="Calibri"/>
                 <w:color w:val="21272A"/>
-                <w:sz w:val="19"/>
-                <w:szCs w:val="19"/>
+                <w:sz w:val="18"/>
+                <w:szCs w:val="18"/>
               </w:rPr>
               <w:t xml:space="preserve">› AIOps baseline measurement</w:t>
             </w:r>
@@ -8635,8 +8741,8 @@
               <w:rPr>
                 <w:rFonts w:ascii="Calibri" w:cs="Calibri" w:eastAsia="Calibri" w:hAnsi="Calibri"/>
                 <w:color w:val="21272A"/>
-                <w:sz w:val="19"/>
-                <w:szCs w:val="19"/>
+                <w:sz w:val="18"/>
+                <w:szCs w:val="18"/>
               </w:rPr>
               <w:t xml:space="preserve">› Risk-free transition planning</w:t>
             </w:r>
@@ -8646,17 +8752,17 @@
           <w:tcPr>
             <w:tcW w:type="dxa" w:w="2268"/>
             <w:tcBorders>
-              <w:top w:val="none"/>
-              <w:left w:val="none"/>
-              <w:bottom w:val="none"/>
-              <w:right w:val="single" w:color="C6C6C6" w:sz="4" w:space="0"/>
+              <w:top w:val="single" w:color="FFFFFF" w:sz="0"/>
+              <w:left w:val="single" w:color="FFFFFF" w:sz="0"/>
+              <w:bottom w:val="single" w:color="FFFFFF" w:sz="0"/>
+              <w:right w:val="single" w:color="C6C6C6" w:sz="4"/>
             </w:tcBorders>
             <w:shd w:fill="EAEAEA" w:val="clear"/>
             <w:tcMar>
               <w:top w:type="dxa" w:w="120"/>
-              <w:left w:type="dxa" w:w="120"/>
+              <w:left w:type="dxa" w:w="100"/>
               <w:bottom w:type="dxa" w:w="120"/>
-              <w:right w:type="dxa" w:w="120"/>
+              <w:right w:type="dxa" w:w="100"/>
             </w:tcMar>
           </w:tcPr>
           <w:p>
@@ -8667,10 +8773,10 @@
               <w:rPr>
                 <w:rFonts w:ascii="Calibri" w:cs="Calibri" w:eastAsia="Calibri" w:hAnsi="Calibri"/>
                 <w:color w:val="21272A"/>
-                <w:sz w:val="19"/>
-                <w:szCs w:val="19"/>
-              </w:rPr>
-              <w:t xml:space="preserve">› Integration Simplification &amp; ICOE Modernisation Roadmap</w:t>
+                <w:sz w:val="18"/>
+                <w:szCs w:val="18"/>
+              </w:rPr>
+              <w:t xml:space="preserve">› Integration Simplification &amp; ICOE Modernization Roadmap</w:t>
             </w:r>
           </w:p>
           <w:p>
@@ -8681,10 +8787,10 @@
               <w:rPr>
                 <w:rFonts w:ascii="Calibri" w:cs="Calibri" w:eastAsia="Calibri" w:hAnsi="Calibri"/>
                 <w:color w:val="21272A"/>
-                <w:sz w:val="19"/>
-                <w:szCs w:val="19"/>
-              </w:rPr>
-              <w:t xml:space="preserve">› Document Generation modernisation (HLGS)</w:t>
+                <w:sz w:val="18"/>
+                <w:szCs w:val="18"/>
+              </w:rPr>
+              <w:t xml:space="preserve">› Document Generation modernization (HLGS)</w:t>
             </w:r>
           </w:p>
           <w:p>
@@ -8695,8 +8801,8 @@
               <w:rPr>
                 <w:rFonts w:ascii="Calibri" w:cs="Calibri" w:eastAsia="Calibri" w:hAnsi="Calibri"/>
                 <w:color w:val="21272A"/>
-                <w:sz w:val="19"/>
-                <w:szCs w:val="19"/>
+                <w:sz w:val="18"/>
+                <w:szCs w:val="18"/>
               </w:rPr>
               <w:t xml:space="preserve">› Initial AIOps and monitoring deployment</w:t>
             </w:r>
@@ -8709,8 +8815,8 @@
               <w:rPr>
                 <w:rFonts w:ascii="Calibri" w:cs="Calibri" w:eastAsia="Calibri" w:hAnsi="Calibri"/>
                 <w:color w:val="21272A"/>
-                <w:sz w:val="19"/>
-                <w:szCs w:val="19"/>
+                <w:sz w:val="18"/>
+                <w:szCs w:val="18"/>
               </w:rPr>
               <w:t xml:space="preserve">› Test automation framework initiation</w:t>
             </w:r>
@@ -8723,8 +8829,8 @@
               <w:rPr>
                 <w:rFonts w:ascii="Calibri" w:cs="Calibri" w:eastAsia="Calibri" w:hAnsi="Calibri"/>
                 <w:color w:val="21272A"/>
-                <w:sz w:val="19"/>
-                <w:szCs w:val="19"/>
+                <w:sz w:val="18"/>
+                <w:szCs w:val="18"/>
               </w:rPr>
               <w:t xml:space="preserve">› Innovation Council formation</w:t>
             </w:r>
@@ -8734,17 +8840,17 @@
           <w:tcPr>
             <w:tcW w:type="dxa" w:w="2268"/>
             <w:tcBorders>
-              <w:top w:val="none"/>
-              <w:left w:val="none"/>
-              <w:bottom w:val="none"/>
-              <w:right w:val="single" w:color="C6C6C6" w:sz="4" w:space="0"/>
+              <w:top w:val="single" w:color="FFFFFF" w:sz="0"/>
+              <w:left w:val="single" w:color="FFFFFF" w:sz="0"/>
+              <w:bottom w:val="single" w:color="FFFFFF" w:sz="0"/>
+              <w:right w:val="single" w:color="C6C6C6" w:sz="4"/>
             </w:tcBorders>
             <w:shd w:fill="F4F4F4" w:val="clear"/>
             <w:tcMar>
               <w:top w:type="dxa" w:w="120"/>
-              <w:left w:type="dxa" w:w="120"/>
+              <w:left w:type="dxa" w:w="100"/>
               <w:bottom w:type="dxa" w:w="120"/>
-              <w:right w:type="dxa" w:w="120"/>
+              <w:right w:type="dxa" w:w="100"/>
             </w:tcMar>
           </w:tcPr>
           <w:p>
@@ -8755,10 +8861,10 @@
               <w:rPr>
                 <w:rFonts w:ascii="Calibri" w:cs="Calibri" w:eastAsia="Calibri" w:hAnsi="Calibri"/>
                 <w:color w:val="21272A"/>
-                <w:sz w:val="19"/>
-                <w:szCs w:val="19"/>
-              </w:rPr>
-              <w:t xml:space="preserve">› Unified Payments &amp; Mainframe modernisation</w:t>
+                <w:sz w:val="18"/>
+                <w:szCs w:val="18"/>
+              </w:rPr>
+              <w:t xml:space="preserve">› Unified Payments &amp; Mainframe modernization</w:t>
             </w:r>
           </w:p>
           <w:p>
@@ -8769,10 +8875,10 @@
               <w:rPr>
                 <w:rFonts w:ascii="Calibri" w:cs="Calibri" w:eastAsia="Calibri" w:hAnsi="Calibri"/>
                 <w:color w:val="21272A"/>
-                <w:sz w:val="19"/>
-                <w:szCs w:val="19"/>
-              </w:rPr>
-              <w:t xml:space="preserve">› COBOL → Java modernisation pilot</w:t>
+                <w:sz w:val="18"/>
+                <w:szCs w:val="18"/>
+              </w:rPr>
+              <w:t xml:space="preserve">› COBOL → Java modernization pilot</w:t>
             </w:r>
           </w:p>
           <w:p>
@@ -8783,8 +8889,8 @@
               <w:rPr>
                 <w:rFonts w:ascii="Calibri" w:cs="Calibri" w:eastAsia="Calibri" w:hAnsi="Calibri"/>
                 <w:color w:val="21272A"/>
-                <w:sz w:val="19"/>
-                <w:szCs w:val="19"/>
+                <w:sz w:val="18"/>
+                <w:szCs w:val="18"/>
               </w:rPr>
               <w:t xml:space="preserve">› AI-assisted Dev + Intelligent QA rollout</w:t>
             </w:r>
@@ -8797,8 +8903,8 @@
               <w:rPr>
                 <w:rFonts w:ascii="Calibri" w:cs="Calibri" w:eastAsia="Calibri" w:hAnsi="Calibri"/>
                 <w:color w:val="21272A"/>
-                <w:sz w:val="19"/>
-                <w:szCs w:val="19"/>
+                <w:sz w:val="18"/>
+                <w:szCs w:val="18"/>
               </w:rPr>
               <w:t xml:space="preserve">› Digital Front Door Phase 2–3 delivery</w:t>
             </w:r>
@@ -8811,8 +8917,8 @@
               <w:rPr>
                 <w:rFonts w:ascii="Calibri" w:cs="Calibri" w:eastAsia="Calibri" w:hAnsi="Calibri"/>
                 <w:color w:val="21272A"/>
-                <w:sz w:val="19"/>
-                <w:szCs w:val="19"/>
+                <w:sz w:val="18"/>
+                <w:szCs w:val="18"/>
               </w:rPr>
               <w:t xml:space="preserve">› Agentic AI incident triage live</w:t>
             </w:r>
@@ -8822,17 +8928,17 @@
           <w:tcPr>
             <w:tcW w:type="dxa" w:w="2268"/>
             <w:tcBorders>
-              <w:top w:val="none"/>
-              <w:left w:val="none"/>
-              <w:bottom w:val="none"/>
-              <w:right w:val="single" w:color="C6C6C6" w:sz="4" w:space="0"/>
+              <w:top w:val="single" w:color="FFFFFF" w:sz="0"/>
+              <w:left w:val="single" w:color="FFFFFF" w:sz="0"/>
+              <w:bottom w:val="single" w:color="FFFFFF" w:sz="0"/>
+              <w:right w:val="single" w:color="C6C6C6" w:sz="4"/>
             </w:tcBorders>
             <w:shd w:fill="EAEAEA" w:val="clear"/>
             <w:tcMar>
               <w:top w:type="dxa" w:w="120"/>
-              <w:left w:type="dxa" w:w="120"/>
+              <w:left w:type="dxa" w:w="100"/>
               <w:bottom w:type="dxa" w:w="120"/>
-              <w:right w:type="dxa" w:w="120"/>
+              <w:right w:type="dxa" w:w="100"/>
             </w:tcMar>
           </w:tcPr>
           <w:p>
@@ -8843,8 +8949,8 @@
               <w:rPr>
                 <w:rFonts w:ascii="Calibri" w:cs="Calibri" w:eastAsia="Calibri" w:hAnsi="Calibri"/>
                 <w:color w:val="21272A"/>
-                <w:sz w:val="19"/>
-                <w:szCs w:val="19"/>
+                <w:sz w:val="18"/>
+                <w:szCs w:val="18"/>
               </w:rPr>
               <w:t xml:space="preserve">› Agentic AI for full incident autonomy</w:t>
             </w:r>
@@ -8857,8 +8963,8 @@
               <w:rPr>
                 <w:rFonts w:ascii="Calibri" w:cs="Calibri" w:eastAsia="Calibri" w:hAnsi="Calibri"/>
                 <w:color w:val="21272A"/>
-                <w:sz w:val="19"/>
-                <w:szCs w:val="19"/>
+                <w:sz w:val="18"/>
+                <w:szCs w:val="18"/>
               </w:rPr>
               <w:t xml:space="preserve">› Quote to Cart full production launch</w:t>
             </w:r>
@@ -8871,8 +8977,8 @@
               <w:rPr>
                 <w:rFonts w:ascii="Calibri" w:cs="Calibri" w:eastAsia="Calibri" w:hAnsi="Calibri"/>
                 <w:color w:val="21272A"/>
-                <w:sz w:val="19"/>
-                <w:szCs w:val="19"/>
+                <w:sz w:val="18"/>
+                <w:szCs w:val="18"/>
               </w:rPr>
               <w:t xml:space="preserve">› Claims adjudication parallel-run initiated</w:t>
             </w:r>
@@ -8885,8 +8991,8 @@
               <w:rPr>
                 <w:rFonts w:ascii="Calibri" w:cs="Calibri" w:eastAsia="Calibri" w:hAnsi="Calibri"/>
                 <w:color w:val="21272A"/>
-                <w:sz w:val="19"/>
-                <w:szCs w:val="19"/>
+                <w:sz w:val="18"/>
+                <w:szCs w:val="18"/>
               </w:rPr>
               <w:t xml:space="preserve">› GenAI development lifecycle integrated</w:t>
             </w:r>
@@ -8899,8 +9005,8 @@
               <w:rPr>
                 <w:rFonts w:ascii="Calibri" w:cs="Calibri" w:eastAsia="Calibri" w:hAnsi="Calibri"/>
                 <w:color w:val="21272A"/>
-                <w:sz w:val="19"/>
-                <w:szCs w:val="19"/>
+                <w:sz w:val="18"/>
+                <w:szCs w:val="18"/>
               </w:rPr>
               <w:t xml:space="preserve">› Predictive capacity management live</w:t>
             </w:r>
@@ -8923,10 +9029,10 @@
       <w:tblPr>
         <w:tblW w:type="dxa" w:w="9072"/>
         <w:tblBorders>
-          <w:top w:val="none"/>
-          <w:left w:val="none"/>
-          <w:bottom w:val="none"/>
-          <w:right w:val="none"/>
+          <w:top w:val="single" w:color="FFFFFF" w:sz="0"/>
+          <w:left w:val="single" w:color="FFFFFF" w:sz="0"/>
+          <w:bottom w:val="single" w:color="FFFFFF" w:sz="0"/>
+          <w:right w:val="single" w:color="FFFFFF" w:sz="0"/>
           <w:insideH w:val="single" w:color="auto" w:sz="4"/>
           <w:insideV w:val="single" w:color="auto" w:sz="4"/>
         </w:tblBorders>
@@ -8941,18 +9047,22 @@
           <w:tcPr>
             <w:tcW w:type="dxa" w:w="4320"/>
             <w:tcBorders>
-              <w:top w:val="none"/>
-              <w:left w:val="none"/>
-              <w:bottom w:val="none"/>
-              <w:right w:val="none"/>
+              <w:top w:val="single" w:color="FFFFFF" w:sz="0"/>
+              <w:left w:val="single" w:color="FFFFFF" w:sz="0"/>
+              <w:bottom w:val="single" w:color="FFFFFF" w:sz="0"/>
+              <w:right w:val="single" w:color="FFFFFF" w:sz="0"/>
             </w:tcBorders>
             <w:tcMar>
-              <w:right w:type="dxa" w:w="200"/>
+              <w:right w:type="dxa" w:w="220"/>
             </w:tcMar>
           </w:tcPr>
           <w:p>
             <w:pPr>
-              <w:spacing w:after="100" w:before="120"/>
+              <w:pBdr>
+                <w:left w:val="single" w:color="001141" w:sz="20" w:space="8"/>
+              </w:pBdr>
+              <w:spacing w:after="80" w:before="180"/>
+              <w:ind w:left="120"/>
             </w:pPr>
             <w:r>
               <w:rPr>
@@ -8960,8 +9070,8 @@
                 <w:b/>
                 <w:bCs/>
                 <w:color w:val="001141"/>
-                <w:sz w:val="24"/>
-                <w:szCs w:val="24"/>
+                <w:sz w:val="22"/>
+                <w:szCs w:val="22"/>
               </w:rPr>
               <w:t xml:space="preserve">Phase 4 — Transform (12–24 Months)</w:t>
             </w:r>
@@ -9023,7 +9133,7 @@
                 <w:sz w:val="20"/>
                 <w:szCs w:val="20"/>
               </w:rPr>
-              <w:t xml:space="preserve">AI personalisation engine live (DFD Phase 4).</w:t>
+              <w:t xml:space="preserve">AI personalization engine live (DFD Phase 4).</w:t>
             </w:r>
           </w:p>
           <w:p>
@@ -9091,18 +9201,22 @@
           <w:tcPr>
             <w:tcW w:type="dxa" w:w="4320"/>
             <w:tcBorders>
-              <w:top w:val="none"/>
-              <w:left w:val="none"/>
-              <w:bottom w:val="none"/>
-              <w:right w:val="none"/>
+              <w:top w:val="single" w:color="FFFFFF" w:sz="0"/>
+              <w:left w:val="single" w:color="FFFFFF" w:sz="0"/>
+              <w:bottom w:val="single" w:color="FFFFFF" w:sz="0"/>
+              <w:right w:val="single" w:color="FFFFFF" w:sz="0"/>
             </w:tcBorders>
             <w:tcMar>
-              <w:left w:type="dxa" w:w="200"/>
+              <w:left w:type="dxa" w:w="220"/>
             </w:tcMar>
           </w:tcPr>
           <w:p>
             <w:pPr>
-              <w:spacing w:after="100" w:before="120"/>
+              <w:pBdr>
+                <w:left w:val="single" w:color="001141" w:sz="20" w:space="8"/>
+              </w:pBdr>
+              <w:spacing w:after="80" w:before="180"/>
+              <w:ind w:left="120"/>
             </w:pPr>
             <w:r>
               <w:rPr>
@@ -9110,8 +9224,8 @@
                 <w:b/>
                 <w:bCs/>
                 <w:color w:val="001141"/>
-                <w:sz w:val="24"/>
-                <w:szCs w:val="24"/>
+                <w:sz w:val="22"/>
+                <w:szCs w:val="22"/>
               </w:rPr>
               <w:t xml:space="preserve">Governance at Every Phase</w:t>
             </w:r>
@@ -9227,9 +9341,9 @@
     <w:p>
       <w:pPr>
         <w:pBdr>
-          <w:bottom w:val="single" w:color="0F62FE" w:sz="8" w:space="6"/>
+          <w:bottom w:val="single" w:color="0F62FE" w:sz="4" w:space="4"/>
         </w:pBdr>
-        <w:spacing w:after="80" w:before="300"/>
+        <w:spacing w:after="80" w:before="240"/>
       </w:pPr>
       <w:r>
         <w:rPr>
@@ -9263,10 +9377,10 @@
       <w:tblPr>
         <w:tblW w:type="dxa" w:w="9072"/>
         <w:tblBorders>
-          <w:top w:val="none"/>
-          <w:left w:val="none"/>
-          <w:bottom w:val="none"/>
-          <w:right w:val="none"/>
+          <w:top w:val="single" w:color="FFFFFF" w:sz="0"/>
+          <w:left w:val="single" w:color="FFFFFF" w:sz="0"/>
+          <w:bottom w:val="single" w:color="FFFFFF" w:sz="0"/>
+          <w:right w:val="single" w:color="FFFFFF" w:sz="0"/>
           <w:insideH w:val="single" w:color="auto" w:sz="4"/>
           <w:insideV w:val="single" w:color="auto" w:sz="4"/>
         </w:tblBorders>
@@ -9279,10 +9393,10 @@
         <w:tc>
           <w:tcPr>
             <w:tcBorders>
-              <w:top w:val="none"/>
-              <w:left w:val="single" w:color="0F62FE" w:sz="24" w:space="4"/>
-              <w:bottom w:val="none"/>
-              <w:right w:val="none"/>
+              <w:top w:val="single" w:color="FFFFFF" w:sz="0"/>
+              <w:left w:val="single" w:color="0F62FE" w:sz="28"/>
+              <w:bottom w:val="single" w:color="FFFFFF" w:sz="0"/>
+              <w:right w:val="single" w:color="FFFFFF" w:sz="0"/>
             </w:tcBorders>
             <w:shd w:fill="D0E2FF" w:val="clear"/>
             <w:tcMar>
@@ -9295,7 +9409,7 @@
           <w:p>
             <w:pPr>
               <w:spacing w:after="80" w:before="80"/>
-              <w:jc w:val="center"/>
+              <w:jc w:val="both"/>
             </w:pPr>
             <w:r>
               <w:rPr>
@@ -9356,10 +9470,10 @@
       <w:tblPr>
         <w:tblW w:type="dxa" w:w="9072"/>
         <w:tblBorders>
-          <w:top w:val="none"/>
-          <w:left w:val="none"/>
-          <w:bottom w:val="none"/>
-          <w:right w:val="none"/>
+          <w:top w:val="single" w:color="FFFFFF" w:sz="0"/>
+          <w:left w:val="single" w:color="FFFFFF" w:sz="0"/>
+          <w:bottom w:val="single" w:color="FFFFFF" w:sz="0"/>
+          <w:right w:val="single" w:color="FFFFFF" w:sz="0"/>
           <w:insideH w:val="single" w:color="auto" w:sz="4"/>
           <w:insideV w:val="single" w:color="auto" w:sz="4"/>
         </w:tblBorders>
@@ -9374,18 +9488,18 @@
           <w:tcPr>
             <w:tcW w:type="dxa" w:w="4320"/>
             <w:tcBorders>
-              <w:top w:val="none"/>
-              <w:left w:val="none"/>
-              <w:bottom w:val="none"/>
-              <w:right w:val="none"/>
+              <w:top w:val="single" w:color="FFFFFF" w:sz="0"/>
+              <w:left w:val="single" w:color="FFFFFF" w:sz="0"/>
+              <w:bottom w:val="single" w:color="FFFFFF" w:sz="0"/>
+              <w:right w:val="single" w:color="FFFFFF" w:sz="0"/>
             </w:tcBorders>
             <w:tcMar>
-              <w:right w:type="dxa" w:w="200"/>
+              <w:right w:type="dxa" w:w="220"/>
             </w:tcMar>
           </w:tcPr>
           <w:p>
             <w:pPr>
-              <w:spacing w:after="100" w:before="120"/>
+              <w:spacing w:after="100" w:before="80"/>
             </w:pPr>
             <w:r>
               <w:rPr>
@@ -9393,8 +9507,8 @@
                 <w:b/>
                 <w:bCs/>
                 <w:color w:val="001141"/>
-                <w:sz w:val="24"/>
-                <w:szCs w:val="24"/>
+                <w:sz w:val="26"/>
+                <w:szCs w:val="26"/>
               </w:rPr>
               <w:t xml:space="preserve">Enterprise Transformation, Not Just IT</w:t>
             </w:r>
@@ -9464,7 +9578,7 @@
                 <w:rFonts w:ascii="Calibri" w:cs="Calibri" w:eastAsia="Calibri" w:hAnsi="Calibri"/>
                 <w:b/>
                 <w:bCs/>
-                <w:color w:val="21272A"/>
+                <w:color w:val="0F62FE"/>
                 <w:sz w:val="20"/>
                 <w:szCs w:val="20"/>
               </w:rPr>
@@ -9495,7 +9609,7 @@
                 <w:rFonts w:ascii="Calibri" w:cs="Calibri" w:eastAsia="Calibri" w:hAnsi="Calibri"/>
                 <w:b/>
                 <w:bCs/>
-                <w:color w:val="21272A"/>
+                <w:color w:val="0F62FE"/>
                 <w:sz w:val="20"/>
                 <w:szCs w:val="20"/>
               </w:rPr>
@@ -9526,7 +9640,7 @@
                 <w:rFonts w:ascii="Calibri" w:cs="Calibri" w:eastAsia="Calibri" w:hAnsi="Calibri"/>
                 <w:b/>
                 <w:bCs/>
-                <w:color w:val="21272A"/>
+                <w:color w:val="0F62FE"/>
                 <w:sz w:val="20"/>
                 <w:szCs w:val="20"/>
               </w:rPr>
@@ -9557,7 +9671,7 @@
                 <w:rFonts w:ascii="Calibri" w:cs="Calibri" w:eastAsia="Calibri" w:hAnsi="Calibri"/>
                 <w:b/>
                 <w:bCs/>
-                <w:color w:val="21272A"/>
+                <w:color w:val="0F62FE"/>
                 <w:sz w:val="20"/>
                 <w:szCs w:val="20"/>
               </w:rPr>
@@ -9570,7 +9684,7 @@
                 <w:sz w:val="20"/>
                 <w:szCs w:val="20"/>
               </w:rPr>
-              <w:t xml:space="preserve">IBM commits a structured quarterly innovation process — not ad hoc ideas, but governed, prioritised, business-case-backed innovation at Horizon's direction.</w:t>
+              <w:t xml:space="preserve">IBM commits a structured quarterly innovation process — governed, prioritised, business-case-backed innovation at Horizon's direction.</w:t>
             </w:r>
           </w:p>
         </w:tc>
@@ -9578,18 +9692,18 @@
           <w:tcPr>
             <w:tcW w:type="dxa" w:w="4320"/>
             <w:tcBorders>
-              <w:top w:val="none"/>
-              <w:left w:val="none"/>
-              <w:bottom w:val="none"/>
-              <w:right w:val="none"/>
+              <w:top w:val="single" w:color="FFFFFF" w:sz="0"/>
+              <w:left w:val="single" w:color="FFFFFF" w:sz="0"/>
+              <w:bottom w:val="single" w:color="FFFFFF" w:sz="0"/>
+              <w:right w:val="single" w:color="FFFFFF" w:sz="0"/>
             </w:tcBorders>
             <w:tcMar>
-              <w:left w:type="dxa" w:w="200"/>
+              <w:left w:type="dxa" w:w="220"/>
             </w:tcMar>
           </w:tcPr>
           <w:p>
             <w:pPr>
-              <w:spacing w:after="100" w:before="120"/>
+              <w:spacing w:after="100" w:before="80"/>
             </w:pPr>
             <w:r>
               <w:rPr>
@@ -9597,8 +9711,8 @@
                 <w:b/>
                 <w:bCs/>
                 <w:color w:val="001141"/>
-                <w:sz w:val="24"/>
-                <w:szCs w:val="24"/>
+                <w:sz w:val="26"/>
+                <w:szCs w:val="26"/>
               </w:rPr>
               <w:t xml:space="preserve">IBM's Global Delivery Strength</w:t>
             </w:r>
@@ -9607,10 +9721,10 @@
             <w:tblPr>
               <w:tblW w:type="dxa" w:w="9072"/>
               <w:tblBorders>
-                <w:top w:val="none"/>
-                <w:left w:val="none"/>
-                <w:bottom w:val="none"/>
-                <w:right w:val="none"/>
+                <w:top w:val="single" w:color="FFFFFF" w:sz="0"/>
+                <w:left w:val="single" w:color="FFFFFF" w:sz="0"/>
+                <w:bottom w:val="single" w:color="FFFFFF" w:sz="0"/>
+                <w:right w:val="single" w:color="FFFFFF" w:sz="0"/>
                 <w:insideH w:val="single" w:color="auto" w:sz="4"/>
                 <w:insideV w:val="single" w:color="auto" w:sz="4"/>
               </w:tblBorders>
@@ -9625,10 +9739,10 @@
                 <w:tcPr>
                   <w:tcW w:type="dxa" w:w="4536"/>
                   <w:tcBorders>
-                    <w:top w:val="none"/>
-                    <w:left w:val="none"/>
-                    <w:bottom w:val="none"/>
-                    <w:right w:val="single" w:color="C6C6C6" w:sz="6" w:space="0"/>
+                    <w:top w:val="single" w:color="FFFFFF" w:sz="0"/>
+                    <w:left w:val="single" w:color="FFFFFF" w:sz="0"/>
+                    <w:bottom w:val="single" w:color="FFFFFF" w:sz="0"/>
+                    <w:right w:val="single" w:color="C6C6C6" w:sz="6"/>
                   </w:tcBorders>
                   <w:shd w:fill="F4F4F4" w:val="clear"/>
                   <w:tcMar>
@@ -9674,10 +9788,10 @@
                 <w:tcPr>
                   <w:tcW w:type="dxa" w:w="4536"/>
                   <w:tcBorders>
-                    <w:top w:val="none"/>
-                    <w:left w:val="none"/>
-                    <w:bottom w:val="none"/>
-                    <w:right w:val="single" w:color="C6C6C6" w:sz="6" w:space="0"/>
+                    <w:top w:val="single" w:color="FFFFFF" w:sz="0"/>
+                    <w:left w:val="single" w:color="FFFFFF" w:sz="0"/>
+                    <w:bottom w:val="single" w:color="FFFFFF" w:sz="0"/>
+                    <w:right w:val="single" w:color="C6C6C6" w:sz="6"/>
                   </w:tcBorders>
                   <w:shd w:fill="F4F4F4" w:val="clear"/>
                   <w:tcMar>
@@ -9721,14 +9835,25 @@
               </w:tc>
             </w:tr>
           </w:tbl>
+          <w:p>
+            <w:pPr>
+              <w:spacing w:after="40"/>
+            </w:pPr>
+            <w:r>
+              <w:rPr>
+                <w:rFonts w:ascii="Calibri" w:cs="Calibri" w:eastAsia="Calibri" w:hAnsi="Calibri"/>
+              </w:rPr>
+              <w:t xml:space="preserve"/>
+            </w:r>
+          </w:p>
           <w:tbl>
             <w:tblPr>
               <w:tblW w:type="dxa" w:w="9072"/>
               <w:tblBorders>
-                <w:top w:val="none"/>
-                <w:left w:val="none"/>
-                <w:bottom w:val="none"/>
-                <w:right w:val="none"/>
+                <w:top w:val="single" w:color="FFFFFF" w:sz="0"/>
+                <w:left w:val="single" w:color="FFFFFF" w:sz="0"/>
+                <w:bottom w:val="single" w:color="FFFFFF" w:sz="0"/>
+                <w:right w:val="single" w:color="FFFFFF" w:sz="0"/>
                 <w:insideH w:val="single" w:color="auto" w:sz="4"/>
                 <w:insideV w:val="single" w:color="auto" w:sz="4"/>
               </w:tblBorders>
@@ -9743,10 +9868,10 @@
                 <w:tcPr>
                   <w:tcW w:type="dxa" w:w="4536"/>
                   <w:tcBorders>
-                    <w:top w:val="none"/>
-                    <w:left w:val="none"/>
-                    <w:bottom w:val="none"/>
-                    <w:right w:val="single" w:color="C6C6C6" w:sz="6" w:space="0"/>
+                    <w:top w:val="single" w:color="FFFFFF" w:sz="0"/>
+                    <w:left w:val="single" w:color="FFFFFF" w:sz="0"/>
+                    <w:bottom w:val="single" w:color="FFFFFF" w:sz="0"/>
+                    <w:right w:val="single" w:color="C6C6C6" w:sz="6"/>
                   </w:tcBorders>
                   <w:shd w:fill="F4F4F4" w:val="clear"/>
                   <w:tcMar>
@@ -9792,10 +9917,10 @@
                 <w:tcPr>
                   <w:tcW w:type="dxa" w:w="4536"/>
                   <w:tcBorders>
-                    <w:top w:val="none"/>
-                    <w:left w:val="none"/>
-                    <w:bottom w:val="none"/>
-                    <w:right w:val="single" w:color="C6C6C6" w:sz="6" w:space="0"/>
+                    <w:top w:val="single" w:color="FFFFFF" w:sz="0"/>
+                    <w:left w:val="single" w:color="FFFFFF" w:sz="0"/>
+                    <w:bottom w:val="single" w:color="FFFFFF" w:sz="0"/>
+                    <w:right w:val="single" w:color="C6C6C6" w:sz="6"/>
                   </w:tcBorders>
                   <w:shd w:fill="F4F4F4" w:val="clear"/>
                   <w:tcMar>
@@ -9900,10 +10025,10 @@
             <w:tblPr>
               <w:tblW w:type="dxa" w:w="9072"/>
               <w:tblBorders>
-                <w:top w:val="none"/>
-                <w:left w:val="none"/>
-                <w:bottom w:val="none"/>
-                <w:right w:val="none"/>
+                <w:top w:val="single" w:color="FFFFFF" w:sz="0"/>
+                <w:left w:val="single" w:color="FFFFFF" w:sz="0"/>
+                <w:bottom w:val="single" w:color="FFFFFF" w:sz="0"/>
+                <w:right w:val="single" w:color="FFFFFF" w:sz="0"/>
                 <w:insideH w:val="single" w:color="auto" w:sz="4"/>
                 <w:insideV w:val="single" w:color="auto" w:sz="4"/>
               </w:tblBorders>
@@ -9916,10 +10041,10 @@
               <w:tc>
                 <w:tcPr>
                   <w:tcBorders>
-                    <w:top w:val="single" w:color="0F62FE" w:sz="4" w:space="0"/>
-                    <w:left w:val="single" w:color="0F62FE" w:sz="24" w:space="4"/>
-                    <w:bottom w:val="single" w:color="0F62FE" w:sz="4" w:space="0"/>
-                    <w:right w:val="single" w:color="0F62FE" w:sz="4" w:space="0"/>
+                    <w:top w:val="single" w:color="0F62FE" w:sz="4"/>
+                    <w:left w:val="single" w:color="0F62FE" w:sz="28"/>
+                    <w:bottom w:val="single" w:color="0F62FE" w:sz="4"/>
+                    <w:right w:val="single" w:color="0F62FE" w:sz="4"/>
                   </w:tcBorders>
                   <w:shd w:fill="D0E2FF" w:val="clear"/>
                   <w:tcMar>
@@ -10016,9 +10141,9 @@
     <w:p>
       <w:pPr>
         <w:pBdr>
-          <w:bottom w:val="single" w:color="0F62FE" w:sz="8" w:space="6"/>
+          <w:bottom w:val="single" w:color="0F62FE" w:sz="4" w:space="4"/>
         </w:pBdr>
-        <w:spacing w:after="80" w:before="300"/>
+        <w:spacing w:after="80" w:before="240"/>
       </w:pPr>
       <w:r>
         <w:rPr>
@@ -10052,10 +10177,10 @@
       <w:tblPr>
         <w:tblW w:type="dxa" w:w="9072"/>
         <w:tblBorders>
-          <w:top w:val="none"/>
-          <w:left w:val="none"/>
-          <w:bottom w:val="none"/>
-          <w:right w:val="none"/>
+          <w:top w:val="single" w:color="FFFFFF" w:sz="0"/>
+          <w:left w:val="single" w:color="FFFFFF" w:sz="0"/>
+          <w:bottom w:val="single" w:color="FFFFFF" w:sz="0"/>
+          <w:right w:val="single" w:color="FFFFFF" w:sz="0"/>
           <w:insideH w:val="single" w:color="auto" w:sz="4"/>
           <w:insideV w:val="single" w:color="auto" w:sz="4"/>
         </w:tblBorders>
@@ -10070,18 +10195,18 @@
           <w:tcPr>
             <w:tcW w:type="dxa" w:w="4320"/>
             <w:tcBorders>
-              <w:top w:val="none"/>
-              <w:left w:val="none"/>
-              <w:bottom w:val="none"/>
-              <w:right w:val="none"/>
+              <w:top w:val="single" w:color="FFFFFF" w:sz="0"/>
+              <w:left w:val="single" w:color="FFFFFF" w:sz="0"/>
+              <w:bottom w:val="single" w:color="FFFFFF" w:sz="0"/>
+              <w:right w:val="single" w:color="FFFFFF" w:sz="0"/>
             </w:tcBorders>
             <w:tcMar>
-              <w:right w:type="dxa" w:w="200"/>
+              <w:right w:type="dxa" w:w="220"/>
             </w:tcMar>
           </w:tcPr>
           <w:p>
             <w:pPr>
-              <w:spacing w:after="100" w:before="120"/>
+              <w:spacing w:after="100" w:before="80"/>
             </w:pPr>
             <w:r>
               <w:rPr>
@@ -10089,8 +10214,8 @@
                 <w:b/>
                 <w:bCs/>
                 <w:color w:val="001141"/>
-                <w:sz w:val="24"/>
-                <w:szCs w:val="24"/>
+                <w:sz w:val="26"/>
+                <w:szCs w:val="26"/>
               </w:rPr>
               <w:t xml:space="preserve">Immediate Actions (2–4 Weeks)</w:t>
             </w:r>
@@ -10188,16 +10313,20 @@
           </w:p>
           <w:p>
             <w:pPr>
-              <w:spacing w:after="100" w:before="120"/>
+              <w:pBdr>
+                <w:left w:val="single" w:color="0F62FE" w:sz="20" w:space="8"/>
+              </w:pBdr>
+              <w:spacing w:after="80" w:before="180"/>
+              <w:ind w:left="120"/>
             </w:pPr>
             <w:r>
               <w:rPr>
                 <w:rFonts w:ascii="Calibri" w:cs="Calibri" w:eastAsia="Calibri" w:hAnsi="Calibri"/>
                 <w:b/>
                 <w:bCs/>
-                <w:color w:val="001141"/>
-                <w:sz w:val="24"/>
-                <w:szCs w:val="24"/>
+                <w:color w:val="0F62FE"/>
+                <w:sz w:val="22"/>
+                <w:szCs w:val="22"/>
               </w:rPr>
               <w:t xml:space="preserve">Phase 0 Commitments (Weeks 1–8)</w:t>
             </w:r>
@@ -10217,7 +10346,7 @@
                 <w:rFonts w:ascii="Calibri" w:cs="Calibri" w:eastAsia="Calibri" w:hAnsi="Calibri"/>
                 <w:b/>
                 <w:bCs/>
-                <w:color w:val="21272A"/>
+                <w:color w:val="0F62FE"/>
                 <w:sz w:val="20"/>
                 <w:szCs w:val="20"/>
               </w:rPr>
@@ -10248,7 +10377,7 @@
                 <w:rFonts w:ascii="Calibri" w:cs="Calibri" w:eastAsia="Calibri" w:hAnsi="Calibri"/>
                 <w:b/>
                 <w:bCs/>
-                <w:color w:val="21272A"/>
+                <w:color w:val="0F62FE"/>
                 <w:sz w:val="20"/>
                 <w:szCs w:val="20"/>
               </w:rPr>
@@ -10279,7 +10408,7 @@
                 <w:rFonts w:ascii="Calibri" w:cs="Calibri" w:eastAsia="Calibri" w:hAnsi="Calibri"/>
                 <w:b/>
                 <w:bCs/>
-                <w:color w:val="21272A"/>
+                <w:color w:val="0F62FE"/>
                 <w:sz w:val="20"/>
                 <w:szCs w:val="20"/>
               </w:rPr>
@@ -10310,7 +10439,7 @@
                 <w:rFonts w:ascii="Calibri" w:cs="Calibri" w:eastAsia="Calibri" w:hAnsi="Calibri"/>
                 <w:b/>
                 <w:bCs/>
-                <w:color w:val="21272A"/>
+                <w:color w:val="0F62FE"/>
                 <w:sz w:val="20"/>
                 <w:szCs w:val="20"/>
               </w:rPr>
@@ -10331,18 +10460,18 @@
           <w:tcPr>
             <w:tcW w:type="dxa" w:w="4320"/>
             <w:tcBorders>
-              <w:top w:val="none"/>
-              <w:left w:val="none"/>
-              <w:bottom w:val="none"/>
-              <w:right w:val="none"/>
+              <w:top w:val="single" w:color="FFFFFF" w:sz="0"/>
+              <w:left w:val="single" w:color="FFFFFF" w:sz="0"/>
+              <w:bottom w:val="single" w:color="FFFFFF" w:sz="0"/>
+              <w:right w:val="single" w:color="FFFFFF" w:sz="0"/>
             </w:tcBorders>
             <w:tcMar>
-              <w:left w:type="dxa" w:w="200"/>
+              <w:left w:type="dxa" w:w="220"/>
             </w:tcMar>
           </w:tcPr>
           <w:p>
             <w:pPr>
-              <w:spacing w:after="100" w:before="120"/>
+              <w:spacing w:after="100" w:before="80"/>
             </w:pPr>
             <w:r>
               <w:rPr>
@@ -10350,8 +10479,8 @@
                 <w:b/>
                 <w:bCs/>
                 <w:color w:val="001141"/>
-                <w:sz w:val="24"/>
-                <w:szCs w:val="24"/>
+                <w:sz w:val="26"/>
+                <w:szCs w:val="26"/>
               </w:rPr>
               <w:t xml:space="preserve">What IBM Needs from Horizon</w:t>
             </w:r>
@@ -10373,7 +10502,7 @@
                 <w:sz w:val="20"/>
                 <w:szCs w:val="20"/>
               </w:rPr>
-              <w:t xml:space="preserve">Executive sponsorship confirmed with a named Horizon programme owner.</w:t>
+              <w:t xml:space="preserve">Executive sponsorship confirmed with a named Horizon program owner.</w:t>
             </w:r>
           </w:p>
           <w:p>
@@ -10451,10 +10580,10 @@
             <w:tblPr>
               <w:tblW w:type="dxa" w:w="9072"/>
               <w:tblBorders>
-                <w:top w:val="none"/>
-                <w:left w:val="none"/>
-                <w:bottom w:val="none"/>
-                <w:right w:val="none"/>
+                <w:top w:val="single" w:color="FFFFFF" w:sz="0"/>
+                <w:left w:val="single" w:color="FFFFFF" w:sz="0"/>
+                <w:bottom w:val="single" w:color="FFFFFF" w:sz="0"/>
+                <w:right w:val="single" w:color="FFFFFF" w:sz="0"/>
                 <w:insideH w:val="single" w:color="auto" w:sz="4"/>
                 <w:insideV w:val="single" w:color="auto" w:sz="4"/>
               </w:tblBorders>
@@ -10467,10 +10596,10 @@
               <w:tc>
                 <w:tcPr>
                   <w:tcBorders>
-                    <w:top w:val="none"/>
-                    <w:left w:val="single" w:color="198038" w:sz="24" w:space="4"/>
-                    <w:bottom w:val="none"/>
-                    <w:right w:val="none"/>
+                    <w:top w:val="single" w:color="FFFFFF" w:sz="0"/>
+                    <w:left w:val="single" w:color="198038" w:sz="28"/>
+                    <w:bottom w:val="single" w:color="FFFFFF" w:sz="0"/>
+                    <w:right w:val="single" w:color="FFFFFF" w:sz="0"/>
                   </w:tcBorders>
                   <w:shd w:fill="DEFBE6" w:val="clear"/>
                   <w:tcMar>
@@ -10483,7 +10612,7 @@
                 <w:p>
                   <w:pPr>
                     <w:spacing w:after="80" w:before="80"/>
-                    <w:jc w:val="center"/>
+                    <w:jc w:val="both"/>
                   </w:pPr>
                   <w:r>
                     <w:rPr>
@@ -10523,7 +10652,7 @@
           <w:p>
             <w:pPr>
               <w:pBdr>
-                <w:left w:val="single" w:color="0F62FE" w:sz="20" w:space="8"/>
+                <w:left w:val="single" w:color="6F6F6F" w:sz="20" w:space="8"/>
               </w:pBdr>
               <w:spacing w:after="80" w:before="180"/>
               <w:ind w:left="120"/>
@@ -10533,7 +10662,7 @@
                 <w:rFonts w:ascii="Calibri" w:cs="Calibri" w:eastAsia="Calibri" w:hAnsi="Calibri"/>
                 <w:b/>
                 <w:bCs/>
-                <w:color w:val="0F62FE"/>
+                <w:color w:val="6F6F6F"/>
                 <w:sz w:val="22"/>
                 <w:szCs w:val="22"/>
               </w:rPr>
@@ -10548,6 +10677,8 @@
             <w:r>
               <w:rPr>
                 <w:rFonts w:ascii="Calibri" w:cs="Calibri" w:eastAsia="Calibri" w:hAnsi="Calibri"/>
+                <w:i/>
+                <w:iCs/>
                 <w:color w:val="6F6F6F"/>
                 <w:sz w:val="18"/>
                 <w:szCs w:val="18"/>
@@ -10584,10 +10715,10 @@
       <w:tblPr>
         <w:tblW w:type="dxa" w:w="9072"/>
         <w:tblBorders>
-          <w:top w:val="none"/>
-          <w:left w:val="none"/>
-          <w:bottom w:val="none"/>
-          <w:right w:val="none"/>
+          <w:top w:val="single" w:color="FFFFFF" w:sz="0"/>
+          <w:left w:val="single" w:color="FFFFFF" w:sz="0"/>
+          <w:bottom w:val="single" w:color="FFFFFF" w:sz="0"/>
+          <w:right w:val="single" w:color="FFFFFF" w:sz="0"/>
           <w:insideH w:val="single" w:color="auto" w:sz="4"/>
           <w:insideV w:val="single" w:color="auto" w:sz="4"/>
         </w:tblBorders>
@@ -10600,10 +10731,10 @@
         <w:tc>
           <w:tcPr>
             <w:tcBorders>
-              <w:top w:val="none"/>
-              <w:left w:val="none"/>
-              <w:bottom w:val="none"/>
-              <w:right w:val="none"/>
+              <w:top w:val="single" w:color="FFFFFF" w:sz="0"/>
+              <w:left w:val="single" w:color="FFFFFF" w:sz="0"/>
+              <w:bottom w:val="single" w:color="FFFFFF" w:sz="0"/>
+              <w:right w:val="single" w:color="FFFFFF" w:sz="0"/>
             </w:tcBorders>
             <w:shd w:fill="001141" w:val="clear"/>
             <w:tcMar>
@@ -10672,7 +10803,7 @@
           <w:sz w:val="16"/>
           <w:szCs w:val="16"/>
         </w:rPr>
-        <w:t xml:space="preserve">© 2026 IBM Corporation  ·  IBM-HZN-AMS-RFP-2026-CAS  ·  Confidential — Executive Use Only  ·  All figures are based on IBM programme data and industry benchmarks.</w:t>
+        <w:t xml:space="preserve">© 2026 IBM Corporation  ·  IBM-HZN-AMS-RFP-2026-CAS  ·  Confidential — Executive Use Only  ·  All figures based on IBM programme data and industry benchmarks.</w:t>
       </w:r>
     </w:p>
     <w:sectPr>

</xml_diff>

<commit_message>
Enhance executive summary with live dashboard screenshot and value realization numbers
Update the executive summary to include a live screenshot of the CareOps360 Executive Dashboard, add detailed value realization metrics with live portal data, and adjust figure numbering and document metadata.

Replit-Commit-Author: Agent
Replit-Commit-Session-Id: 85ca0e57-022c-4e07-8505-5330d2441dfb
Replit-Commit-Checkpoint-Type: full_checkpoint
Replit-Commit-Event-Id: 00618e64-80ce-47a2-a2a9-4e76fec181ef
Replit-Commit-Screenshot-Url: https://storage.googleapis.com/screenshot-production-us-central1/c5ecfbc0-55f8-4296-b6fe-cd54067a2b61/85ca0e57-022c-4e07-8505-5330d2441dfb/SAbWdL0
Replit-Helium-Checkpoint-Created: true
</commit_message>
<xml_diff>
--- a/IBM_Horizon_AI_Transformation_Proposal_Apr2026.docx
+++ b/IBM_Horizon_AI_Transformation_Proposal_Apr2026.docx
@@ -692,6 +692,201 @@
               <w:t xml:space="preserve">IBM proposes a structured transition from reactive application support to a predictive, self-healing, and continuously improving AI-first operating model — delivered through IBM's proven Assets, Assistants, and Accelerators framework, and governed through an outcome-based accountability model.</w:t>
             </w:r>
           </w:p>
+          <w:p>
+            <w:pPr>
+              <w:pBdr>
+                <w:left w:val="single" w:color="0F62FE" w:sz="20" w:space="8"/>
+              </w:pBdr>
+              <w:spacing w:after="80" w:before="180"/>
+              <w:ind w:left="120"/>
+            </w:pPr>
+            <w:r>
+              <w:rPr>
+                <w:rFonts w:ascii="Calibri" w:cs="Calibri" w:eastAsia="Calibri" w:hAnsi="Calibri"/>
+                <w:b/>
+                <w:bCs/>
+                <w:color w:val="0F62FE"/>
+                <w:sz w:val="22"/>
+                <w:szCs w:val="22"/>
+              </w:rPr>
+              <w:t xml:space="preserve">Value Realization — Live Portal Metrics</w:t>
+            </w:r>
+          </w:p>
+          <w:p>
+            <w:pPr>
+              <w:spacing w:after="100"/>
+              <w:jc w:val="both"/>
+            </w:pPr>
+            <w:r>
+              <w:rPr>
+                <w:rFonts w:ascii="Calibri" w:cs="Calibri" w:eastAsia="Calibri" w:hAnsi="Calibri"/>
+                <w:color w:val="21272A"/>
+                <w:sz w:val="20"/>
+                <w:szCs w:val="20"/>
+              </w:rPr>
+              <w:t xml:space="preserve">CareOps360, IBM's purpose-built executive command centre, surfaces live operational intelligence across all AMS towers. The metrics below are drawn directly from the running production-equivalent environment as of April 2026:</w:t>
+            </w:r>
+          </w:p>
+          <w:p>
+            <w:pPr>
+              <w:spacing w:after="40" w:before="60"/>
+            </w:pPr>
+            <w:r>
+              <w:rPr>
+                <w:rFonts w:ascii="Calibri" w:cs="Calibri" w:eastAsia="Calibri" w:hAnsi="Calibri"/>
+                <w:b/>
+                <w:bCs/>
+                <w:color w:val="0F62FE"/>
+                <w:sz w:val="22"/>
+                <w:szCs w:val="22"/>
+              </w:rPr>
+              <w:t xml:space="preserve">4.29M </w:t>
+            </w:r>
+            <w:r>
+              <w:rPr>
+                <w:rFonts w:ascii="Calibri" w:cs="Calibri" w:eastAsia="Calibri" w:hAnsi="Calibri"/>
+                <w:color w:val="21272A"/>
+                <w:sz w:val="20"/>
+                <w:szCs w:val="20"/>
+              </w:rPr>
+              <w:t xml:space="preserve">Active Members under management  </w:t>
+            </w:r>
+            <w:r>
+              <w:rPr>
+                <w:rFonts w:ascii="Calibri" w:cs="Calibri" w:eastAsia="Calibri" w:hAnsi="Calibri"/>
+                <w:b/>
+                <w:bCs/>
+                <w:color w:val="0F62FE"/>
+                <w:sz w:val="22"/>
+                <w:szCs w:val="22"/>
+              </w:rPr>
+              <w:t xml:space="preserve">$1.69B </w:t>
+            </w:r>
+            <w:r>
+              <w:rPr>
+                <w:rFonts w:ascii="Calibri" w:cs="Calibri" w:eastAsia="Calibri" w:hAnsi="Calibri"/>
+                <w:color w:val="21272A"/>
+                <w:sz w:val="20"/>
+                <w:szCs w:val="20"/>
+              </w:rPr>
+              <w:t xml:space="preserve">Claims settled (7 days)</w:t>
+            </w:r>
+          </w:p>
+          <w:p>
+            <w:pPr>
+              <w:spacing w:after="40" w:before="40"/>
+            </w:pPr>
+            <w:r>
+              <w:rPr>
+                <w:rFonts w:ascii="Calibri" w:cs="Calibri" w:eastAsia="Calibri" w:hAnsi="Calibri"/>
+                <w:b/>
+                <w:bCs/>
+                <w:color w:val="198038"/>
+                <w:sz w:val="22"/>
+                <w:szCs w:val="22"/>
+              </w:rPr>
+              <w:t xml:space="preserve">99.4% </w:t>
+            </w:r>
+            <w:r>
+              <w:rPr>
+                <w:rFonts w:ascii="Calibri" w:cs="Calibri" w:eastAsia="Calibri" w:hAnsi="Calibri"/>
+                <w:color w:val="21272A"/>
+                <w:sz w:val="20"/>
+                <w:szCs w:val="20"/>
+              </w:rPr>
+              <w:t xml:space="preserve">Application availability  </w:t>
+            </w:r>
+            <w:r>
+              <w:rPr>
+                <w:rFonts w:ascii="Calibri" w:cs="Calibri" w:eastAsia="Calibri" w:hAnsi="Calibri"/>
+                <w:b/>
+                <w:bCs/>
+                <w:color w:val="198038"/>
+                <w:sz w:val="22"/>
+                <w:szCs w:val="22"/>
+              </w:rPr>
+              <w:t xml:space="preserve">96.8% </w:t>
+            </w:r>
+            <w:r>
+              <w:rPr>
+                <w:rFonts w:ascii="Calibri" w:cs="Calibri" w:eastAsia="Calibri" w:hAnsi="Calibri"/>
+                <w:color w:val="21272A"/>
+                <w:sz w:val="20"/>
+                <w:szCs w:val="20"/>
+              </w:rPr>
+              <w:t xml:space="preserve">SLA attainment</w:t>
+            </w:r>
+          </w:p>
+          <w:p>
+            <w:pPr>
+              <w:spacing w:after="80" w:before="40"/>
+            </w:pPr>
+            <w:r>
+              <w:rPr>
+                <w:rFonts w:ascii="Calibri" w:cs="Calibri" w:eastAsia="Calibri" w:hAnsi="Calibri"/>
+                <w:b/>
+                <w:bCs/>
+                <w:color w:val="009D9A"/>
+                <w:sz w:val="22"/>
+                <w:szCs w:val="22"/>
+              </w:rPr>
+              <w:t xml:space="preserve">$3.2M </w:t>
+            </w:r>
+            <w:r>
+              <w:rPr>
+                <w:rFonts w:ascii="Calibri" w:cs="Calibri" w:eastAsia="Calibri" w:hAnsi="Calibri"/>
+                <w:color w:val="21272A"/>
+                <w:sz w:val="20"/>
+                <w:szCs w:val="20"/>
+              </w:rPr>
+              <w:t xml:space="preserve">YTD automation savings  </w:t>
+            </w:r>
+            <w:r>
+              <w:rPr>
+                <w:rFonts w:ascii="Calibri" w:cs="Calibri" w:eastAsia="Calibri" w:hAnsi="Calibri"/>
+                <w:b/>
+                <w:bCs/>
+                <w:color w:val="009D9A"/>
+                <w:sz w:val="22"/>
+                <w:szCs w:val="22"/>
+              </w:rPr>
+              <w:t xml:space="preserve">47 sec </w:t>
+            </w:r>
+            <w:r>
+              <w:rPr>
+                <w:rFonts w:ascii="Calibri" w:cs="Calibri" w:eastAsia="Calibri" w:hAnsi="Calibri"/>
+                <w:color w:val="21272A"/>
+                <w:sz w:val="20"/>
+                <w:szCs w:val="20"/>
+              </w:rPr>
+              <w:t xml:space="preserve">Call Centre ASA</w:t>
+            </w:r>
+          </w:p>
+          <w:p>
+            <w:pPr>
+              <w:spacing w:after="80" w:before="40"/>
+            </w:pPr>
+            <w:r>
+              <w:rPr>
+                <w:rFonts w:ascii="Calibri" w:cs="Calibri" w:eastAsia="Calibri" w:hAnsi="Calibri"/>
+                <w:b/>
+                <w:bCs/>
+                <w:color w:val="001141"/>
+                <w:sz w:val="22"/>
+                <w:szCs w:val="22"/>
+              </w:rPr>
+              <w:t xml:space="preserve">$12M+ </w:t>
+            </w:r>
+            <w:r>
+              <w:rPr>
+                <w:rFonts w:ascii="Calibri" w:cs="Calibri" w:eastAsia="Calibri" w:hAnsi="Calibri"/>
+                <w:color w:val="21272A"/>
+                <w:sz w:val="20"/>
+                <w:szCs w:val="20"/>
+              </w:rPr>
+              <w:t xml:space="preserve">Projected annual AIOps savings at full deployment</w:t>
+            </w:r>
+          </w:p>
         </w:tc>
         <w:tc>
           <w:tcPr>
@@ -708,7 +903,70 @@
           </w:tcPr>
           <w:p>
             <w:pPr>
-              <w:spacing w:after="100" w:before="80"/>
+              <w:spacing w:after="40" w:before="60"/>
+              <w:jc w:val="center"/>
+            </w:pPr>
+            <w:r>
+              <w:drawing>
+                <wp:inline distT="0" distB="0" distL="0" distR="0">
+                  <wp:extent cx="2809875" cy="1752600"/>
+                  <wp:effectExtent t="0" r="0" b="0" l="0"/>
+                  <wp:docPr id="1" name="" descr="" title=""/>
+                  <wp:cNvGraphicFramePr>
+                    <a:graphicFrameLocks xmlns:a="http://schemas.openxmlformats.org/drawingml/2006/main" noChangeAspect="1"/>
+                  </wp:cNvGraphicFramePr>
+                  <a:graphic xmlns:a="http://schemas.openxmlformats.org/drawingml/2006/main">
+                    <a:graphicData uri="http://schemas.openxmlformats.org/drawingml/2006/picture">
+                      <pic:pic xmlns:pic="http://schemas.openxmlformats.org/drawingml/2006/picture">
+                        <pic:nvPicPr>
+                          <pic:cNvPr id="0" name="" descr=""/>
+                          <pic:cNvPicPr>
+                            <a:picLocks noChangeAspect="1" noChangeArrowheads="1"/>
+                          </pic:cNvPicPr>
+                        </pic:nvPicPr>
+                        <pic:blipFill>
+                          <a:blip r:embed="rId9" cstate="none"/>
+                          <a:srcRect/>
+                          <a:stretch>
+                            <a:fillRect/>
+                          </a:stretch>
+                        </pic:blipFill>
+                        <pic:spPr bwMode="auto">
+                          <a:xfrm>
+                            <a:off x="0" y="0"/>
+                            <a:ext cx="2809875" cy="1752600"/>
+                          </a:xfrm>
+                          <a:prstGeom prst="rect">
+                            <a:avLst/>
+                          </a:prstGeom>
+                        </pic:spPr>
+                      </pic:pic>
+                    </a:graphicData>
+                  </a:graphic>
+                </wp:inline>
+              </w:drawing>
+            </w:r>
+          </w:p>
+          <w:p>
+            <w:pPr>
+              <w:spacing w:after="100"/>
+              <w:jc w:val="center"/>
+            </w:pPr>
+            <w:r>
+              <w:rPr>
+                <w:rFonts w:ascii="Calibri" w:cs="Calibri" w:eastAsia="Calibri" w:hAnsi="Calibri"/>
+                <w:i/>
+                <w:iCs/>
+                <w:color w:val="6F6F6F"/>
+                <w:sz w:val="15"/>
+                <w:szCs w:val="15"/>
+              </w:rPr>
+              <w:t xml:space="preserve">Figure 1: CareOps360 Executive Dashboard — live operations as of April 13, 2026</w:t>
+            </w:r>
+          </w:p>
+          <w:p>
+            <w:pPr>
+              <w:spacing w:after="80" w:before="80"/>
             </w:pPr>
             <w:r>
               <w:rPr>
@@ -716,8 +974,8 @@
                 <w:b/>
                 <w:bCs/>
                 <w:color w:val="001141"/>
-                <w:sz w:val="26"/>
-                <w:szCs w:val="26"/>
+                <w:sz w:val="24"/>
+                <w:szCs w:val="24"/>
               </w:rPr>
               <w:t xml:space="preserve">Five Strategic Commitments</w:t>
             </w:r>
@@ -1020,7 +1278,7 @@
                 <w:sz w:val="48"/>
                 <w:szCs w:val="48"/>
               </w:rPr>
-              <w:t xml:space="preserve">~500</w:t>
+              <w:t xml:space="preserve">4.29M</w:t>
             </w:r>
           </w:p>
           <w:p>
@@ -1035,7 +1293,7 @@
                 <w:sz w:val="17"/>
                 <w:szCs w:val="17"/>
               </w:rPr>
-              <w:t xml:space="preserve">Applications in Scope</w:t>
+              <w:t xml:space="preserve">Active Members Managed</w:t>
             </w:r>
           </w:p>
         </w:tc>
@@ -1069,7 +1327,7 @@
                 <w:sz w:val="48"/>
                 <w:szCs w:val="48"/>
               </w:rPr>
-              <w:t xml:space="preserve">AI-First</w:t>
+              <w:t xml:space="preserve">$3.2M</w:t>
             </w:r>
           </w:p>
           <w:p>
@@ -1084,7 +1342,7 @@
                 <w:sz w:val="17"/>
                 <w:szCs w:val="17"/>
               </w:rPr>
-              <w:t xml:space="preserve">Operating Model</w:t>
+              <w:t xml:space="preserve">YTD Automation Savings</w:t>
             </w:r>
           </w:p>
         </w:tc>
@@ -1114,11 +1372,11 @@
                 <w:rFonts w:ascii="Calibri" w:cs="Calibri" w:eastAsia="Calibri" w:hAnsi="Calibri"/>
                 <w:b/>
                 <w:bCs/>
-                <w:color w:val="001141"/>
+                <w:color w:val="198038"/>
                 <w:sz w:val="48"/>
                 <w:szCs w:val="48"/>
               </w:rPr>
-              <w:t xml:space="preserve">Phase 0→4</w:t>
+              <w:t xml:space="preserve">99.4%</w:t>
             </w:r>
           </w:p>
           <w:p>
@@ -1133,7 +1391,7 @@
                 <w:sz w:val="17"/>
                 <w:szCs w:val="17"/>
               </w:rPr>
-              <w:t xml:space="preserve">Structured Roadmap</w:t>
+              <w:t xml:space="preserve">Application Availability</w:t>
             </w:r>
           </w:p>
         </w:tc>
@@ -1163,11 +1421,11 @@
                 <w:rFonts w:ascii="Calibri" w:cs="Calibri" w:eastAsia="Calibri" w:hAnsi="Calibri"/>
                 <w:b/>
                 <w:bCs/>
-                <w:color w:val="198038"/>
+                <w:color w:val="001141"/>
                 <w:sz w:val="48"/>
                 <w:szCs w:val="48"/>
               </w:rPr>
-              <w:t xml:space="preserve">24×7</w:t>
+              <w:t xml:space="preserve">$12M+</w:t>
             </w:r>
           </w:p>
           <w:p>
@@ -1182,7 +1440,7 @@
                 <w:sz w:val="17"/>
                 <w:szCs w:val="17"/>
               </w:rPr>
-              <w:t xml:space="preserve">Global Support Coverage</w:t>
+              <w:t xml:space="preserve">Projected Annual AIOps</w:t>
             </w:r>
           </w:p>
         </w:tc>
@@ -2779,7 +3037,7 @@
                     </pic:cNvPicPr>
                   </pic:nvPicPr>
                   <pic:blipFill>
-                    <a:blip r:embed="rId9" cstate="none"/>
+                    <a:blip r:embed="rId10" cstate="none"/>
                     <a:srcRect/>
                     <a:stretch>
                       <a:fillRect/>

</xml_diff>

<commit_message>
Update document to reflect that metrics will be monitored
Modify script to remove specific numerical data from the executive summary and KPI strip, replacing it with a general statement that these metrics will be monitored. Update the figure caption to indicate that the displayed data is illustrative.

Replit-Commit-Author: Agent
Replit-Commit-Session-Id: 85ca0e57-022c-4e07-8505-5330d2441dfb
Replit-Commit-Checkpoint-Type: full_checkpoint
Replit-Commit-Event-Id: fc20e033-d68a-4110-a0ff-d82bbe38acc7
Replit-Commit-Screenshot-Url: https://storage.googleapis.com/screenshot-production-us-central1/c5ecfbc0-55f8-4296-b6fe-cd54067a2b61/85ca0e57-022c-4e07-8505-5330d2441dfb/SAbWdL0
Replit-Helium-Checkpoint-Created: true
</commit_message>
<xml_diff>
--- a/IBM_Horizon_AI_Transformation_Proposal_Apr2026.docx
+++ b/IBM_Horizon_AI_Transformation_Proposal_Apr2026.docx
@@ -709,7 +709,7 @@
                 <w:sz w:val="22"/>
                 <w:szCs w:val="22"/>
               </w:rPr>
-              <w:t xml:space="preserve">Value Realization — Live Portal Metrics</w:t>
+              <w:t xml:space="preserve">Value Realization — What Will Be Monitored</w:t>
             </w:r>
           </w:p>
           <w:p>
@@ -724,167 +724,162 @@
                 <w:sz w:val="20"/>
                 <w:szCs w:val="20"/>
               </w:rPr>
-              <w:t xml:space="preserve">CareOps360, IBM's purpose-built executive command centre, surfaces live operational intelligence across all AMS towers. The metrics below are drawn directly from the running production-equivalent environment as of April 2026:</w:t>
-            </w:r>
-          </w:p>
-          <w:p>
-            <w:pPr>
-              <w:spacing w:after="40" w:before="60"/>
-            </w:pPr>
-            <w:r>
-              <w:rPr>
-                <w:rFonts w:ascii="Calibri" w:cs="Calibri" w:eastAsia="Calibri" w:hAnsi="Calibri"/>
-                <w:b/>
-                <w:bCs/>
-                <w:color w:val="0F62FE"/>
-                <w:sz w:val="22"/>
-                <w:szCs w:val="22"/>
-              </w:rPr>
-              <w:t xml:space="preserve">4.29M </w:t>
-            </w:r>
-            <w:r>
-              <w:rPr>
-                <w:rFonts w:ascii="Calibri" w:cs="Calibri" w:eastAsia="Calibri" w:hAnsi="Calibri"/>
-                <w:color w:val="21272A"/>
-                <w:sz w:val="20"/>
-                <w:szCs w:val="20"/>
-              </w:rPr>
-              <w:t xml:space="preserve">Active Members under management  </w:t>
-            </w:r>
-            <w:r>
-              <w:rPr>
-                <w:rFonts w:ascii="Calibri" w:cs="Calibri" w:eastAsia="Calibri" w:hAnsi="Calibri"/>
-                <w:b/>
-                <w:bCs/>
-                <w:color w:val="0F62FE"/>
-                <w:sz w:val="22"/>
-                <w:szCs w:val="22"/>
-              </w:rPr>
-              <w:t xml:space="preserve">$1.69B </w:t>
-            </w:r>
-            <w:r>
-              <w:rPr>
-                <w:rFonts w:ascii="Calibri" w:cs="Calibri" w:eastAsia="Calibri" w:hAnsi="Calibri"/>
-                <w:color w:val="21272A"/>
-                <w:sz w:val="20"/>
-                <w:szCs w:val="20"/>
-              </w:rPr>
-              <w:t xml:space="preserve">Claims settled (7 days)</w:t>
-            </w:r>
-          </w:p>
-          <w:p>
-            <w:pPr>
-              <w:spacing w:after="40" w:before="40"/>
-            </w:pPr>
-            <w:r>
-              <w:rPr>
-                <w:rFonts w:ascii="Calibri" w:cs="Calibri" w:eastAsia="Calibri" w:hAnsi="Calibri"/>
-                <w:b/>
-                <w:bCs/>
-                <w:color w:val="198038"/>
-                <w:sz w:val="22"/>
-                <w:szCs w:val="22"/>
-              </w:rPr>
-              <w:t xml:space="preserve">99.4% </w:t>
-            </w:r>
-            <w:r>
-              <w:rPr>
-                <w:rFonts w:ascii="Calibri" w:cs="Calibri" w:eastAsia="Calibri" w:hAnsi="Calibri"/>
-                <w:color w:val="21272A"/>
-                <w:sz w:val="20"/>
-                <w:szCs w:val="20"/>
-              </w:rPr>
-              <w:t xml:space="preserve">Application availability  </w:t>
-            </w:r>
-            <w:r>
-              <w:rPr>
-                <w:rFonts w:ascii="Calibri" w:cs="Calibri" w:eastAsia="Calibri" w:hAnsi="Calibri"/>
-                <w:b/>
-                <w:bCs/>
-                <w:color w:val="198038"/>
-                <w:sz w:val="22"/>
-                <w:szCs w:val="22"/>
-              </w:rPr>
-              <w:t xml:space="preserve">96.8% </w:t>
-            </w:r>
-            <w:r>
-              <w:rPr>
-                <w:rFonts w:ascii="Calibri" w:cs="Calibri" w:eastAsia="Calibri" w:hAnsi="Calibri"/>
-                <w:color w:val="21272A"/>
-                <w:sz w:val="20"/>
-                <w:szCs w:val="20"/>
-              </w:rPr>
-              <w:t xml:space="preserve">SLA attainment</w:t>
-            </w:r>
-          </w:p>
-          <w:p>
-            <w:pPr>
-              <w:spacing w:after="80" w:before="40"/>
-            </w:pPr>
-            <w:r>
-              <w:rPr>
-                <w:rFonts w:ascii="Calibri" w:cs="Calibri" w:eastAsia="Calibri" w:hAnsi="Calibri"/>
-                <w:b/>
-                <w:bCs/>
-                <w:color w:val="009D9A"/>
-                <w:sz w:val="22"/>
-                <w:szCs w:val="22"/>
-              </w:rPr>
-              <w:t xml:space="preserve">$3.2M </w:t>
-            </w:r>
-            <w:r>
-              <w:rPr>
-                <w:rFonts w:ascii="Calibri" w:cs="Calibri" w:eastAsia="Calibri" w:hAnsi="Calibri"/>
-                <w:color w:val="21272A"/>
-                <w:sz w:val="20"/>
-                <w:szCs w:val="20"/>
-              </w:rPr>
-              <w:t xml:space="preserve">YTD automation savings  </w:t>
-            </w:r>
-            <w:r>
-              <w:rPr>
-                <w:rFonts w:ascii="Calibri" w:cs="Calibri" w:eastAsia="Calibri" w:hAnsi="Calibri"/>
-                <w:b/>
-                <w:bCs/>
-                <w:color w:val="009D9A"/>
-                <w:sz w:val="22"/>
-                <w:szCs w:val="22"/>
-              </w:rPr>
-              <w:t xml:space="preserve">47 sec </w:t>
-            </w:r>
-            <w:r>
-              <w:rPr>
-                <w:rFonts w:ascii="Calibri" w:cs="Calibri" w:eastAsia="Calibri" w:hAnsi="Calibri"/>
-                <w:color w:val="21272A"/>
-                <w:sz w:val="20"/>
-                <w:szCs w:val="20"/>
-              </w:rPr>
-              <w:t xml:space="preserve">Call Centre ASA</w:t>
-            </w:r>
-          </w:p>
-          <w:p>
-            <w:pPr>
-              <w:spacing w:after="80" w:before="40"/>
-            </w:pPr>
-            <w:r>
-              <w:rPr>
-                <w:rFonts w:ascii="Calibri" w:cs="Calibri" w:eastAsia="Calibri" w:hAnsi="Calibri"/>
-                <w:b/>
-                <w:bCs/>
-                <w:color w:val="001141"/>
-                <w:sz w:val="22"/>
-                <w:szCs w:val="22"/>
-              </w:rPr>
-              <w:t xml:space="preserve">$12M+ </w:t>
-            </w:r>
-            <w:r>
-              <w:rPr>
-                <w:rFonts w:ascii="Calibri" w:cs="Calibri" w:eastAsia="Calibri" w:hAnsi="Calibri"/>
-                <w:color w:val="21272A"/>
-                <w:sz w:val="20"/>
-                <w:szCs w:val="20"/>
-              </w:rPr>
-              <w:t xml:space="preserve">Projected annual AIOps savings at full deployment</w:t>
+              <w:t xml:space="preserve">Once live, CareOps360 will surface real-time operational intelligence across all AMS towers through a single executive command centre. The following metrics will be tracked and reported continuously to Horizon leadership:</w:t>
+            </w:r>
+          </w:p>
+          <w:p>
+            <w:pPr>
+              <w:pStyle w:val="ListParagraph"/>
+              <w:numPr>
+                <w:ilvl w:val="0"/>
+                <w:numId w:val="1"/>
+              </w:numPr>
+              <w:spacing w:after="80"/>
+              <w:ind w:left="360"/>
+            </w:pPr>
+            <w:r>
+              <w:rPr>
+                <w:rFonts w:ascii="Calibri" w:cs="Calibri" w:eastAsia="Calibri" w:hAnsi="Calibri"/>
+                <w:color w:val="21272A"/>
+                <w:sz w:val="20"/>
+                <w:szCs w:val="20"/>
+              </w:rPr>
+              <w:t xml:space="preserve">Active members under management and enrollment velocity</w:t>
+            </w:r>
+          </w:p>
+          <w:p>
+            <w:pPr>
+              <w:pStyle w:val="ListParagraph"/>
+              <w:numPr>
+                <w:ilvl w:val="0"/>
+                <w:numId w:val="1"/>
+              </w:numPr>
+              <w:spacing w:after="80"/>
+              <w:ind w:left="360"/>
+            </w:pPr>
+            <w:r>
+              <w:rPr>
+                <w:rFonts w:ascii="Calibri" w:cs="Calibri" w:eastAsia="Calibri" w:hAnsi="Calibri"/>
+                <w:color w:val="21272A"/>
+                <w:sz w:val="20"/>
+                <w:szCs w:val="20"/>
+              </w:rPr>
+              <w:t xml:space="preserve">Claims settled volume and adjudication cycle times</w:t>
+            </w:r>
+          </w:p>
+          <w:p>
+            <w:pPr>
+              <w:pStyle w:val="ListParagraph"/>
+              <w:numPr>
+                <w:ilvl w:val="0"/>
+                <w:numId w:val="1"/>
+              </w:numPr>
+              <w:spacing w:after="80"/>
+              <w:ind w:left="360"/>
+            </w:pPr>
+            <w:r>
+              <w:rPr>
+                <w:rFonts w:ascii="Calibri" w:cs="Calibri" w:eastAsia="Calibri" w:hAnsi="Calibri"/>
+                <w:color w:val="21272A"/>
+                <w:sz w:val="20"/>
+                <w:szCs w:val="20"/>
+              </w:rPr>
+              <w:t xml:space="preserve">Application availability and SLA attainment across 500+ applications</w:t>
+            </w:r>
+          </w:p>
+          <w:p>
+            <w:pPr>
+              <w:pStyle w:val="ListParagraph"/>
+              <w:numPr>
+                <w:ilvl w:val="0"/>
+                <w:numId w:val="1"/>
+              </w:numPr>
+              <w:spacing w:after="80"/>
+              <w:ind w:left="360"/>
+            </w:pPr>
+            <w:r>
+              <w:rPr>
+                <w:rFonts w:ascii="Calibri" w:cs="Calibri" w:eastAsia="Calibri" w:hAnsi="Calibri"/>
+                <w:color w:val="21272A"/>
+                <w:sz w:val="20"/>
+                <w:szCs w:val="20"/>
+              </w:rPr>
+              <w:t xml:space="preserve">Automation savings — YTD and cumulative cost avoidance</w:t>
+            </w:r>
+          </w:p>
+          <w:p>
+            <w:pPr>
+              <w:pStyle w:val="ListParagraph"/>
+              <w:numPr>
+                <w:ilvl w:val="0"/>
+                <w:numId w:val="1"/>
+              </w:numPr>
+              <w:spacing w:after="80"/>
+              <w:ind w:left="360"/>
+            </w:pPr>
+            <w:r>
+              <w:rPr>
+                <w:rFonts w:ascii="Calibri" w:cs="Calibri" w:eastAsia="Calibri" w:hAnsi="Calibri"/>
+                <w:color w:val="21272A"/>
+                <w:sz w:val="20"/>
+                <w:szCs w:val="20"/>
+              </w:rPr>
+              <w:t xml:space="preserve">Call Centre Average Speed of Answer and first-contact resolution</w:t>
+            </w:r>
+          </w:p>
+          <w:p>
+            <w:pPr>
+              <w:pStyle w:val="ListParagraph"/>
+              <w:numPr>
+                <w:ilvl w:val="0"/>
+                <w:numId w:val="1"/>
+              </w:numPr>
+              <w:spacing w:after="80"/>
+              <w:ind w:left="360"/>
+            </w:pPr>
+            <w:r>
+              <w:rPr>
+                <w:rFonts w:ascii="Calibri" w:cs="Calibri" w:eastAsia="Calibri" w:hAnsi="Calibri"/>
+                <w:color w:val="21272A"/>
+                <w:sz w:val="20"/>
+                <w:szCs w:val="20"/>
+              </w:rPr>
+              <w:t xml:space="preserve">Incident MTTR trends and AIOps-driven deflection rates</w:t>
+            </w:r>
+          </w:p>
+          <w:p>
+            <w:pPr>
+              <w:pStyle w:val="ListParagraph"/>
+              <w:numPr>
+                <w:ilvl w:val="0"/>
+                <w:numId w:val="1"/>
+              </w:numPr>
+              <w:spacing w:after="80"/>
+              <w:ind w:left="360"/>
+            </w:pPr>
+            <w:r>
+              <w:rPr>
+                <w:rFonts w:ascii="Calibri" w:cs="Calibri" w:eastAsia="Calibri" w:hAnsi="Calibri"/>
+                <w:color w:val="21272A"/>
+                <w:sz w:val="20"/>
+                <w:szCs w:val="20"/>
+              </w:rPr>
+              <w:t xml:space="preserve">Projected and realised annual AIOps savings versus committed baseline</w:t>
+            </w:r>
+          </w:p>
+          <w:p>
+            <w:pPr>
+              <w:spacing w:after="100"/>
+              <w:jc w:val="both"/>
+            </w:pPr>
+            <w:r>
+              <w:rPr>
+                <w:rFonts w:ascii="Calibri" w:cs="Calibri" w:eastAsia="Calibri" w:hAnsi="Calibri"/>
+                <w:color w:val="21272A"/>
+                <w:sz w:val="20"/>
+                <w:szCs w:val="20"/>
+              </w:rPr>
+              <w:t xml:space="preserve">All metrics will be baselined at contract commencement and tracked against IBM's committed outcome targets on a monthly governance cadence.</w:t>
             </w:r>
           </w:p>
         </w:tc>
@@ -961,7 +956,7 @@
                 <w:sz w:val="15"/>
                 <w:szCs w:val="15"/>
               </w:rPr>
-              <w:t xml:space="preserve">Figure 1: CareOps360 Executive Dashboard — live operations as of April 13, 2026</w:t>
+              <w:t xml:space="preserve">Figure 1: CareOps360 Executive Dashboard — platform overview (illustrative data shown; live metrics populated upon go-live)</w:t>
             </w:r>
           </w:p>
           <w:p>
@@ -1278,7 +1273,7 @@
                 <w:sz w:val="48"/>
                 <w:szCs w:val="48"/>
               </w:rPr>
-              <w:t xml:space="preserve">4.29M</w:t>
+              <w:t xml:space="preserve">~500</w:t>
             </w:r>
           </w:p>
           <w:p>
@@ -1293,7 +1288,7 @@
                 <w:sz w:val="17"/>
                 <w:szCs w:val="17"/>
               </w:rPr>
-              <w:t xml:space="preserve">Active Members Managed</w:t>
+              <w:t xml:space="preserve">Applications in Scope</w:t>
             </w:r>
           </w:p>
         </w:tc>
@@ -1327,7 +1322,7 @@
                 <w:sz w:val="48"/>
                 <w:szCs w:val="48"/>
               </w:rPr>
-              <w:t xml:space="preserve">$3.2M</w:t>
+              <w:t xml:space="preserve">Phase 0→4</w:t>
             </w:r>
           </w:p>
           <w:p>
@@ -1342,7 +1337,7 @@
                 <w:sz w:val="17"/>
                 <w:szCs w:val="17"/>
               </w:rPr>
-              <w:t xml:space="preserve">YTD Automation Savings</w:t>
+              <w:t xml:space="preserve">Structured Delivery Roadmap</w:t>
             </w:r>
           </w:p>
         </w:tc>
@@ -1376,7 +1371,7 @@
                 <w:sz w:val="48"/>
                 <w:szCs w:val="48"/>
               </w:rPr>
-              <w:t xml:space="preserve">99.4%</w:t>
+              <w:t xml:space="preserve">24×7</w:t>
             </w:r>
           </w:p>
           <w:p>
@@ -1391,7 +1386,7 @@
                 <w:sz w:val="17"/>
                 <w:szCs w:val="17"/>
               </w:rPr>
-              <w:t xml:space="preserve">Application Availability</w:t>
+              <w:t xml:space="preserve">Global AIOps Coverage</w:t>
             </w:r>
           </w:p>
         </w:tc>
@@ -1425,7 +1420,7 @@
                 <w:sz w:val="48"/>
                 <w:szCs w:val="48"/>
               </w:rPr>
-              <w:t xml:space="preserve">$12M+</w:t>
+              <w:t xml:space="preserve">AI-First</w:t>
             </w:r>
           </w:p>
           <w:p>
@@ -1440,7 +1435,7 @@
                 <w:sz w:val="17"/>
                 <w:szCs w:val="17"/>
               </w:rPr>
-              <w:t xml:space="preserve">Projected Annual AIOps</w:t>
+              <w:t xml:space="preserve">Operating Model Commitment</w:t>
             </w:r>
           </w:p>
         </w:tc>

</xml_diff>

<commit_message>
Update proposal document with new baseline information
Update proposal document with revised executive summary, AI-First Operating Model, IBM's scale and partnerships, mainframe modernization strategy, and other content adjustments.

Replit-Commit-Author: Agent
Replit-Commit-Session-Id: 85ca0e57-022c-4e07-8505-5330d2441dfb
Replit-Commit-Checkpoint-Type: full_checkpoint
Replit-Commit-Event-Id: 4853a64a-1264-431f-b4aa-eebbd63a7890
Replit-Commit-Screenshot-Url: https://storage.googleapis.com/screenshot-production-us-central1/c5ecfbc0-55f8-4296-b6fe-cd54067a2b61/85ca0e57-022c-4e07-8505-5330d2441dfb/yCHm5v0
Replit-Helium-Checkpoint-Created: true
</commit_message>
<xml_diff>
--- a/IBM_Horizon_AI_Transformation_Proposal_Apr2026.docx
+++ b/IBM_Horizon_AI_Transformation_Proposal_Apr2026.docx
@@ -1052,7 +1052,7 @@
                 <w:sz w:val="20"/>
                 <w:szCs w:val="20"/>
               </w:rPr>
-              <w:t xml:space="preserve">Zero-Disruption Transition — Risk-free phased transition protecting operational continuity.</w:t>
+              <w:t xml:space="preserve">Zero-Disruption Delivery — Risk-free phased transition protecting operational continuity.</w:t>
             </w:r>
           </w:p>
           <w:p>
@@ -1072,7 +1072,7 @@
                 <w:sz w:val="20"/>
                 <w:szCs w:val="20"/>
               </w:rPr>
-              <w:t xml:space="preserve">Continuous Innovation Engine — Horizon Innovation Council driving sustained value beyond steady state.</w:t>
+              <w:t xml:space="preserve">Continuous Innovation Engine — Horizon Transformation Office driving sustained value beyond steady state.</w:t>
             </w:r>
           </w:p>
           <w:p>
@@ -1203,6 +1203,34 @@
                       <w:szCs w:val="19"/>
                     </w:rPr>
                     <w:t xml:space="preserve">• Leader in Enterprise Software Quality &amp; Testing</w:t>
+                  </w:r>
+                </w:p>
+                <w:p>
+                  <w:pPr>
+                    <w:spacing w:after="60"/>
+                  </w:pPr>
+                  <w:r>
+                    <w:rPr>
+                      <w:rFonts w:ascii="Calibri" w:cs="Calibri" w:eastAsia="Calibri" w:hAnsi="Calibri"/>
+                      <w:color w:val="21272A"/>
+                      <w:sz w:val="19"/>
+                      <w:szCs w:val="19"/>
+                    </w:rPr>
+                    <w:t xml:space="preserve">• Enterprise partnerships with AWS, Salesforce and IBM Technology</w:t>
+                  </w:r>
+                </w:p>
+                <w:p>
+                  <w:pPr>
+                    <w:spacing w:after="60"/>
+                  </w:pPr>
+                  <w:r>
+                    <w:rPr>
+                      <w:rFonts w:ascii="Calibri" w:cs="Calibri" w:eastAsia="Calibri" w:hAnsi="Calibri"/>
+                      <w:color w:val="21272A"/>
+                      <w:sz w:val="19"/>
+                      <w:szCs w:val="19"/>
+                    </w:rPr>
+                    <w:t xml:space="preserve">• IBM's client-0 success story which saved IBM ~3.4B USD</w:t>
                   </w:r>
                 </w:p>
               </w:tc>
@@ -1640,7 +1668,7 @@
                 <w:sz w:val="20"/>
                 <w:szCs w:val="20"/>
               </w:rPr>
-              <w:t xml:space="preserve">AI tools to drive application modernisation across the portfolio.</w:t>
+              <w:t xml:space="preserve">AI tools to drive Agile application modernization across the portfolio.</w:t>
             </w:r>
           </w:p>
           <w:p>
@@ -3425,7 +3453,7 @@
                       <w:sz w:val="19"/>
                       <w:szCs w:val="19"/>
                     </w:rPr>
-                    <w:t xml:space="preserve">• HIPAA-compliant — no PHI in demonstration mode</w:t>
+                    <w:t xml:space="preserve">• HIPAA-compliant — no PHI data in the command center</w:t>
                   </w:r>
                 </w:p>
                 <w:p>
@@ -3970,7 +3998,6 @@
             <w:tblGrid>
               <w:gridCol w:w="100"/>
               <w:gridCol w:w="100"/>
-              <w:gridCol w:w="100"/>
             </w:tblGrid>
             <w:tr>
               <w:trPr>
@@ -3978,7 +4005,7 @@
               </w:trPr>
               <w:tc>
                 <w:tcPr>
-                  <w:tcW w:type="dxa" w:w="2800"/>
+                  <w:tcW w:type="dxa" w:w="4000"/>
                   <w:shd w:fill="001141" w:val="clear"/>
                   <w:tcMar>
                     <w:top w:type="dxa" w:w="60"/>
@@ -4007,7 +4034,7 @@
               </w:tc>
               <w:tc>
                 <w:tcPr>
-                  <w:tcW w:type="dxa" w:w="1800"/>
+                  <w:tcW w:type="dxa" w:w="2960"/>
                   <w:shd w:fill="001141" w:val="clear"/>
                   <w:tcMar>
                     <w:top w:type="dxa" w:w="60"/>
@@ -4030,35 +4057,6 @@
                       <w:sz w:val="19"/>
                       <w:szCs w:val="19"/>
                     </w:rPr>
-                    <w:t xml:space="preserve">Baseline</w:t>
-                  </w:r>
-                </w:p>
-              </w:tc>
-              <w:tc>
-                <w:tcPr>
-                  <w:tcW w:type="dxa" w:w="2400"/>
-                  <w:shd w:fill="001141" w:val="clear"/>
-                  <w:tcMar>
-                    <w:top w:type="dxa" w:w="60"/>
-                    <w:left w:type="dxa" w:w="80"/>
-                    <w:bottom w:type="dxa" w:w="60"/>
-                    <w:right w:type="dxa" w:w="80"/>
-                  </w:tcMar>
-                </w:tcPr>
-                <w:p>
-                  <w:pPr>
-                    <w:spacing w:after="60" w:before="60"/>
-                    <w:jc w:val="center"/>
-                  </w:pPr>
-                  <w:r>
-                    <w:rPr>
-                      <w:rFonts w:ascii="Calibri" w:cs="Calibri" w:eastAsia="Calibri" w:hAnsi="Calibri"/>
-                      <w:b/>
-                      <w:bCs/>
-                      <w:color w:val="FFFFFF"/>
-                      <w:sz w:val="19"/>
-                      <w:szCs w:val="19"/>
-                    </w:rPr>
                     <w:t xml:space="preserve">With AIOps</w:t>
                   </w:r>
                 </w:p>
@@ -4067,7 +4065,7 @@
             <w:tr>
               <w:tc>
                 <w:tcPr>
-                  <w:tcW w:type="dxa" w:w="2800"/>
+                  <w:tcW w:type="dxa" w:w="4000"/>
                   <w:shd w:fill="FFFFFF" w:val="clear"/>
                   <w:tcMar>
                     <w:top w:type="dxa" w:w="50"/>
@@ -4096,7 +4094,7 @@
               </w:tc>
               <w:tc>
                 <w:tcPr>
-                  <w:tcW w:type="dxa" w:w="1800"/>
+                  <w:tcW w:type="dxa" w:w="2960"/>
                   <w:shd w:fill="FFFFFF" w:val="clear"/>
                   <w:tcMar>
                     <w:top w:type="dxa" w:w="50"/>
@@ -4117,13 +4115,73 @@
                       <w:sz w:val="19"/>
                       <w:szCs w:val="19"/>
                     </w:rPr>
-                    <w:t xml:space="preserve">4.2 hrs</w:t>
+                    <w:t xml:space="preserve">&lt; 1.8 hrs</w:t>
+                  </w:r>
+                </w:p>
+              </w:tc>
+            </w:tr>
+            <w:tr>
+              <w:tc>
+                <w:tcPr>
+                  <w:tcW w:type="dxa" w:w="4000"/>
+                  <w:shd w:fill="EEF4FF" w:val="clear"/>
+                  <w:tcMar>
+                    <w:top w:type="dxa" w:w="50"/>
+                    <w:left w:type="dxa" w:w="80"/>
+                    <w:bottom w:type="dxa" w:w="50"/>
+                    <w:right w:type="dxa" w:w="80"/>
+                  </w:tcMar>
+                  <w:vAlign w:val="center"/>
+                </w:tcPr>
+                <w:p>
+                  <w:pPr>
+                    <w:spacing w:after="50" w:before="50"/>
+                  </w:pPr>
+                  <w:r>
+                    <w:rPr>
+                      <w:rFonts w:ascii="Calibri" w:cs="Calibri" w:eastAsia="Calibri" w:hAnsi="Calibri"/>
+                      <w:b/>
+                      <w:bCs/>
+                      <w:color w:val="21272A"/>
+                      <w:sz w:val="19"/>
+                      <w:szCs w:val="19"/>
+                    </w:rPr>
+                    <w:t xml:space="preserve">Alert Noise per Shift</w:t>
                   </w:r>
                 </w:p>
               </w:tc>
               <w:tc>
                 <w:tcPr>
-                  <w:tcW w:type="dxa" w:w="2400"/>
+                  <w:tcW w:type="dxa" w:w="2960"/>
+                  <w:shd w:fill="EEF4FF" w:val="clear"/>
+                  <w:tcMar>
+                    <w:top w:type="dxa" w:w="50"/>
+                    <w:left w:type="dxa" w:w="80"/>
+                    <w:bottom w:type="dxa" w:w="50"/>
+                    <w:right w:type="dxa" w:w="80"/>
+                  </w:tcMar>
+                  <w:vAlign w:val="center"/>
+                </w:tcPr>
+                <w:p>
+                  <w:pPr>
+                    <w:spacing w:after="50" w:before="50"/>
+                  </w:pPr>
+                  <w:r>
+                    <w:rPr>
+                      <w:rFonts w:ascii="Calibri" w:cs="Calibri" w:eastAsia="Calibri" w:hAnsi="Calibri"/>
+                      <w:color w:val="21272A"/>
+                      <w:sz w:val="19"/>
+                      <w:szCs w:val="19"/>
+                    </w:rPr>
+                    <w:t xml:space="preserve">&gt; 60% Reduced</w:t>
+                  </w:r>
+                </w:p>
+              </w:tc>
+            </w:tr>
+            <w:tr>
+              <w:tc>
+                <w:tcPr>
+                  <w:tcW w:type="dxa" w:w="4000"/>
                   <w:shd w:fill="FFFFFF" w:val="clear"/>
                   <w:tcMar>
                     <w:top w:type="dxa" w:w="50"/>
@@ -4140,11 +4198,40 @@
                   <w:r>
                     <w:rPr>
                       <w:rFonts w:ascii="Calibri" w:cs="Calibri" w:eastAsia="Calibri" w:hAnsi="Calibri"/>
+                      <w:b/>
+                      <w:bCs/>
                       <w:color w:val="21272A"/>
                       <w:sz w:val="19"/>
                       <w:szCs w:val="19"/>
                     </w:rPr>
-                    <w:t xml:space="preserve">&lt; 1.8 hrs</w:t>
+                    <w:t xml:space="preserve">P3/P4 Auto-Resolution</w:t>
+                  </w:r>
+                </w:p>
+              </w:tc>
+              <w:tc>
+                <w:tcPr>
+                  <w:tcW w:type="dxa" w:w="2960"/>
+                  <w:shd w:fill="FFFFFF" w:val="clear"/>
+                  <w:tcMar>
+                    <w:top w:type="dxa" w:w="50"/>
+                    <w:left w:type="dxa" w:w="80"/>
+                    <w:bottom w:type="dxa" w:w="50"/>
+                    <w:right w:type="dxa" w:w="80"/>
+                  </w:tcMar>
+                  <w:vAlign w:val="center"/>
+                </w:tcPr>
+                <w:p>
+                  <w:pPr>
+                    <w:spacing w:after="50" w:before="50"/>
+                  </w:pPr>
+                  <w:r>
+                    <w:rPr>
+                      <w:rFonts w:ascii="Calibri" w:cs="Calibri" w:eastAsia="Calibri" w:hAnsi="Calibri"/>
+                      <w:color w:val="21272A"/>
+                      <w:sz w:val="19"/>
+                      <w:szCs w:val="19"/>
+                    </w:rPr>
+                    <w:t xml:space="preserve">&gt; 74%</w:t>
                   </w:r>
                 </w:p>
               </w:tc>
@@ -4152,7 +4239,7 @@
             <w:tr>
               <w:tc>
                 <w:tcPr>
-                  <w:tcW w:type="dxa" w:w="2800"/>
+                  <w:tcW w:type="dxa" w:w="4000"/>
                   <w:shd w:fill="EEF4FF" w:val="clear"/>
                   <w:tcMar>
                     <w:top w:type="dxa" w:w="50"/>
@@ -4175,13 +4262,13 @@
                       <w:sz w:val="19"/>
                       <w:szCs w:val="19"/>
                     </w:rPr>
-                    <w:t xml:space="preserve">Alert Noise per Shift</w:t>
+                    <w:t xml:space="preserve">Change Failure Rate</w:t>
                   </w:r>
                 </w:p>
               </w:tc>
               <w:tc>
                 <w:tcPr>
-                  <w:tcW w:type="dxa" w:w="1800"/>
+                  <w:tcW w:type="dxa" w:w="2960"/>
                   <w:shd w:fill="EEF4FF" w:val="clear"/>
                   <w:tcMar>
                     <w:top w:type="dxa" w:w="50"/>
@@ -4202,13 +4289,73 @@
                       <w:sz w:val="19"/>
                       <w:szCs w:val="19"/>
                     </w:rPr>
-                    <w:t xml:space="preserve">High</w:t>
+                    <w:t xml:space="preserve">40% Reduction</w:t>
+                  </w:r>
+                </w:p>
+              </w:tc>
+            </w:tr>
+            <w:tr>
+              <w:tc>
+                <w:tcPr>
+                  <w:tcW w:type="dxa" w:w="4000"/>
+                  <w:shd w:fill="FFFFFF" w:val="clear"/>
+                  <w:tcMar>
+                    <w:top w:type="dxa" w:w="50"/>
+                    <w:left w:type="dxa" w:w="80"/>
+                    <w:bottom w:type="dxa" w:w="50"/>
+                    <w:right w:type="dxa" w:w="80"/>
+                  </w:tcMar>
+                  <w:vAlign w:val="center"/>
+                </w:tcPr>
+                <w:p>
+                  <w:pPr>
+                    <w:spacing w:after="50" w:before="50"/>
+                  </w:pPr>
+                  <w:r>
+                    <w:rPr>
+                      <w:rFonts w:ascii="Calibri" w:cs="Calibri" w:eastAsia="Calibri" w:hAnsi="Calibri"/>
+                      <w:b/>
+                      <w:bCs/>
+                      <w:color w:val="21272A"/>
+                      <w:sz w:val="19"/>
+                      <w:szCs w:val="19"/>
+                    </w:rPr>
+                    <w:t xml:space="preserve">System Availability</w:t>
                   </w:r>
                 </w:p>
               </w:tc>
               <w:tc>
                 <w:tcPr>
-                  <w:tcW w:type="dxa" w:w="2400"/>
+                  <w:tcW w:type="dxa" w:w="2960"/>
+                  <w:shd w:fill="FFFFFF" w:val="clear"/>
+                  <w:tcMar>
+                    <w:top w:type="dxa" w:w="50"/>
+                    <w:left w:type="dxa" w:w="80"/>
+                    <w:bottom w:type="dxa" w:w="50"/>
+                    <w:right w:type="dxa" w:w="80"/>
+                  </w:tcMar>
+                  <w:vAlign w:val="center"/>
+                </w:tcPr>
+                <w:p>
+                  <w:pPr>
+                    <w:spacing w:after="50" w:before="50"/>
+                  </w:pPr>
+                  <w:r>
+                    <w:rPr>
+                      <w:rFonts w:ascii="Calibri" w:cs="Calibri" w:eastAsia="Calibri" w:hAnsi="Calibri"/>
+                      <w:color w:val="21272A"/>
+                      <w:sz w:val="19"/>
+                      <w:szCs w:val="19"/>
+                    </w:rPr>
+                    <w:t xml:space="preserve">99.95%</w:t>
+                  </w:r>
+                </w:p>
+              </w:tc>
+            </w:tr>
+            <w:tr>
+              <w:tc>
+                <w:tcPr>
+                  <w:tcW w:type="dxa" w:w="4000"/>
                   <w:shd w:fill="EEF4FF" w:val="clear"/>
                   <w:tcMar>
                     <w:top w:type="dxa" w:w="50"/>
@@ -4225,104 +4372,19 @@
                   <w:r>
                     <w:rPr>
                       <w:rFonts w:ascii="Calibri" w:cs="Calibri" w:eastAsia="Calibri" w:hAnsi="Calibri"/>
-                      <w:color w:val="21272A"/>
-                      <w:sz w:val="19"/>
-                      <w:szCs w:val="19"/>
-                    </w:rPr>
-                    <w:t xml:space="preserve">&gt; 60% Reduced</w:t>
-                  </w:r>
-                </w:p>
-              </w:tc>
-            </w:tr>
-            <w:tr>
-              <w:tc>
-                <w:tcPr>
-                  <w:tcW w:type="dxa" w:w="2800"/>
-                  <w:shd w:fill="FFFFFF" w:val="clear"/>
-                  <w:tcMar>
-                    <w:top w:type="dxa" w:w="50"/>
-                    <w:left w:type="dxa" w:w="80"/>
-                    <w:bottom w:type="dxa" w:w="50"/>
-                    <w:right w:type="dxa" w:w="80"/>
-                  </w:tcMar>
-                  <w:vAlign w:val="center"/>
-                </w:tcPr>
-                <w:p>
-                  <w:pPr>
-                    <w:spacing w:after="50" w:before="50"/>
-                  </w:pPr>
-                  <w:r>
-                    <w:rPr>
-                      <w:rFonts w:ascii="Calibri" w:cs="Calibri" w:eastAsia="Calibri" w:hAnsi="Calibri"/>
                       <w:b/>
                       <w:bCs/>
                       <w:color w:val="21272A"/>
                       <w:sz w:val="19"/>
                       <w:szCs w:val="19"/>
                     </w:rPr>
-                    <w:t xml:space="preserve">P3/P4 Auto-Resolution</w:t>
+                    <w:t xml:space="preserve">Ops Manual Triage Hours</w:t>
                   </w:r>
                 </w:p>
               </w:tc>
               <w:tc>
                 <w:tcPr>
-                  <w:tcW w:type="dxa" w:w="1800"/>
-                  <w:shd w:fill="FFFFFF" w:val="clear"/>
-                  <w:tcMar>
-                    <w:top w:type="dxa" w:w="50"/>
-                    <w:left w:type="dxa" w:w="80"/>
-                    <w:bottom w:type="dxa" w:w="50"/>
-                    <w:right w:type="dxa" w:w="80"/>
-                  </w:tcMar>
-                  <w:vAlign w:val="center"/>
-                </w:tcPr>
-                <w:p>
-                  <w:pPr>
-                    <w:spacing w:after="50" w:before="50"/>
-                  </w:pPr>
-                  <w:r>
-                    <w:rPr>
-                      <w:rFonts w:ascii="Calibri" w:cs="Calibri" w:eastAsia="Calibri" w:hAnsi="Calibri"/>
-                      <w:color w:val="21272A"/>
-                      <w:sz w:val="19"/>
-                      <w:szCs w:val="19"/>
-                    </w:rPr>
-                    <w:t xml:space="preserve">&lt; 10%</w:t>
-                  </w:r>
-                </w:p>
-              </w:tc>
-              <w:tc>
-                <w:tcPr>
-                  <w:tcW w:type="dxa" w:w="2400"/>
-                  <w:shd w:fill="FFFFFF" w:val="clear"/>
-                  <w:tcMar>
-                    <w:top w:type="dxa" w:w="50"/>
-                    <w:left w:type="dxa" w:w="80"/>
-                    <w:bottom w:type="dxa" w:w="50"/>
-                    <w:right w:type="dxa" w:w="80"/>
-                  </w:tcMar>
-                  <w:vAlign w:val="center"/>
-                </w:tcPr>
-                <w:p>
-                  <w:pPr>
-                    <w:spacing w:after="50" w:before="50"/>
-                  </w:pPr>
-                  <w:r>
-                    <w:rPr>
-                      <w:rFonts w:ascii="Calibri" w:cs="Calibri" w:eastAsia="Calibri" w:hAnsi="Calibri"/>
-                      <w:color w:val="21272A"/>
-                      <w:sz w:val="19"/>
-                      <w:szCs w:val="19"/>
-                    </w:rPr>
-                    <w:t xml:space="preserve">&gt; 74%</w:t>
-                  </w:r>
-                </w:p>
-              </w:tc>
-            </w:tr>
-            <w:tr>
-              <w:tc>
-                <w:tcPr>
-                  <w:tcW w:type="dxa" w:w="2800"/>
+                  <w:tcW w:type="dxa" w:w="2960"/>
                   <w:shd w:fill="EEF4FF" w:val="clear"/>
                   <w:tcMar>
                     <w:top w:type="dxa" w:w="50"/>
@@ -4339,232 +4401,6 @@
                   <w:r>
                     <w:rPr>
                       <w:rFonts w:ascii="Calibri" w:cs="Calibri" w:eastAsia="Calibri" w:hAnsi="Calibri"/>
-                      <w:b/>
-                      <w:bCs/>
-                      <w:color w:val="21272A"/>
-                      <w:sz w:val="19"/>
-                      <w:szCs w:val="19"/>
-                    </w:rPr>
-                    <w:t xml:space="preserve">Change Failure Rate</w:t>
-                  </w:r>
-                </w:p>
-              </w:tc>
-              <w:tc>
-                <w:tcPr>
-                  <w:tcW w:type="dxa" w:w="1800"/>
-                  <w:shd w:fill="EEF4FF" w:val="clear"/>
-                  <w:tcMar>
-                    <w:top w:type="dxa" w:w="50"/>
-                    <w:left w:type="dxa" w:w="80"/>
-                    <w:bottom w:type="dxa" w:w="50"/>
-                    <w:right w:type="dxa" w:w="80"/>
-                  </w:tcMar>
-                  <w:vAlign w:val="center"/>
-                </w:tcPr>
-                <w:p>
-                  <w:pPr>
-                    <w:spacing w:after="50" w:before="50"/>
-                  </w:pPr>
-                  <w:r>
-                    <w:rPr>
-                      <w:rFonts w:ascii="Calibri" w:cs="Calibri" w:eastAsia="Calibri" w:hAnsi="Calibri"/>
-                      <w:color w:val="21272A"/>
-                      <w:sz w:val="19"/>
-                      <w:szCs w:val="19"/>
-                    </w:rPr>
-                    <w:t xml:space="preserve">Baseline</w:t>
-                  </w:r>
-                </w:p>
-              </w:tc>
-              <w:tc>
-                <w:tcPr>
-                  <w:tcW w:type="dxa" w:w="2400"/>
-                  <w:shd w:fill="EEF4FF" w:val="clear"/>
-                  <w:tcMar>
-                    <w:top w:type="dxa" w:w="50"/>
-                    <w:left w:type="dxa" w:w="80"/>
-                    <w:bottom w:type="dxa" w:w="50"/>
-                    <w:right w:type="dxa" w:w="80"/>
-                  </w:tcMar>
-                  <w:vAlign w:val="center"/>
-                </w:tcPr>
-                <w:p>
-                  <w:pPr>
-                    <w:spacing w:after="50" w:before="50"/>
-                  </w:pPr>
-                  <w:r>
-                    <w:rPr>
-                      <w:rFonts w:ascii="Calibri" w:cs="Calibri" w:eastAsia="Calibri" w:hAnsi="Calibri"/>
-                      <w:color w:val="21272A"/>
-                      <w:sz w:val="19"/>
-                      <w:szCs w:val="19"/>
-                    </w:rPr>
-                    <w:t xml:space="preserve">40% Reduction</w:t>
-                  </w:r>
-                </w:p>
-              </w:tc>
-            </w:tr>
-            <w:tr>
-              <w:tc>
-                <w:tcPr>
-                  <w:tcW w:type="dxa" w:w="2800"/>
-                  <w:shd w:fill="FFFFFF" w:val="clear"/>
-                  <w:tcMar>
-                    <w:top w:type="dxa" w:w="50"/>
-                    <w:left w:type="dxa" w:w="80"/>
-                    <w:bottom w:type="dxa" w:w="50"/>
-                    <w:right w:type="dxa" w:w="80"/>
-                  </w:tcMar>
-                  <w:vAlign w:val="center"/>
-                </w:tcPr>
-                <w:p>
-                  <w:pPr>
-                    <w:spacing w:after="50" w:before="50"/>
-                  </w:pPr>
-                  <w:r>
-                    <w:rPr>
-                      <w:rFonts w:ascii="Calibri" w:cs="Calibri" w:eastAsia="Calibri" w:hAnsi="Calibri"/>
-                      <w:b/>
-                      <w:bCs/>
-                      <w:color w:val="21272A"/>
-                      <w:sz w:val="19"/>
-                      <w:szCs w:val="19"/>
-                    </w:rPr>
-                    <w:t xml:space="preserve">System Availability</w:t>
-                  </w:r>
-                </w:p>
-              </w:tc>
-              <w:tc>
-                <w:tcPr>
-                  <w:tcW w:type="dxa" w:w="1800"/>
-                  <w:shd w:fill="FFFFFF" w:val="clear"/>
-                  <w:tcMar>
-                    <w:top w:type="dxa" w:w="50"/>
-                    <w:left w:type="dxa" w:w="80"/>
-                    <w:bottom w:type="dxa" w:w="50"/>
-                    <w:right w:type="dxa" w:w="80"/>
-                  </w:tcMar>
-                  <w:vAlign w:val="center"/>
-                </w:tcPr>
-                <w:p>
-                  <w:pPr>
-                    <w:spacing w:after="50" w:before="50"/>
-                  </w:pPr>
-                  <w:r>
-                    <w:rPr>
-                      <w:rFonts w:ascii="Calibri" w:cs="Calibri" w:eastAsia="Calibri" w:hAnsi="Calibri"/>
-                      <w:color w:val="21272A"/>
-                      <w:sz w:val="19"/>
-                      <w:szCs w:val="19"/>
-                    </w:rPr>
-                    <w:t xml:space="preserve">99.7%</w:t>
-                  </w:r>
-                </w:p>
-              </w:tc>
-              <w:tc>
-                <w:tcPr>
-                  <w:tcW w:type="dxa" w:w="2400"/>
-                  <w:shd w:fill="FFFFFF" w:val="clear"/>
-                  <w:tcMar>
-                    <w:top w:type="dxa" w:w="50"/>
-                    <w:left w:type="dxa" w:w="80"/>
-                    <w:bottom w:type="dxa" w:w="50"/>
-                    <w:right w:type="dxa" w:w="80"/>
-                  </w:tcMar>
-                  <w:vAlign w:val="center"/>
-                </w:tcPr>
-                <w:p>
-                  <w:pPr>
-                    <w:spacing w:after="50" w:before="50"/>
-                  </w:pPr>
-                  <w:r>
-                    <w:rPr>
-                      <w:rFonts w:ascii="Calibri" w:cs="Calibri" w:eastAsia="Calibri" w:hAnsi="Calibri"/>
-                      <w:color w:val="21272A"/>
-                      <w:sz w:val="19"/>
-                      <w:szCs w:val="19"/>
-                    </w:rPr>
-                    <w:t xml:space="preserve">99.95%</w:t>
-                  </w:r>
-                </w:p>
-              </w:tc>
-            </w:tr>
-            <w:tr>
-              <w:tc>
-                <w:tcPr>
-                  <w:tcW w:type="dxa" w:w="2800"/>
-                  <w:shd w:fill="EEF4FF" w:val="clear"/>
-                  <w:tcMar>
-                    <w:top w:type="dxa" w:w="50"/>
-                    <w:left w:type="dxa" w:w="80"/>
-                    <w:bottom w:type="dxa" w:w="50"/>
-                    <w:right w:type="dxa" w:w="80"/>
-                  </w:tcMar>
-                  <w:vAlign w:val="center"/>
-                </w:tcPr>
-                <w:p>
-                  <w:pPr>
-                    <w:spacing w:after="50" w:before="50"/>
-                  </w:pPr>
-                  <w:r>
-                    <w:rPr>
-                      <w:rFonts w:ascii="Calibri" w:cs="Calibri" w:eastAsia="Calibri" w:hAnsi="Calibri"/>
-                      <w:b/>
-                      <w:bCs/>
-                      <w:color w:val="21272A"/>
-                      <w:sz w:val="19"/>
-                      <w:szCs w:val="19"/>
-                    </w:rPr>
-                    <w:t xml:space="preserve">Ops Manual Triage Hours</w:t>
-                  </w:r>
-                </w:p>
-              </w:tc>
-              <w:tc>
-                <w:tcPr>
-                  <w:tcW w:type="dxa" w:w="1800"/>
-                  <w:shd w:fill="EEF4FF" w:val="clear"/>
-                  <w:tcMar>
-                    <w:top w:type="dxa" w:w="50"/>
-                    <w:left w:type="dxa" w:w="80"/>
-                    <w:bottom w:type="dxa" w:w="50"/>
-                    <w:right w:type="dxa" w:w="80"/>
-                  </w:tcMar>
-                  <w:vAlign w:val="center"/>
-                </w:tcPr>
-                <w:p>
-                  <w:pPr>
-                    <w:spacing w:after="50" w:before="50"/>
-                  </w:pPr>
-                  <w:r>
-                    <w:rPr>
-                      <w:rFonts w:ascii="Calibri" w:cs="Calibri" w:eastAsia="Calibri" w:hAnsi="Calibri"/>
-                      <w:color w:val="21272A"/>
-                      <w:sz w:val="19"/>
-                      <w:szCs w:val="19"/>
-                    </w:rPr>
-                    <w:t xml:space="preserve">Full load</w:t>
-                  </w:r>
-                </w:p>
-              </w:tc>
-              <w:tc>
-                <w:tcPr>
-                  <w:tcW w:type="dxa" w:w="2400"/>
-                  <w:shd w:fill="EEF4FF" w:val="clear"/>
-                  <w:tcMar>
-                    <w:top w:type="dxa" w:w="50"/>
-                    <w:left w:type="dxa" w:w="80"/>
-                    <w:bottom w:type="dxa" w:w="50"/>
-                    <w:right w:type="dxa" w:w="80"/>
-                  </w:tcMar>
-                  <w:vAlign w:val="center"/>
-                </w:tcPr>
-                <w:p>
-                  <w:pPr>
-                    <w:spacing w:after="50" w:before="50"/>
-                  </w:pPr>
-                  <w:r>
-                    <w:rPr>
-                      <w:rFonts w:ascii="Calibri" w:cs="Calibri" w:eastAsia="Calibri" w:hAnsi="Calibri"/>
                       <w:color w:val="21272A"/>
                       <w:sz w:val="19"/>
                       <w:szCs w:val="19"/>
@@ -4603,7 +4439,7 @@
                 <w:sz w:val="22"/>
                 <w:szCs w:val="22"/>
               </w:rPr>
-              <w:t xml:space="preserve">Built on Horizon's AWS Stack</w:t>
+              <w:t xml:space="preserve">Built for Horizon's AWS Stack</w:t>
             </w:r>
           </w:p>
           <w:p>
@@ -4765,7 +4601,7 @@
                       <w:sz w:val="22"/>
                       <w:szCs w:val="22"/>
                     </w:rPr>
-                    <w:t xml:space="preserve">✓  ARB Approval Secured</w:t>
+                    <w:t xml:space="preserve">✓  Horizon's ARB Approval Secured</w:t>
                   </w:r>
                 </w:p>
                 <w:p>
@@ -4813,7 +4649,7 @@
                       <w:sz w:val="22"/>
                       <w:szCs w:val="22"/>
                     </w:rPr>
-                    <w:t xml:space="preserve">✓  GenAI Board Approved</w:t>
+                    <w:t xml:space="preserve">✓  Horizon's GenAI Board Approved</w:t>
                   </w:r>
                 </w:p>
                 <w:p>
@@ -4948,7 +4784,7 @@
           <w:sz w:val="22"/>
           <w:szCs w:val="22"/>
         </w:rPr>
-        <w:t xml:space="preserve">ICOE Modernization, Mainframe Migration &amp; Application Rationalization</w:t>
+        <w:t xml:space="preserve">Integration Modernization, Mainframe Migration &amp; Application Rationalization</w:t>
       </w:r>
     </w:p>
     <w:tbl>
@@ -4995,7 +4831,7 @@
                 <w:sz w:val="26"/>
                 <w:szCs w:val="26"/>
               </w:rPr>
-              <w:t xml:space="preserve">ICOE Modernization</w:t>
+              <w:t xml:space="preserve">Integration Modernization</w:t>
             </w:r>
           </w:p>
           <w:p>
@@ -5010,7 +4846,7 @@
                 <w:sz w:val="20"/>
                 <w:szCs w:val="20"/>
               </w:rPr>
-              <w:t xml:space="preserve">IBM's Integration Centre of Excellence (ICOE) Modernization program restructures IBM's delivery organization to align with Horizon's evolving platform landscape — introducing DevSecOps pipelines, product-centric engineering squads, and shared services for API management, identity, and data integration.</w:t>
+              <w:t xml:space="preserve">IBM's Integration Modernization program restructures IBM's delivery organization to align with Horizon's evolving platform landscape — introducing DevSecOps pipelines, product-centric engineering squads, and shared services for API management, identity, and data integration.</w:t>
             </w:r>
           </w:p>
           <w:p>
@@ -5176,7 +5012,7 @@
                 <w:sz w:val="20"/>
                 <w:szCs w:val="20"/>
               </w:rPr>
-              <w:t xml:space="preserve">IBM will conduct a structured assessment of Horizon's ~500 application portfolio using the BUILD ONCE, BENEFIT (BOB) framework — identifying candidates for decommission, consolidation, cloud migration, or AI-augmented modernization.</w:t>
+              <w:t xml:space="preserve">IBM will conduct a structured assessment of Horizon's ~500 application portfolio using Texture and other IBM assets and accelerators like ICCA — identifying candidates for decommission, consolidation, cloud migration, or AI-augmented modernization.</w:t>
             </w:r>
           </w:p>
         </w:tc>
@@ -6042,7 +5878,7 @@
                 <w:sz w:val="48"/>
                 <w:szCs w:val="48"/>
               </w:rPr>
-              <w:t xml:space="preserve">n-2</w:t>
+              <w:t xml:space="preserve">n-1</w:t>
             </w:r>
           </w:p>
           <w:p>
@@ -10426,7 +10262,7 @@
                       <w:sz w:val="19"/>
                       <w:szCs w:val="19"/>
                     </w:rPr>
-                    <w:t xml:space="preserve">• Predictive surge detection alerts leadership 72+ hours ahead</w:t>
+                    <w:t xml:space="preserve">• Predictive surge detection alerts leadership ahead</w:t>
                   </w:r>
                 </w:p>
                 <w:p>
@@ -12934,7 +12770,7 @@
                 <w:sz w:val="23"/>
                 <w:szCs w:val="23"/>
               </w:rPr>
-              <w:t xml:space="preserve"> that brings together AI-first operating platform capability, deep healthcare payer domain expertise, proven global delivery scale, and a willingness to </w:t>
+              <w:t xml:space="preserve"> that brings together AI-first operating platform capability, Horizon's institutional knowledge, deep healthcare payer domain expertise, proven global delivery scale, and a willingness to </w:t>
             </w:r>
             <w:r>
               <w:rPr>
@@ -14476,7 +14312,7 @@
                 <w:sz w:val="26"/>
                 <w:szCs w:val="26"/>
               </w:rPr>
-              <w:t xml:space="preserve">Mainframe Modernization — IBM as Risk Sharer</w:t>
+              <w:t xml:space="preserve">Mainframe Modernization — IBM as a Partner with AWS</w:t>
             </w:r>
           </w:p>
           <w:p>
@@ -14542,150 +14378,6 @@
                 <w:szCs w:val="20"/>
               </w:rPr>
               <w:t xml:space="preserve">The Integration Centre of Excellence Modernization is IBM's commitment to restructure the delivery organisation to match Horizon's evolving platform landscape. This means product-centric engineering squads, DevSecOps pipelines, API management simplification, and observability-first SRE practices — all delivered as a sustained organisational evolution, not a one-time project.</w:t>
-            </w:r>
-          </w:p>
-          <w:p>
-            <w:pPr>
-              <w:pBdr>
-                <w:left w:val="single" w:color="0F62FE" w:sz="20" w:space="8"/>
-              </w:pBdr>
-              <w:spacing w:after="80" w:before="180"/>
-              <w:ind w:left="120"/>
-            </w:pPr>
-            <w:r>
-              <w:rPr>
-                <w:rFonts w:ascii="Calibri" w:cs="Calibri" w:eastAsia="Calibri" w:hAnsi="Calibri"/>
-                <w:b/>
-                <w:bCs/>
-                <w:color w:val="0F62FE"/>
-                <w:sz w:val="22"/>
-                <w:szCs w:val="22"/>
-              </w:rPr>
-              <w:t xml:space="preserve">Other Strategic Programs IBM Will Co-Invest In</w:t>
-            </w:r>
-          </w:p>
-          <w:p>
-            <w:pPr>
-              <w:pStyle w:val="ListParagraph"/>
-              <w:numPr>
-                <w:ilvl w:val="0"/>
-                <w:numId w:val="1"/>
-              </w:numPr>
-              <w:spacing w:after="80"/>
-              <w:ind w:left="360"/>
-            </w:pPr>
-            <w:r>
-              <w:rPr>
-                <w:rFonts w:ascii="Calibri" w:cs="Calibri" w:eastAsia="Calibri" w:hAnsi="Calibri"/>
-                <w:b/>
-                <w:bCs/>
-                <w:color w:val="0F62FE"/>
-                <w:sz w:val="20"/>
-                <w:szCs w:val="20"/>
-              </w:rPr>
-              <w:t xml:space="preserve">CoreEnroll Membership Modernization: </w:t>
-            </w:r>
-            <w:r>
-              <w:rPr>
-                <w:rFonts w:ascii="Calibri" w:cs="Calibri" w:eastAsia="Calibri" w:hAnsi="Calibri"/>
-                <w:color w:val="21272A"/>
-                <w:sz w:val="20"/>
-                <w:szCs w:val="20"/>
-              </w:rPr>
-              <w:t xml:space="preserve">Legacy enrollment platform to cloud-native migration with 50% eligibility processing speed improvement target.</w:t>
-            </w:r>
-          </w:p>
-          <w:p>
-            <w:pPr>
-              <w:pStyle w:val="ListParagraph"/>
-              <w:numPr>
-                <w:ilvl w:val="0"/>
-                <w:numId w:val="1"/>
-              </w:numPr>
-              <w:spacing w:after="80"/>
-              <w:ind w:left="360"/>
-            </w:pPr>
-            <w:r>
-              <w:rPr>
-                <w:rFonts w:ascii="Calibri" w:cs="Calibri" w:eastAsia="Calibri" w:hAnsi="Calibri"/>
-                <w:b/>
-                <w:bCs/>
-                <w:color w:val="0F62FE"/>
-                <w:sz w:val="20"/>
-                <w:szCs w:val="20"/>
-              </w:rPr>
-              <w:t xml:space="preserve">RateVault Fee Schedule Management: </w:t>
-            </w:r>
-            <w:r>
-              <w:rPr>
-                <w:rFonts w:ascii="Calibri" w:cs="Calibri" w:eastAsia="Calibri" w:hAnsi="Calibri"/>
-                <w:color w:val="21272A"/>
-                <w:sz w:val="20"/>
-                <w:szCs w:val="20"/>
-              </w:rPr>
-              <w:t xml:space="preserve">.NET framework upgrade and LTS compliance delivering 25% rate processing efficiency improvement.</w:t>
-            </w:r>
-          </w:p>
-          <w:p>
-            <w:pPr>
-              <w:pStyle w:val="ListParagraph"/>
-              <w:numPr>
-                <w:ilvl w:val="0"/>
-                <w:numId w:val="1"/>
-              </w:numPr>
-              <w:spacing w:after="80"/>
-              <w:ind w:left="360"/>
-            </w:pPr>
-            <w:r>
-              <w:rPr>
-                <w:rFonts w:ascii="Calibri" w:cs="Calibri" w:eastAsia="Calibri" w:hAnsi="Calibri"/>
-                <w:b/>
-                <w:bCs/>
-                <w:color w:val="0F62FE"/>
-                <w:sz w:val="20"/>
-                <w:szCs w:val="20"/>
-              </w:rPr>
-              <w:t xml:space="preserve">Document Generation (HLGS): </w:t>
-            </w:r>
-            <w:r>
-              <w:rPr>
-                <w:rFonts w:ascii="Calibri" w:cs="Calibri" w:eastAsia="Calibri" w:hAnsi="Calibri"/>
-                <w:color w:val="21272A"/>
-                <w:sz w:val="20"/>
-                <w:szCs w:val="20"/>
-              </w:rPr>
-              <w:t xml:space="preserve">Modernization of Horizon's Letter Generation System to support digital-first member communications.</w:t>
-            </w:r>
-          </w:p>
-          <w:p>
-            <w:pPr>
-              <w:pStyle w:val="ListParagraph"/>
-              <w:numPr>
-                <w:ilvl w:val="0"/>
-                <w:numId w:val="1"/>
-              </w:numPr>
-              <w:spacing w:after="80"/>
-              <w:ind w:left="360"/>
-            </w:pPr>
-            <w:r>
-              <w:rPr>
-                <w:rFonts w:ascii="Calibri" w:cs="Calibri" w:eastAsia="Calibri" w:hAnsi="Calibri"/>
-                <w:b/>
-                <w:bCs/>
-                <w:color w:val="0F62FE"/>
-                <w:sz w:val="20"/>
-                <w:szCs w:val="20"/>
-              </w:rPr>
-              <w:t xml:space="preserve">GroupRate Application Modernization: </w:t>
-            </w:r>
-            <w:r>
-              <w:rPr>
-                <w:rFonts w:ascii="Calibri" w:cs="Calibri" w:eastAsia="Calibri" w:hAnsi="Calibri"/>
-                <w:color w:val="21272A"/>
-                <w:sz w:val="20"/>
-                <w:szCs w:val="20"/>
-              </w:rPr>
-              <w:t xml:space="preserve">Shared codebase modernization for group rate management across Horizon's commercial portfolio.</w:t>
             </w:r>
           </w:p>
           <w:p>
@@ -14793,12 +14485,11 @@
         <w:gridCol w:w="100"/>
         <w:gridCol w:w="100"/>
         <w:gridCol w:w="100"/>
-        <w:gridCol w:w="100"/>
       </w:tblGrid>
       <w:tr>
         <w:tc>
           <w:tcPr>
-            <w:tcW w:type="dxa" w:w="2268"/>
+            <w:tcW w:type="dxa" w:w="3024"/>
             <w:tcBorders>
               <w:top w:val="single" w:color="FFFFFF" w:sz="0"/>
               <w:left w:val="single" w:color="FFFFFF" w:sz="0"/>
@@ -14826,7 +14517,7 @@
                 <w:sz w:val="48"/>
                 <w:szCs w:val="48"/>
               </w:rPr>
-              <w:t xml:space="preserve">5</w:t>
+              <w:t xml:space="preserve">ICA + AIOps</w:t>
             </w:r>
           </w:p>
           <w:p>
@@ -14841,13 +14532,13 @@
                 <w:sz w:val="17"/>
                 <w:szCs w:val="17"/>
               </w:rPr>
-              <w:t xml:space="preserve">DFD Programme Phases</w:t>
+              <w:t xml:space="preserve">AI-Infused Delivery</w:t>
             </w:r>
           </w:p>
         </w:tc>
         <w:tc>
           <w:tcPr>
-            <w:tcW w:type="dxa" w:w="2268"/>
+            <w:tcW w:type="dxa" w:w="3024"/>
             <w:tcBorders>
               <w:top w:val="single" w:color="FFFFFF" w:sz="0"/>
               <w:left w:val="single" w:color="FFFFFF" w:sz="0"/>
@@ -14871,11 +14562,11 @@
                 <w:rFonts w:ascii="Calibri" w:cs="Calibri" w:eastAsia="Calibri" w:hAnsi="Calibri"/>
                 <w:b/>
                 <w:bCs/>
-                <w:color w:val="009D9A"/>
+                <w:color w:val="001141"/>
                 <w:sz w:val="48"/>
                 <w:szCs w:val="48"/>
               </w:rPr>
-              <w:t xml:space="preserve">COBOL→Java</w:t>
+              <w:t xml:space="preserve">60+</w:t>
             </w:r>
           </w:p>
           <w:p>
@@ -14890,62 +14581,13 @@
                 <w:sz w:val="17"/>
                 <w:szCs w:val="17"/>
               </w:rPr>
-              <w:t xml:space="preserve">AI-Assisted Code Conversion</w:t>
+              <w:t xml:space="preserve">Modernization Initiatives</w:t>
             </w:r>
           </w:p>
         </w:tc>
         <w:tc>
           <w:tcPr>
-            <w:tcW w:type="dxa" w:w="2268"/>
-            <w:tcBorders>
-              <w:top w:val="single" w:color="FFFFFF" w:sz="0"/>
-              <w:left w:val="single" w:color="FFFFFF" w:sz="0"/>
-              <w:bottom w:val="single" w:color="FFFFFF" w:sz="0"/>
-              <w:right w:val="single" w:color="C6C6C6" w:sz="6"/>
-            </w:tcBorders>
-            <w:shd w:fill="F4F4F4" w:val="clear"/>
-            <w:tcMar>
-              <w:top w:type="dxa" w:w="120"/>
-              <w:left w:type="dxa" w:w="80"/>
-              <w:bottom w:type="dxa" w:w="120"/>
-              <w:right w:type="dxa" w:w="80"/>
-            </w:tcMar>
-          </w:tcPr>
-          <w:p>
-            <w:pPr>
-              <w:jc w:val="center"/>
-            </w:pPr>
-            <w:r>
-              <w:rPr>
-                <w:rFonts w:ascii="Calibri" w:cs="Calibri" w:eastAsia="Calibri" w:hAnsi="Calibri"/>
-                <w:b/>
-                <w:bCs/>
-                <w:color w:val="001141"/>
-                <w:sz w:val="48"/>
-                <w:szCs w:val="48"/>
-              </w:rPr>
-              <w:t xml:space="preserve">60+</w:t>
-            </w:r>
-          </w:p>
-          <w:p>
-            <w:pPr>
-              <w:spacing w:after="40"/>
-              <w:jc w:val="center"/>
-            </w:pPr>
-            <w:r>
-              <w:rPr>
-                <w:rFonts w:ascii="Calibri" w:cs="Calibri" w:eastAsia="Calibri" w:hAnsi="Calibri"/>
-                <w:color w:val="21272A"/>
-                <w:sz w:val="17"/>
-                <w:szCs w:val="17"/>
-              </w:rPr>
-              <w:t xml:space="preserve">Modernization Initiatives</w:t>
-            </w:r>
-          </w:p>
-        </w:tc>
-        <w:tc>
-          <w:tcPr>
-            <w:tcW w:type="dxa" w:w="2268"/>
+            <w:tcW w:type="dxa" w:w="3024"/>
             <w:tcBorders>
               <w:top w:val="single" w:color="FFFFFF" w:sz="0"/>
               <w:left w:val="single" w:color="FFFFFF" w:sz="0"/>

</xml_diff>